<commit_message>
added master thesis and upscaling to germany section
</commit_message>
<xml_diff>
--- a/INKAR_vulnerability_index_GFZ_briefing_EN_v2.docx
+++ b/INKAR_vulnerability_index_GFZ_briefing_EN_v2.docx
@@ -12,13 +12,13 @@
       </w:r>
     </w:p>
     <w:bookmarkEnd w:id="9"/>
-    <w:bookmarkStart w:id="10" w:name="X48851bd5b0d60cba7ebb6db2863402719c15efc"/>
+    <w:bookmarkStart w:id="10" w:name="X351b445f46727ea65086f9599f4925ea0736af8"/>
     <w:p>
       <w:pPr>
         <w:pStyle w:val="Heading1"/>
       </w:pPr>
       <w:r>
-        <w:t xml:space="preserve">1. What is the INKAR dataset in this project?</w:t>
+        <w:t xml:space="preserve">1. What does the Master's thesis do?</w:t>
       </w:r>
     </w:p>
     <w:p>
@@ -26,6 +26,152 @@
         <w:pStyle w:val="FirstParagraph"/>
       </w:pPr>
       <w:r>
+        <w:t xml:space="preserve">The thesis examines the social distribution of flood exposure and socio-economic vulnerability in the German part of the Elbe river basin, with a particular focus on questions of flood-protection justice.</w:t>
+      </w:r>
+    </w:p>
+    <w:p>
+      <w:pPr>
+        <w:pStyle w:val="BodyText"/>
+      </w:pPr>
+      <w:r>
+        <w:t xml:space="preserve">In substantive terms, the project combines three components:</w:t>
+      </w:r>
+    </w:p>
+    <w:p>
+      <w:pPr>
+        <w:pStyle w:val="Compact"/>
+        <w:numPr>
+          <w:ilvl w:val="0"/>
+          <w:numId w:val="1001"/>
+        </w:numPr>
+      </w:pPr>
+      <w:r>
+        <w:t xml:space="preserve">a flood-hazard and exposure component based on BfG HQ100 flood data</w:t>
+      </w:r>
+    </w:p>
+    <w:p>
+      <w:pPr>
+        <w:pStyle w:val="Compact"/>
+        <w:numPr>
+          <w:ilvl w:val="0"/>
+          <w:numId w:val="1001"/>
+        </w:numPr>
+      </w:pPr>
+      <w:r>
+        <w:t xml:space="preserve">a socio-economic vulnerability component based on municipality-level INKAR indicators</w:t>
+      </w:r>
+    </w:p>
+    <w:p>
+      <w:pPr>
+        <w:pStyle w:val="Compact"/>
+        <w:numPr>
+          <w:ilvl w:val="0"/>
+          <w:numId w:val="1001"/>
+        </w:numPr>
+      </w:pPr>
+      <w:r>
+        <w:t xml:space="preserve">a protection-context component, currently informed by EU flood-protection data because the BfG Zone 3 information is not sufficiently consistent for the Elbe case</w:t>
+      </w:r>
+    </w:p>
+    <w:p>
+      <w:pPr>
+        <w:pStyle w:val="FirstParagraph"/>
+      </w:pPr>
+      <w:r>
+        <w:t xml:space="preserve">The central analytical question is whether municipalities with higher socio-economic vulnerability are also more exposed to flood hazards, and whether this exposure is distributed unevenly across different social contexts.</w:t>
+      </w:r>
+    </w:p>
+    <w:p>
+      <w:pPr>
+        <w:pStyle w:val="BodyText"/>
+      </w:pPr>
+      <w:r>
+        <w:t xml:space="preserve">Methodologically, the project combines:</w:t>
+      </w:r>
+    </w:p>
+    <w:p>
+      <w:pPr>
+        <w:pStyle w:val="Compact"/>
+        <w:numPr>
+          <w:ilvl w:val="0"/>
+          <w:numId w:val="1002"/>
+        </w:numPr>
+      </w:pPr>
+      <w:r>
+        <w:t xml:space="preserve">GIS-based spatial preprocessing and area calculations</w:t>
+      </w:r>
+    </w:p>
+    <w:p>
+      <w:pPr>
+        <w:pStyle w:val="Compact"/>
+        <w:numPr>
+          <w:ilvl w:val="0"/>
+          <w:numId w:val="1002"/>
+        </w:numPr>
+      </w:pPr>
+      <w:r>
+        <w:t xml:space="preserve">municipality-level socio-economic data harmonisation</w:t>
+      </w:r>
+    </w:p>
+    <w:p>
+      <w:pPr>
+        <w:pStyle w:val="Compact"/>
+        <w:numPr>
+          <w:ilvl w:val="0"/>
+          <w:numId w:val="1002"/>
+        </w:numPr>
+      </w:pPr>
+      <w:r>
+        <w:t xml:space="preserve">principal component analysis for vulnerability structure</w:t>
+      </w:r>
+    </w:p>
+    <w:p>
+      <w:pPr>
+        <w:pStyle w:val="Compact"/>
+        <w:numPr>
+          <w:ilvl w:val="0"/>
+          <w:numId w:val="1002"/>
+        </w:numPr>
+      </w:pPr>
+      <w:r>
+        <w:t xml:space="preserve">index construction</w:t>
+      </w:r>
+    </w:p>
+    <w:p>
+      <w:pPr>
+        <w:pStyle w:val="Compact"/>
+        <w:numPr>
+          <w:ilvl w:val="0"/>
+          <w:numId w:val="1002"/>
+        </w:numPr>
+      </w:pPr>
+      <w:r>
+        <w:t xml:space="preserve">regression and spatial diagnostics</w:t>
+      </w:r>
+    </w:p>
+    <w:p>
+      <w:pPr>
+        <w:pStyle w:val="FirstParagraph"/>
+      </w:pPr>
+      <w:r>
+        <w:t xml:space="preserve">The current redesign keeps the overall project goal unchanged, but improves the socio-economic operationalisation by moving from a very broad exploratory PCA to a more selective and theory-led vulnerability design.</w:t>
+      </w:r>
+    </w:p>
+    <w:bookmarkEnd w:id="10"/>
+    <w:bookmarkStart w:id="11" w:name="Xbbbcca0af5fdfc9a03cd32efe6b1a6fdf0e3186"/>
+    <w:p>
+      <w:pPr>
+        <w:pStyle w:val="Heading1"/>
+      </w:pPr>
+      <w:r>
+        <w:t xml:space="preserve">2. What is the INKAR dataset in this project?</w:t>
+      </w:r>
+    </w:p>
+    <w:p>
+      <w:pPr>
+        <w:pStyle w:val="FirstParagraph"/>
+      </w:pPr>
+      <w:r>
         <w:t xml:space="preserve">For the socio-economic side of the thesis, the BBSR INKAR 2025 dataset was used. The raw file is a large CSV in long format.</w:t>
       </w:r>
     </w:p>
@@ -34,7 +180,7 @@
         <w:pStyle w:val="Compact"/>
         <w:numPr>
           <w:ilvl w:val="0"/>
-          <w:numId w:val="1001"/>
+          <w:numId w:val="1003"/>
         </w:numPr>
       </w:pPr>
       <w:r>
@@ -46,7 +192,7 @@
         <w:pStyle w:val="Compact"/>
         <w:numPr>
           <w:ilvl w:val="0"/>
-          <w:numId w:val="1001"/>
+          <w:numId w:val="1003"/>
         </w:numPr>
       </w:pPr>
       <w:r>
@@ -73,7 +219,7 @@
         <w:pStyle w:val="Compact"/>
         <w:numPr>
           <w:ilvl w:val="0"/>
-          <w:numId w:val="1001"/>
+          <w:numId w:val="1003"/>
         </w:numPr>
       </w:pPr>
       <w:r>
@@ -130,7 +276,7 @@
         <w:pStyle w:val="Compact"/>
         <w:numPr>
           <w:ilvl w:val="0"/>
-          <w:numId w:val="1001"/>
+          <w:numId w:val="1003"/>
         </w:numPr>
       </w:pPr>
       <w:r>
@@ -154,17 +300,17 @@
         <w:t xml:space="preserve">For this project, the dataset is therefore not Elbe-specific from the beginning. It only becomes Elbe-specific through the later spatial filtering.</w:t>
       </w:r>
     </w:p>
-    <w:bookmarkEnd w:id="10"/>
-    <w:bookmarkStart w:id="14" w:name="X1a1ef264192643771d3026ebe389a386e467552"/>
+    <w:bookmarkEnd w:id="11"/>
+    <w:bookmarkStart w:id="15" w:name="Xe3cc594b574636f6020a54d0295ecdb7369739e"/>
     <w:p>
       <w:pPr>
         <w:pStyle w:val="Heading1"/>
       </w:pPr>
       <w:r>
-        <w:t xml:space="preserve">2. INKAR: municipal indicators available in all 16 federal states</w:t>
-      </w:r>
-    </w:p>
-    <w:bookmarkStart w:id="11" w:name="scope"/>
+        <w:t xml:space="preserve">3. INKAR: municipal indicators available in all 16 federal states</w:t>
+      </w:r>
+    </w:p>
+    <w:bookmarkStart w:id="12" w:name="scope"/>
     <w:p>
       <w:pPr>
         <w:pStyle w:val="Heading2"/>
@@ -186,7 +332,7 @@
         <w:pStyle w:val="Compact"/>
         <w:numPr>
           <w:ilvl w:val="0"/>
-          <w:numId w:val="1002"/>
+          <w:numId w:val="1004"/>
         </w:numPr>
       </w:pPr>
       <w:r>
@@ -201,7 +347,7 @@
         <w:pStyle w:val="Compact"/>
         <w:numPr>
           <w:ilvl w:val="0"/>
-          <w:numId w:val="1002"/>
+          <w:numId w:val="1004"/>
         </w:numPr>
       </w:pPr>
       <w:r>
@@ -216,7 +362,7 @@
         <w:pStyle w:val="Compact"/>
         <w:numPr>
           <w:ilvl w:val="0"/>
-          <w:numId w:val="1002"/>
+          <w:numId w:val="1004"/>
         </w:numPr>
       </w:pPr>
       <w:r>
@@ -260,7 +406,7 @@
         <w:pStyle w:val="Compact"/>
         <w:numPr>
           <w:ilvl w:val="0"/>
-          <w:numId w:val="1003"/>
+          <w:numId w:val="1005"/>
         </w:numPr>
       </w:pPr>
       <w:r>
@@ -278,7 +424,7 @@
         <w:pStyle w:val="Compact"/>
         <w:numPr>
           <w:ilvl w:val="0"/>
-          <w:numId w:val="1003"/>
+          <w:numId w:val="1005"/>
         </w:numPr>
       </w:pPr>
       <w:r>
@@ -291,8 +437,8 @@
         <w:t xml:space="preserve">: the latest value is available for every municipality in every state</w:t>
       </w:r>
     </w:p>
-    <w:bookmarkEnd w:id="11"/>
-    <w:bookmarkStart w:id="12" w:name="headline-result"/>
+    <w:bookmarkEnd w:id="12"/>
+    <w:bookmarkStart w:id="13" w:name="headline-result"/>
     <w:p>
       <w:pPr>
         <w:pStyle w:val="Heading2"/>
@@ -306,7 +452,7 @@
         <w:pStyle w:val="Compact"/>
         <w:numPr>
           <w:ilvl w:val="0"/>
-          <w:numId w:val="1004"/>
+          <w:numId w:val="1006"/>
         </w:numPr>
       </w:pPr>
       <w:r>
@@ -327,7 +473,7 @@
         <w:pStyle w:val="Compact"/>
         <w:numPr>
           <w:ilvl w:val="0"/>
-          <w:numId w:val="1004"/>
+          <w:numId w:val="1006"/>
         </w:numPr>
       </w:pPr>
       <w:r>
@@ -348,7 +494,7 @@
         <w:pStyle w:val="Compact"/>
         <w:numPr>
           <w:ilvl w:val="0"/>
-          <w:numId w:val="1004"/>
+          <w:numId w:val="1006"/>
         </w:numPr>
       </w:pPr>
       <w:r>
@@ -369,7 +515,7 @@
         <w:pStyle w:val="Compact"/>
         <w:numPr>
           <w:ilvl w:val="0"/>
-          <w:numId w:val="1004"/>
+          <w:numId w:val="1006"/>
         </w:numPr>
       </w:pPr>
       <w:r>
@@ -398,7 +544,7 @@
         <w:pStyle w:val="Compact"/>
         <w:numPr>
           <w:ilvl w:val="0"/>
-          <w:numId w:val="1005"/>
+          <w:numId w:val="1007"/>
         </w:numPr>
       </w:pPr>
       <w:r>
@@ -428,7 +574,7 @@
         <w:pStyle w:val="Compact"/>
         <w:numPr>
           <w:ilvl w:val="0"/>
-          <w:numId w:val="1005"/>
+          <w:numId w:val="1007"/>
         </w:numPr>
       </w:pPr>
       <w:r>
@@ -458,7 +604,7 @@
         <w:pStyle w:val="Compact"/>
         <w:numPr>
           <w:ilvl w:val="0"/>
-          <w:numId w:val="1005"/>
+          <w:numId w:val="1007"/>
         </w:numPr>
       </w:pPr>
       <w:r>
@@ -483,8 +629,8 @@
         <w:t xml:space="preserve">Zuweisungen für Investitionsfördermaßnahmen</w:t>
       </w:r>
     </w:p>
-    <w:bookmarkEnd w:id="12"/>
-    <w:bookmarkStart w:id="13" w:name="broad-socio-economic-dimensions"/>
+    <w:bookmarkEnd w:id="13"/>
+    <w:bookmarkStart w:id="14" w:name="broad-socio-economic-dimensions"/>
     <w:p>
       <w:pPr>
         <w:pStyle w:val="Heading2"/>
@@ -498,7 +644,7 @@
         <w:pStyle w:val="Compact"/>
         <w:numPr>
           <w:ilvl w:val="0"/>
-          <w:numId w:val="1006"/>
+          <w:numId w:val="1008"/>
         </w:numPr>
       </w:pPr>
       <w:r>
@@ -546,7 +692,7 @@
         <w:pStyle w:val="Compact"/>
         <w:numPr>
           <w:ilvl w:val="0"/>
-          <w:numId w:val="1006"/>
+          <w:numId w:val="1008"/>
         </w:numPr>
       </w:pPr>
       <w:r>
@@ -594,7 +740,7 @@
         <w:pStyle w:val="Compact"/>
         <w:numPr>
           <w:ilvl w:val="0"/>
-          <w:numId w:val="1006"/>
+          <w:numId w:val="1008"/>
         </w:numPr>
       </w:pPr>
       <w:r>
@@ -642,7 +788,7 @@
         <w:pStyle w:val="Compact"/>
         <w:numPr>
           <w:ilvl w:val="0"/>
-          <w:numId w:val="1006"/>
+          <w:numId w:val="1008"/>
         </w:numPr>
       </w:pPr>
       <w:r>
@@ -690,7 +836,7 @@
         <w:pStyle w:val="Compact"/>
         <w:numPr>
           <w:ilvl w:val="0"/>
-          <w:numId w:val="1006"/>
+          <w:numId w:val="1008"/>
         </w:numPr>
       </w:pPr>
       <w:r>
@@ -738,7 +884,7 @@
         <w:pStyle w:val="Compact"/>
         <w:numPr>
           <w:ilvl w:val="0"/>
-          <w:numId w:val="1006"/>
+          <w:numId w:val="1008"/>
         </w:numPr>
       </w:pPr>
       <w:r>
@@ -786,7 +932,7 @@
         <w:pStyle w:val="Compact"/>
         <w:numPr>
           <w:ilvl w:val="0"/>
-          <w:numId w:val="1006"/>
+          <w:numId w:val="1008"/>
         </w:numPr>
       </w:pPr>
       <w:r>
@@ -834,7 +980,7 @@
         <w:pStyle w:val="Compact"/>
         <w:numPr>
           <w:ilvl w:val="0"/>
-          <w:numId w:val="1006"/>
+          <w:numId w:val="1008"/>
         </w:numPr>
       </w:pPr>
       <w:r>
@@ -890,7 +1036,7 @@
         <w:pStyle w:val="Compact"/>
         <w:numPr>
           <w:ilvl w:val="0"/>
-          <w:numId w:val="1007"/>
+          <w:numId w:val="1009"/>
         </w:numPr>
       </w:pPr>
       <w:r>
@@ -902,22 +1048,22 @@
         <w:pStyle w:val="Compact"/>
         <w:numPr>
           <w:ilvl w:val="0"/>
-          <w:numId w:val="1007"/>
+          <w:numId w:val="1009"/>
         </w:numPr>
       </w:pPr>
       <w:r>
         <w:t xml:space="preserve">the stronger limitation is not the existence of the indicators, but the completeness of municipality-level data and, even more importantly, the hazard and protection side of the overall flood-justice framework</w:t>
       </w:r>
     </w:p>
-    <w:bookmarkEnd w:id="13"/>
     <w:bookmarkEnd w:id="14"/>
-    <w:bookmarkStart w:id="15" w:name="X3abe202a94505ab0a319a6362e72dbd4994bb43"/>
+    <w:bookmarkEnd w:id="15"/>
+    <w:bookmarkStart w:id="16" w:name="Xa51a1e5d4996a94469755ca7b95795d1a58cc15"/>
     <w:p>
       <w:pPr>
         <w:pStyle w:val="Heading1"/>
       </w:pPr>
       <w:r>
-        <w:t xml:space="preserve">3. Which INKAR subset was used for the thesis?</w:t>
+        <w:t xml:space="preserve">4. Which INKAR subset was used for the thesis?</w:t>
       </w:r>
     </w:p>
     <w:p>
@@ -933,7 +1079,7 @@
         <w:pStyle w:val="Compact"/>
         <w:numPr>
           <w:ilvl w:val="0"/>
-          <w:numId w:val="1008"/>
+          <w:numId w:val="1010"/>
         </w:numPr>
       </w:pPr>
       <w:r>
@@ -948,7 +1094,7 @@
         <w:pStyle w:val="Compact"/>
         <w:numPr>
           <w:ilvl w:val="0"/>
-          <w:numId w:val="1008"/>
+          <w:numId w:val="1010"/>
         </w:numPr>
       </w:pPr>
       <w:r>
@@ -971,7 +1117,7 @@
         <w:pStyle w:val="Compact"/>
         <w:numPr>
           <w:ilvl w:val="0"/>
-          <w:numId w:val="1009"/>
+          <w:numId w:val="1011"/>
         </w:numPr>
       </w:pPr>
       <w:r>
@@ -992,7 +1138,7 @@
         <w:pStyle w:val="Compact"/>
         <w:numPr>
           <w:ilvl w:val="0"/>
-          <w:numId w:val="1009"/>
+          <w:numId w:val="1011"/>
         </w:numPr>
       </w:pPr>
       <w:r>
@@ -1013,7 +1159,7 @@
         <w:pStyle w:val="Compact"/>
         <w:numPr>
           <w:ilvl w:val="0"/>
-          <w:numId w:val="1009"/>
+          <w:numId w:val="1011"/>
         </w:numPr>
       </w:pPr>
       <w:r>
@@ -1034,7 +1180,7 @@
         <w:pStyle w:val="Compact"/>
         <w:numPr>
           <w:ilvl w:val="0"/>
-          <w:numId w:val="1009"/>
+          <w:numId w:val="1011"/>
         </w:numPr>
       </w:pPr>
       <w:r>
@@ -1086,7 +1232,7 @@
         <w:pStyle w:val="Compact"/>
         <w:numPr>
           <w:ilvl w:val="0"/>
-          <w:numId w:val="1010"/>
+          <w:numId w:val="1012"/>
         </w:numPr>
       </w:pPr>
       <w:r>
@@ -1107,7 +1253,7 @@
         <w:pStyle w:val="Compact"/>
         <w:numPr>
           <w:ilvl w:val="0"/>
-          <w:numId w:val="1010"/>
+          <w:numId w:val="1012"/>
         </w:numPr>
       </w:pPr>
       <w:r>
@@ -1128,7 +1274,7 @@
         <w:pStyle w:val="Compact"/>
         <w:numPr>
           <w:ilvl w:val="0"/>
-          <w:numId w:val="1010"/>
+          <w:numId w:val="1012"/>
         </w:numPr>
       </w:pPr>
       <w:r>
@@ -1149,7 +1295,7 @@
         <w:pStyle w:val="Compact"/>
         <w:numPr>
           <w:ilvl w:val="0"/>
-          <w:numId w:val="1010"/>
+          <w:numId w:val="1012"/>
         </w:numPr>
       </w:pPr>
       <w:r>
@@ -1180,14 +1326,14 @@
         <w:t xml:space="preserve">2024</w:t>
       </w:r>
     </w:p>
-    <w:bookmarkEnd w:id="15"/>
-    <w:bookmarkStart w:id="16" w:name="X58fac65f8e493a0c68ba9e2b29f03a0e289fe13"/>
+    <w:bookmarkEnd w:id="16"/>
+    <w:bookmarkStart w:id="17" w:name="Xe8f93c27b828746bea8f390d507ecf2e370a055"/>
     <w:p>
       <w:pPr>
         <w:pStyle w:val="Heading1"/>
       </w:pPr>
       <w:r>
-        <w:t xml:space="preserve">4. Variable naming logic in the project</w:t>
+        <w:t xml:space="preserve">5. Variable naming logic in the project</w:t>
       </w:r>
     </w:p>
     <w:p>
@@ -1203,7 +1349,7 @@
         <w:pStyle w:val="Compact"/>
         <w:numPr>
           <w:ilvl w:val="0"/>
-          <w:numId w:val="1011"/>
+          <w:numId w:val="1013"/>
         </w:numPr>
       </w:pPr>
       <w:r>
@@ -1224,7 +1370,7 @@
         <w:pStyle w:val="Compact"/>
         <w:numPr>
           <w:ilvl w:val="0"/>
-          <w:numId w:val="1011"/>
+          <w:numId w:val="1013"/>
         </w:numPr>
       </w:pPr>
       <w:r>
@@ -1245,7 +1391,7 @@
         <w:pStyle w:val="Compact"/>
         <w:numPr>
           <w:ilvl w:val="0"/>
-          <w:numId w:val="1011"/>
+          <w:numId w:val="1013"/>
         </w:numPr>
       </w:pPr>
       <w:r>
@@ -1274,7 +1420,7 @@
         <w:pStyle w:val="Compact"/>
         <w:numPr>
           <w:ilvl w:val="0"/>
-          <w:numId w:val="1012"/>
+          <w:numId w:val="1014"/>
         </w:numPr>
       </w:pPr>
       <w:r>
@@ -1286,7 +1432,7 @@
         <w:pStyle w:val="Compact"/>
         <w:numPr>
           <w:ilvl w:val="0"/>
-          <w:numId w:val="1012"/>
+          <w:numId w:val="1014"/>
         </w:numPr>
       </w:pPr>
       <w:r>
@@ -1298,21 +1444,21 @@
         <w:pStyle w:val="Compact"/>
         <w:numPr>
           <w:ilvl w:val="0"/>
-          <w:numId w:val="1012"/>
+          <w:numId w:val="1014"/>
         </w:numPr>
       </w:pPr>
       <w:r>
         <w:t xml:space="preserve">then, if needed, the internal project label</w:t>
       </w:r>
     </w:p>
-    <w:bookmarkEnd w:id="16"/>
-    <w:bookmarkStart w:id="17" w:name="X544d94dcda72080d3c94992e0dd88ea1eb12296"/>
+    <w:bookmarkEnd w:id="17"/>
+    <w:bookmarkStart w:id="18" w:name="X09d14bb5b5d9cb791b3a1d08a6a538b0ef2ec59"/>
     <w:p>
       <w:pPr>
         <w:pStyle w:val="Heading1"/>
       </w:pPr>
       <w:r>
-        <w:t xml:space="preserve">5. INKAR variables used for the first wide PCA in Version 1</w:t>
+        <w:t xml:space="preserve">6. INKAR variables used for the first wide PCA in Version 1</w:t>
       </w:r>
     </w:p>
     <w:p>
@@ -1351,7 +1497,7 @@
         <w:pStyle w:val="Compact"/>
         <w:numPr>
           <w:ilvl w:val="0"/>
-          <w:numId w:val="1013"/>
+          <w:numId w:val="1015"/>
         </w:numPr>
       </w:pPr>
       <w:r>
@@ -1363,7 +1509,7 @@
         <w:pStyle w:val="Compact"/>
         <w:numPr>
           <w:ilvl w:val="0"/>
-          <w:numId w:val="1013"/>
+          <w:numId w:val="1015"/>
         </w:numPr>
       </w:pPr>
       <w:r>
@@ -1375,7 +1521,7 @@
         <w:pStyle w:val="Compact"/>
         <w:numPr>
           <w:ilvl w:val="0"/>
-          <w:numId w:val="1013"/>
+          <w:numId w:val="1015"/>
         </w:numPr>
       </w:pPr>
       <w:r>
@@ -1387,7 +1533,7 @@
         <w:pStyle w:val="Compact"/>
         <w:numPr>
           <w:ilvl w:val="0"/>
-          <w:numId w:val="1013"/>
+          <w:numId w:val="1015"/>
         </w:numPr>
       </w:pPr>
       <w:r>
@@ -1399,7 +1545,7 @@
         <w:pStyle w:val="Compact"/>
         <w:numPr>
           <w:ilvl w:val="0"/>
-          <w:numId w:val="1013"/>
+          <w:numId w:val="1015"/>
         </w:numPr>
       </w:pPr>
       <w:r>
@@ -1411,7 +1557,7 @@
         <w:pStyle w:val="Compact"/>
         <w:numPr>
           <w:ilvl w:val="0"/>
-          <w:numId w:val="1013"/>
+          <w:numId w:val="1015"/>
         </w:numPr>
       </w:pPr>
       <w:r>
@@ -1423,7 +1569,7 @@
         <w:pStyle w:val="Compact"/>
         <w:numPr>
           <w:ilvl w:val="0"/>
-          <w:numId w:val="1013"/>
+          <w:numId w:val="1015"/>
         </w:numPr>
       </w:pPr>
       <w:r>
@@ -1435,7 +1581,7 @@
         <w:pStyle w:val="Compact"/>
         <w:numPr>
           <w:ilvl w:val="0"/>
-          <w:numId w:val="1013"/>
+          <w:numId w:val="1015"/>
         </w:numPr>
       </w:pPr>
       <w:r>
@@ -1447,7 +1593,7 @@
         <w:pStyle w:val="Compact"/>
         <w:numPr>
           <w:ilvl w:val="0"/>
-          <w:numId w:val="1013"/>
+          <w:numId w:val="1015"/>
         </w:numPr>
       </w:pPr>
       <w:r>
@@ -1459,7 +1605,7 @@
         <w:pStyle w:val="Compact"/>
         <w:numPr>
           <w:ilvl w:val="0"/>
-          <w:numId w:val="1013"/>
+          <w:numId w:val="1015"/>
         </w:numPr>
       </w:pPr>
       <w:r>
@@ -1502,7 +1648,7 @@
         <w:pStyle w:val="Compact"/>
         <w:numPr>
           <w:ilvl w:val="0"/>
-          <w:numId w:val="1014"/>
+          <w:numId w:val="1016"/>
         </w:numPr>
       </w:pPr>
       <w:r>
@@ -1514,7 +1660,7 @@
         <w:pStyle w:val="Compact"/>
         <w:numPr>
           <w:ilvl w:val="0"/>
-          <w:numId w:val="1014"/>
+          <w:numId w:val="1016"/>
         </w:numPr>
       </w:pPr>
       <w:r>
@@ -1526,7 +1672,7 @@
         <w:pStyle w:val="Compact"/>
         <w:numPr>
           <w:ilvl w:val="0"/>
-          <w:numId w:val="1014"/>
+          <w:numId w:val="1016"/>
         </w:numPr>
       </w:pPr>
       <w:r>
@@ -1546,7 +1692,7 @@
         <w:pStyle w:val="Compact"/>
         <w:numPr>
           <w:ilvl w:val="0"/>
-          <w:numId w:val="1015"/>
+          <w:numId w:val="1017"/>
         </w:numPr>
       </w:pPr>
       <w:r>
@@ -1558,7 +1704,7 @@
         <w:pStyle w:val="Compact"/>
         <w:numPr>
           <w:ilvl w:val="0"/>
-          <w:numId w:val="1015"/>
+          <w:numId w:val="1017"/>
         </w:numPr>
       </w:pPr>
       <w:r>
@@ -1570,7 +1716,7 @@
         <w:pStyle w:val="Compact"/>
         <w:numPr>
           <w:ilvl w:val="0"/>
-          <w:numId w:val="1015"/>
+          <w:numId w:val="1017"/>
         </w:numPr>
       </w:pPr>
       <w:r>
@@ -1582,7 +1728,7 @@
         <w:pStyle w:val="Compact"/>
         <w:numPr>
           <w:ilvl w:val="0"/>
-          <w:numId w:val="1015"/>
+          <w:numId w:val="1017"/>
         </w:numPr>
       </w:pPr>
       <w:r>
@@ -1609,7 +1755,7 @@
         <w:pStyle w:val="Compact"/>
         <w:numPr>
           <w:ilvl w:val="0"/>
-          <w:numId w:val="1015"/>
+          <w:numId w:val="1017"/>
         </w:numPr>
       </w:pPr>
       <w:r>
@@ -1621,7 +1767,7 @@
         <w:pStyle w:val="Compact"/>
         <w:numPr>
           <w:ilvl w:val="0"/>
-          <w:numId w:val="1015"/>
+          <w:numId w:val="1017"/>
         </w:numPr>
       </w:pPr>
       <w:r>
@@ -1643,17 +1789,17 @@
         <w:t xml:space="preserve">so that higher values indicate higher vulnerability</w:t>
       </w:r>
     </w:p>
-    <w:bookmarkEnd w:id="17"/>
-    <w:bookmarkStart w:id="32" w:name="Xb0966be88add7747b812fb75be8224c43b3ca0b"/>
+    <w:bookmarkEnd w:id="18"/>
+    <w:bookmarkStart w:id="33" w:name="X982a46876bccc5d919b3d37bad402e5ab562cdf"/>
     <w:p>
       <w:pPr>
         <w:pStyle w:val="Heading1"/>
       </w:pPr>
       <w:r>
-        <w:t xml:space="preserve">6. Kept variables in the redesigned main index</w:t>
-      </w:r>
-    </w:p>
-    <w:bookmarkStart w:id="18" w:name="a_algii_sgbii"/>
+        <w:t xml:space="preserve">7. Kept variables in the redesigned main index</w:t>
+      </w:r>
+    </w:p>
+    <w:bookmarkStart w:id="19" w:name="a_algii_sgbii"/>
     <w:p>
       <w:pPr>
         <w:pStyle w:val="Heading2"/>
@@ -1670,7 +1816,7 @@
         <w:pStyle w:val="Compact"/>
         <w:numPr>
           <w:ilvl w:val="0"/>
-          <w:numId w:val="1016"/>
+          <w:numId w:val="1018"/>
         </w:numPr>
       </w:pPr>
       <w:r>
@@ -1691,7 +1837,7 @@
         <w:pStyle w:val="Compact"/>
         <w:numPr>
           <w:ilvl w:val="0"/>
-          <w:numId w:val="1016"/>
+          <w:numId w:val="1018"/>
         </w:numPr>
       </w:pPr>
       <w:r>
@@ -1712,7 +1858,7 @@
         <w:pStyle w:val="Compact"/>
         <w:numPr>
           <w:ilvl w:val="0"/>
-          <w:numId w:val="1016"/>
+          <w:numId w:val="1018"/>
         </w:numPr>
       </w:pPr>
       <w:r>
@@ -1724,7 +1870,7 @@
         <w:pStyle w:val="Compact"/>
         <w:numPr>
           <w:ilvl w:val="0"/>
-          <w:numId w:val="1016"/>
+          <w:numId w:val="1018"/>
         </w:numPr>
       </w:pPr>
       <w:r>
@@ -1736,7 +1882,7 @@
         <w:pStyle w:val="Compact"/>
         <w:numPr>
           <w:ilvl w:val="0"/>
-          <w:numId w:val="1016"/>
+          <w:numId w:val="1018"/>
         </w:numPr>
       </w:pPr>
       <w:r>
@@ -1748,15 +1894,15 @@
         <w:pStyle w:val="Compact"/>
         <w:numPr>
           <w:ilvl w:val="0"/>
-          <w:numId w:val="1016"/>
+          <w:numId w:val="1018"/>
         </w:numPr>
       </w:pPr>
       <w:r>
         <w:t xml:space="preserve">transformation: none</w:t>
       </w:r>
     </w:p>
-    <w:bookmarkEnd w:id="18"/>
-    <w:bookmarkStart w:id="19" w:name="a_unterkunft_sgbii"/>
+    <w:bookmarkEnd w:id="19"/>
+    <w:bookmarkStart w:id="20" w:name="a_unterkunft_sgbii"/>
     <w:p>
       <w:pPr>
         <w:pStyle w:val="Heading2"/>
@@ -1773,7 +1919,7 @@
         <w:pStyle w:val="Compact"/>
         <w:numPr>
           <w:ilvl w:val="0"/>
-          <w:numId w:val="1017"/>
+          <w:numId w:val="1019"/>
         </w:numPr>
       </w:pPr>
       <w:r>
@@ -1794,7 +1940,7 @@
         <w:pStyle w:val="Compact"/>
         <w:numPr>
           <w:ilvl w:val="0"/>
-          <w:numId w:val="1017"/>
+          <w:numId w:val="1019"/>
         </w:numPr>
       </w:pPr>
       <w:r>
@@ -1815,7 +1961,7 @@
         <w:pStyle w:val="Compact"/>
         <w:numPr>
           <w:ilvl w:val="0"/>
-          <w:numId w:val="1017"/>
+          <w:numId w:val="1019"/>
         </w:numPr>
       </w:pPr>
       <w:r>
@@ -1827,7 +1973,7 @@
         <w:pStyle w:val="Compact"/>
         <w:numPr>
           <w:ilvl w:val="0"/>
-          <w:numId w:val="1017"/>
+          <w:numId w:val="1019"/>
         </w:numPr>
       </w:pPr>
       <w:r>
@@ -1839,7 +1985,7 @@
         <w:pStyle w:val="Compact"/>
         <w:numPr>
           <w:ilvl w:val="0"/>
-          <w:numId w:val="1017"/>
+          <w:numId w:val="1019"/>
         </w:numPr>
       </w:pPr>
       <w:r>
@@ -1851,15 +1997,15 @@
         <w:pStyle w:val="Compact"/>
         <w:numPr>
           <w:ilvl w:val="0"/>
-          <w:numId w:val="1017"/>
+          <w:numId w:val="1019"/>
         </w:numPr>
       </w:pPr>
       <w:r>
         <w:t xml:space="preserve">transformation: none</w:t>
       </w:r>
     </w:p>
-    <w:bookmarkEnd w:id="19"/>
-    <w:bookmarkStart w:id="20" w:name="a_alolang"/>
+    <w:bookmarkEnd w:id="20"/>
+    <w:bookmarkStart w:id="21" w:name="a_alolang"/>
     <w:p>
       <w:pPr>
         <w:pStyle w:val="Heading2"/>
@@ -1876,7 +2022,7 @@
         <w:pStyle w:val="Compact"/>
         <w:numPr>
           <w:ilvl w:val="0"/>
-          <w:numId w:val="1018"/>
+          <w:numId w:val="1020"/>
         </w:numPr>
       </w:pPr>
       <w:r>
@@ -1897,7 +2043,7 @@
         <w:pStyle w:val="Compact"/>
         <w:numPr>
           <w:ilvl w:val="0"/>
-          <w:numId w:val="1018"/>
+          <w:numId w:val="1020"/>
         </w:numPr>
       </w:pPr>
       <w:r>
@@ -1918,7 +2064,7 @@
         <w:pStyle w:val="Compact"/>
         <w:numPr>
           <w:ilvl w:val="0"/>
-          <w:numId w:val="1018"/>
+          <w:numId w:val="1020"/>
         </w:numPr>
       </w:pPr>
       <w:r>
@@ -1930,7 +2076,7 @@
         <w:pStyle w:val="Compact"/>
         <w:numPr>
           <w:ilvl w:val="0"/>
-          <w:numId w:val="1018"/>
+          <w:numId w:val="1020"/>
         </w:numPr>
       </w:pPr>
       <w:r>
@@ -1942,7 +2088,7 @@
         <w:pStyle w:val="Compact"/>
         <w:numPr>
           <w:ilvl w:val="0"/>
-          <w:numId w:val="1018"/>
+          <w:numId w:val="1020"/>
         </w:numPr>
       </w:pPr>
       <w:r>
@@ -1954,15 +2100,15 @@
         <w:pStyle w:val="Compact"/>
         <w:numPr>
           <w:ilvl w:val="0"/>
-          <w:numId w:val="1018"/>
+          <w:numId w:val="1020"/>
         </w:numPr>
       </w:pPr>
       <w:r>
         <w:t xml:space="preserve">transformation: none</w:t>
       </w:r>
     </w:p>
-    <w:bookmarkEnd w:id="20"/>
-    <w:bookmarkStart w:id="21" w:name="q_alo_u25_einw"/>
+    <w:bookmarkEnd w:id="21"/>
+    <w:bookmarkStart w:id="22" w:name="q_alo_u25_einw"/>
     <w:p>
       <w:pPr>
         <w:pStyle w:val="Heading2"/>
@@ -1979,7 +2125,7 @@
         <w:pStyle w:val="Compact"/>
         <w:numPr>
           <w:ilvl w:val="0"/>
-          <w:numId w:val="1019"/>
+          <w:numId w:val="1021"/>
         </w:numPr>
       </w:pPr>
       <w:r>
@@ -2000,7 +2146,7 @@
         <w:pStyle w:val="Compact"/>
         <w:numPr>
           <w:ilvl w:val="0"/>
-          <w:numId w:val="1019"/>
+          <w:numId w:val="1021"/>
         </w:numPr>
       </w:pPr>
       <w:r>
@@ -2021,7 +2167,7 @@
         <w:pStyle w:val="Compact"/>
         <w:numPr>
           <w:ilvl w:val="0"/>
-          <w:numId w:val="1019"/>
+          <w:numId w:val="1021"/>
         </w:numPr>
       </w:pPr>
       <w:r>
@@ -2033,7 +2179,7 @@
         <w:pStyle w:val="Compact"/>
         <w:numPr>
           <w:ilvl w:val="0"/>
-          <w:numId w:val="1019"/>
+          <w:numId w:val="1021"/>
         </w:numPr>
       </w:pPr>
       <w:r>
@@ -2045,7 +2191,7 @@
         <w:pStyle w:val="Compact"/>
         <w:numPr>
           <w:ilvl w:val="0"/>
-          <w:numId w:val="1019"/>
+          <w:numId w:val="1021"/>
         </w:numPr>
       </w:pPr>
       <w:r>
@@ -2057,15 +2203,15 @@
         <w:pStyle w:val="Compact"/>
         <w:numPr>
           <w:ilvl w:val="0"/>
-          <w:numId w:val="1019"/>
+          <w:numId w:val="1021"/>
         </w:numPr>
       </w:pPr>
       <w:r>
         <w:t xml:space="preserve">transformation: none</w:t>
       </w:r>
     </w:p>
-    <w:bookmarkEnd w:id="21"/>
-    <w:bookmarkStart w:id="22" w:name="q_kaufkraft"/>
+    <w:bookmarkEnd w:id="22"/>
+    <w:bookmarkStart w:id="23" w:name="q_kaufkraft"/>
     <w:p>
       <w:pPr>
         <w:pStyle w:val="Heading2"/>
@@ -2082,7 +2228,7 @@
         <w:pStyle w:val="Compact"/>
         <w:numPr>
           <w:ilvl w:val="0"/>
-          <w:numId w:val="1020"/>
+          <w:numId w:val="1022"/>
         </w:numPr>
       </w:pPr>
       <w:r>
@@ -2103,7 +2249,7 @@
         <w:pStyle w:val="Compact"/>
         <w:numPr>
           <w:ilvl w:val="0"/>
-          <w:numId w:val="1020"/>
+          <w:numId w:val="1022"/>
         </w:numPr>
       </w:pPr>
       <w:r>
@@ -2124,7 +2270,7 @@
         <w:pStyle w:val="Compact"/>
         <w:numPr>
           <w:ilvl w:val="0"/>
-          <w:numId w:val="1020"/>
+          <w:numId w:val="1022"/>
         </w:numPr>
       </w:pPr>
       <w:r>
@@ -2136,7 +2282,7 @@
         <w:pStyle w:val="Compact"/>
         <w:numPr>
           <w:ilvl w:val="0"/>
-          <w:numId w:val="1020"/>
+          <w:numId w:val="1022"/>
         </w:numPr>
       </w:pPr>
       <w:r>
@@ -2148,7 +2294,7 @@
         <w:pStyle w:val="Compact"/>
         <w:numPr>
           <w:ilvl w:val="0"/>
-          <w:numId w:val="1020"/>
+          <w:numId w:val="1022"/>
         </w:numPr>
       </w:pPr>
       <w:r>
@@ -2160,15 +2306,15 @@
         <w:pStyle w:val="Compact"/>
         <w:numPr>
           <w:ilvl w:val="0"/>
-          <w:numId w:val="1020"/>
+          <w:numId w:val="1022"/>
         </w:numPr>
       </w:pPr>
       <w:r>
         <w:t xml:space="preserve">transformation: inverted (low purchasing power = higher vulnerability)</w:t>
       </w:r>
     </w:p>
-    <w:bookmarkEnd w:id="22"/>
-    <w:bookmarkStart w:id="23" w:name="a_hheink_niedrig"/>
+    <w:bookmarkEnd w:id="23"/>
+    <w:bookmarkStart w:id="24" w:name="a_hheink_niedrig"/>
     <w:p>
       <w:pPr>
         <w:pStyle w:val="Heading2"/>
@@ -2185,7 +2331,7 @@
         <w:pStyle w:val="Compact"/>
         <w:numPr>
           <w:ilvl w:val="0"/>
-          <w:numId w:val="1021"/>
+          <w:numId w:val="1023"/>
         </w:numPr>
       </w:pPr>
       <w:r>
@@ -2206,7 +2352,7 @@
         <w:pStyle w:val="Compact"/>
         <w:numPr>
           <w:ilvl w:val="0"/>
-          <w:numId w:val="1021"/>
+          <w:numId w:val="1023"/>
         </w:numPr>
       </w:pPr>
       <w:r>
@@ -2227,7 +2373,7 @@
         <w:pStyle w:val="Compact"/>
         <w:numPr>
           <w:ilvl w:val="0"/>
-          <w:numId w:val="1021"/>
+          <w:numId w:val="1023"/>
         </w:numPr>
       </w:pPr>
       <w:r>
@@ -2239,7 +2385,7 @@
         <w:pStyle w:val="Compact"/>
         <w:numPr>
           <w:ilvl w:val="0"/>
-          <w:numId w:val="1021"/>
+          <w:numId w:val="1023"/>
         </w:numPr>
       </w:pPr>
       <w:r>
@@ -2251,7 +2397,7 @@
         <w:pStyle w:val="Compact"/>
         <w:numPr>
           <w:ilvl w:val="0"/>
-          <w:numId w:val="1021"/>
+          <w:numId w:val="1023"/>
         </w:numPr>
       </w:pPr>
       <w:r>
@@ -2263,15 +2409,15 @@
         <w:pStyle w:val="Compact"/>
         <w:numPr>
           <w:ilvl w:val="0"/>
-          <w:numId w:val="1021"/>
+          <w:numId w:val="1023"/>
         </w:numPr>
       </w:pPr>
       <w:r>
         <w:t xml:space="preserve">transformation: none</w:t>
       </w:r>
     </w:p>
-    <w:bookmarkEnd w:id="23"/>
-    <w:bookmarkStart w:id="24" w:name="a_bev65um"/>
+    <w:bookmarkEnd w:id="24"/>
+    <w:bookmarkStart w:id="25" w:name="a_bev65um"/>
     <w:p>
       <w:pPr>
         <w:pStyle w:val="Heading2"/>
@@ -2288,7 +2434,7 @@
         <w:pStyle w:val="Compact"/>
         <w:numPr>
           <w:ilvl w:val="0"/>
-          <w:numId w:val="1022"/>
+          <w:numId w:val="1024"/>
         </w:numPr>
       </w:pPr>
       <w:r>
@@ -2309,7 +2455,7 @@
         <w:pStyle w:val="Compact"/>
         <w:numPr>
           <w:ilvl w:val="0"/>
-          <w:numId w:val="1022"/>
+          <w:numId w:val="1024"/>
         </w:numPr>
       </w:pPr>
       <w:r>
@@ -2330,7 +2476,7 @@
         <w:pStyle w:val="Compact"/>
         <w:numPr>
           <w:ilvl w:val="0"/>
-          <w:numId w:val="1022"/>
+          <w:numId w:val="1024"/>
         </w:numPr>
       </w:pPr>
       <w:r>
@@ -2342,7 +2488,7 @@
         <w:pStyle w:val="Compact"/>
         <w:numPr>
           <w:ilvl w:val="0"/>
-          <w:numId w:val="1022"/>
+          <w:numId w:val="1024"/>
         </w:numPr>
       </w:pPr>
       <w:r>
@@ -2354,7 +2500,7 @@
         <w:pStyle w:val="Compact"/>
         <w:numPr>
           <w:ilvl w:val="0"/>
-          <w:numId w:val="1022"/>
+          <w:numId w:val="1024"/>
         </w:numPr>
       </w:pPr>
       <w:r>
@@ -2366,15 +2512,15 @@
         <w:pStyle w:val="Compact"/>
         <w:numPr>
           <w:ilvl w:val="0"/>
-          <w:numId w:val="1022"/>
+          <w:numId w:val="1024"/>
         </w:numPr>
       </w:pPr>
       <w:r>
         <w:t xml:space="preserve">transformation: none</w:t>
       </w:r>
     </w:p>
-    <w:bookmarkEnd w:id="24"/>
-    <w:bookmarkStart w:id="25" w:name="a_bev75um"/>
+    <w:bookmarkEnd w:id="25"/>
+    <w:bookmarkStart w:id="26" w:name="a_bev75um"/>
     <w:p>
       <w:pPr>
         <w:pStyle w:val="Heading2"/>
@@ -2391,7 +2537,7 @@
         <w:pStyle w:val="Compact"/>
         <w:numPr>
           <w:ilvl w:val="0"/>
-          <w:numId w:val="1023"/>
+          <w:numId w:val="1025"/>
         </w:numPr>
       </w:pPr>
       <w:r>
@@ -2412,7 +2558,7 @@
         <w:pStyle w:val="Compact"/>
         <w:numPr>
           <w:ilvl w:val="0"/>
-          <w:numId w:val="1023"/>
+          <w:numId w:val="1025"/>
         </w:numPr>
       </w:pPr>
       <w:r>
@@ -2433,7 +2579,7 @@
         <w:pStyle w:val="Compact"/>
         <w:numPr>
           <w:ilvl w:val="0"/>
-          <w:numId w:val="1023"/>
+          <w:numId w:val="1025"/>
         </w:numPr>
       </w:pPr>
       <w:r>
@@ -2445,7 +2591,7 @@
         <w:pStyle w:val="Compact"/>
         <w:numPr>
           <w:ilvl w:val="0"/>
-          <w:numId w:val="1023"/>
+          <w:numId w:val="1025"/>
         </w:numPr>
       </w:pPr>
       <w:r>
@@ -2457,7 +2603,7 @@
         <w:pStyle w:val="Compact"/>
         <w:numPr>
           <w:ilvl w:val="0"/>
-          <w:numId w:val="1023"/>
+          <w:numId w:val="1025"/>
         </w:numPr>
       </w:pPr>
       <w:r>
@@ -2469,15 +2615,15 @@
         <w:pStyle w:val="Compact"/>
         <w:numPr>
           <w:ilvl w:val="0"/>
-          <w:numId w:val="1023"/>
+          <w:numId w:val="1025"/>
         </w:numPr>
       </w:pPr>
       <w:r>
         <w:t xml:space="preserve">transformation: none</w:t>
       </w:r>
     </w:p>
-    <w:bookmarkEnd w:id="25"/>
-    <w:bookmarkStart w:id="26" w:name="q_abhg_alt"/>
+    <w:bookmarkEnd w:id="26"/>
+    <w:bookmarkStart w:id="27" w:name="q_abhg_alt"/>
     <w:p>
       <w:pPr>
         <w:pStyle w:val="Heading2"/>
@@ -2494,7 +2640,7 @@
         <w:pStyle w:val="Compact"/>
         <w:numPr>
           <w:ilvl w:val="0"/>
-          <w:numId w:val="1024"/>
+          <w:numId w:val="1026"/>
         </w:numPr>
       </w:pPr>
       <w:r>
@@ -2515,7 +2661,7 @@
         <w:pStyle w:val="Compact"/>
         <w:numPr>
           <w:ilvl w:val="0"/>
-          <w:numId w:val="1024"/>
+          <w:numId w:val="1026"/>
         </w:numPr>
       </w:pPr>
       <w:r>
@@ -2536,7 +2682,7 @@
         <w:pStyle w:val="Compact"/>
         <w:numPr>
           <w:ilvl w:val="0"/>
-          <w:numId w:val="1024"/>
+          <w:numId w:val="1026"/>
         </w:numPr>
       </w:pPr>
       <w:r>
@@ -2548,7 +2694,7 @@
         <w:pStyle w:val="Compact"/>
         <w:numPr>
           <w:ilvl w:val="0"/>
-          <w:numId w:val="1024"/>
+          <w:numId w:val="1026"/>
         </w:numPr>
       </w:pPr>
       <w:r>
@@ -2560,7 +2706,7 @@
         <w:pStyle w:val="Compact"/>
         <w:numPr>
           <w:ilvl w:val="0"/>
-          <w:numId w:val="1024"/>
+          <w:numId w:val="1026"/>
         </w:numPr>
       </w:pPr>
       <w:r>
@@ -2572,15 +2718,15 @@
         <w:pStyle w:val="Compact"/>
         <w:numPr>
           <w:ilvl w:val="0"/>
-          <w:numId w:val="1024"/>
+          <w:numId w:val="1026"/>
         </w:numPr>
       </w:pPr>
       <w:r>
         <w:t xml:space="preserve">transformation: none</w:t>
       </w:r>
     </w:p>
-    <w:bookmarkEnd w:id="26"/>
-    <w:bookmarkStart w:id="27" w:name="a_bg1p"/>
+    <w:bookmarkEnd w:id="27"/>
+    <w:bookmarkStart w:id="28" w:name="a_bg1p"/>
     <w:p>
       <w:pPr>
         <w:pStyle w:val="Heading2"/>
@@ -2597,7 +2743,7 @@
         <w:pStyle w:val="Compact"/>
         <w:numPr>
           <w:ilvl w:val="0"/>
-          <w:numId w:val="1025"/>
+          <w:numId w:val="1027"/>
         </w:numPr>
       </w:pPr>
       <w:r>
@@ -2618,7 +2764,7 @@
         <w:pStyle w:val="Compact"/>
         <w:numPr>
           <w:ilvl w:val="0"/>
-          <w:numId w:val="1025"/>
+          <w:numId w:val="1027"/>
         </w:numPr>
       </w:pPr>
       <w:r>
@@ -2639,7 +2785,7 @@
         <w:pStyle w:val="Compact"/>
         <w:numPr>
           <w:ilvl w:val="0"/>
-          <w:numId w:val="1025"/>
+          <w:numId w:val="1027"/>
         </w:numPr>
       </w:pPr>
       <w:r>
@@ -2651,7 +2797,7 @@
         <w:pStyle w:val="Compact"/>
         <w:numPr>
           <w:ilvl w:val="0"/>
-          <w:numId w:val="1025"/>
+          <w:numId w:val="1027"/>
         </w:numPr>
       </w:pPr>
       <w:r>
@@ -2663,7 +2809,7 @@
         <w:pStyle w:val="Compact"/>
         <w:numPr>
           <w:ilvl w:val="0"/>
-          <w:numId w:val="1025"/>
+          <w:numId w:val="1027"/>
         </w:numPr>
       </w:pPr>
       <w:r>
@@ -2675,7 +2821,7 @@
         <w:pStyle w:val="Compact"/>
         <w:numPr>
           <w:ilvl w:val="0"/>
-          <w:numId w:val="1025"/>
+          <w:numId w:val="1027"/>
         </w:numPr>
       </w:pPr>
       <w:r>
@@ -2687,15 +2833,15 @@
         <w:pStyle w:val="Compact"/>
         <w:numPr>
           <w:ilvl w:val="0"/>
-          <w:numId w:val="1025"/>
+          <w:numId w:val="1027"/>
         </w:numPr>
       </w:pPr>
       <w:r>
         <w:t xml:space="preserve">critical note: the official INKAR indicator name and the current project rename do not match. This variable should not simply be presented as a single-parent-household indicator.</w:t>
       </w:r>
     </w:p>
-    <w:bookmarkEnd w:id="27"/>
-    <w:bookmarkStart w:id="28" w:name="q_hh1"/>
+    <w:bookmarkEnd w:id="28"/>
+    <w:bookmarkStart w:id="29" w:name="q_hh1"/>
     <w:p>
       <w:pPr>
         <w:pStyle w:val="Heading2"/>
@@ -2712,7 +2858,7 @@
         <w:pStyle w:val="Compact"/>
         <w:numPr>
           <w:ilvl w:val="0"/>
-          <w:numId w:val="1026"/>
+          <w:numId w:val="1028"/>
         </w:numPr>
       </w:pPr>
       <w:r>
@@ -2733,7 +2879,7 @@
         <w:pStyle w:val="Compact"/>
         <w:numPr>
           <w:ilvl w:val="0"/>
-          <w:numId w:val="1026"/>
+          <w:numId w:val="1028"/>
         </w:numPr>
       </w:pPr>
       <w:r>
@@ -2754,7 +2900,7 @@
         <w:pStyle w:val="Compact"/>
         <w:numPr>
           <w:ilvl w:val="0"/>
-          <w:numId w:val="1026"/>
+          <w:numId w:val="1028"/>
         </w:numPr>
       </w:pPr>
       <w:r>
@@ -2766,7 +2912,7 @@
         <w:pStyle w:val="Compact"/>
         <w:numPr>
           <w:ilvl w:val="0"/>
-          <w:numId w:val="1026"/>
+          <w:numId w:val="1028"/>
         </w:numPr>
       </w:pPr>
       <w:r>
@@ -2778,7 +2924,7 @@
         <w:pStyle w:val="Compact"/>
         <w:numPr>
           <w:ilvl w:val="0"/>
-          <w:numId w:val="1026"/>
+          <w:numId w:val="1028"/>
         </w:numPr>
       </w:pPr>
       <w:r>
@@ -2790,15 +2936,15 @@
         <w:pStyle w:val="Compact"/>
         <w:numPr>
           <w:ilvl w:val="0"/>
-          <w:numId w:val="1026"/>
+          <w:numId w:val="1028"/>
         </w:numPr>
       </w:pPr>
       <w:r>
         <w:t xml:space="preserve">transformation: none</w:t>
       </w:r>
     </w:p>
-    <w:bookmarkEnd w:id="28"/>
-    <w:bookmarkStart w:id="29" w:name="m_oev20_dist"/>
+    <w:bookmarkEnd w:id="29"/>
+    <w:bookmarkStart w:id="30" w:name="m_oev20_dist"/>
     <w:p>
       <w:pPr>
         <w:pStyle w:val="Heading2"/>
@@ -2815,7 +2961,7 @@
         <w:pStyle w:val="Compact"/>
         <w:numPr>
           <w:ilvl w:val="0"/>
-          <w:numId w:val="1027"/>
+          <w:numId w:val="1029"/>
         </w:numPr>
       </w:pPr>
       <w:r>
@@ -2836,7 +2982,7 @@
         <w:pStyle w:val="Compact"/>
         <w:numPr>
           <w:ilvl w:val="0"/>
-          <w:numId w:val="1027"/>
+          <w:numId w:val="1029"/>
         </w:numPr>
       </w:pPr>
       <w:r>
@@ -2857,7 +3003,7 @@
         <w:pStyle w:val="Compact"/>
         <w:numPr>
           <w:ilvl w:val="0"/>
-          <w:numId w:val="1027"/>
+          <w:numId w:val="1029"/>
         </w:numPr>
       </w:pPr>
       <w:r>
@@ -2869,7 +3015,7 @@
         <w:pStyle w:val="Compact"/>
         <w:numPr>
           <w:ilvl w:val="0"/>
-          <w:numId w:val="1027"/>
+          <w:numId w:val="1029"/>
         </w:numPr>
       </w:pPr>
       <w:r>
@@ -2881,7 +3027,7 @@
         <w:pStyle w:val="Compact"/>
         <w:numPr>
           <w:ilvl w:val="0"/>
-          <w:numId w:val="1027"/>
+          <w:numId w:val="1029"/>
         </w:numPr>
       </w:pPr>
       <w:r>
@@ -2893,15 +3039,15 @@
         <w:pStyle w:val="Compact"/>
         <w:numPr>
           <w:ilvl w:val="0"/>
-          <w:numId w:val="1027"/>
+          <w:numId w:val="1029"/>
         </w:numPr>
       </w:pPr>
       <w:r>
         <w:t xml:space="preserve">transformation: none</w:t>
       </w:r>
     </w:p>
-    <w:bookmarkEnd w:id="29"/>
-    <w:bookmarkStart w:id="30" w:name="m_q07_ha_dist"/>
+    <w:bookmarkEnd w:id="30"/>
+    <w:bookmarkStart w:id="31" w:name="m_q07_ha_dist"/>
     <w:p>
       <w:pPr>
         <w:pStyle w:val="Heading2"/>
@@ -2918,7 +3064,7 @@
         <w:pStyle w:val="Compact"/>
         <w:numPr>
           <w:ilvl w:val="0"/>
-          <w:numId w:val="1028"/>
+          <w:numId w:val="1030"/>
         </w:numPr>
       </w:pPr>
       <w:r>
@@ -2939,7 +3085,7 @@
         <w:pStyle w:val="Compact"/>
         <w:numPr>
           <w:ilvl w:val="0"/>
-          <w:numId w:val="1028"/>
+          <w:numId w:val="1030"/>
         </w:numPr>
       </w:pPr>
       <w:r>
@@ -2960,7 +3106,7 @@
         <w:pStyle w:val="Compact"/>
         <w:numPr>
           <w:ilvl w:val="0"/>
-          <w:numId w:val="1028"/>
+          <w:numId w:val="1030"/>
         </w:numPr>
       </w:pPr>
       <w:r>
@@ -2972,7 +3118,7 @@
         <w:pStyle w:val="Compact"/>
         <w:numPr>
           <w:ilvl w:val="0"/>
-          <w:numId w:val="1028"/>
+          <w:numId w:val="1030"/>
         </w:numPr>
       </w:pPr>
       <w:r>
@@ -2984,7 +3130,7 @@
         <w:pStyle w:val="Compact"/>
         <w:numPr>
           <w:ilvl w:val="0"/>
-          <w:numId w:val="1028"/>
+          <w:numId w:val="1030"/>
         </w:numPr>
       </w:pPr>
       <w:r>
@@ -2996,15 +3142,15 @@
         <w:pStyle w:val="Compact"/>
         <w:numPr>
           <w:ilvl w:val="0"/>
-          <w:numId w:val="1028"/>
+          <w:numId w:val="1030"/>
         </w:numPr>
       </w:pPr>
       <w:r>
         <w:t xml:space="preserve">transformation: none</w:t>
       </w:r>
     </w:p>
-    <w:bookmarkEnd w:id="30"/>
-    <w:bookmarkStart w:id="31" w:name="m_q01_apo_dist"/>
+    <w:bookmarkEnd w:id="31"/>
+    <w:bookmarkStart w:id="32" w:name="m_q01_apo_dist"/>
     <w:p>
       <w:pPr>
         <w:pStyle w:val="Heading2"/>
@@ -3021,7 +3167,7 @@
         <w:pStyle w:val="Compact"/>
         <w:numPr>
           <w:ilvl w:val="0"/>
-          <w:numId w:val="1029"/>
+          <w:numId w:val="1031"/>
         </w:numPr>
       </w:pPr>
       <w:r>
@@ -3042,7 +3188,7 @@
         <w:pStyle w:val="Compact"/>
         <w:numPr>
           <w:ilvl w:val="0"/>
-          <w:numId w:val="1029"/>
+          <w:numId w:val="1031"/>
         </w:numPr>
       </w:pPr>
       <w:r>
@@ -3063,7 +3209,7 @@
         <w:pStyle w:val="Compact"/>
         <w:numPr>
           <w:ilvl w:val="0"/>
-          <w:numId w:val="1029"/>
+          <w:numId w:val="1031"/>
         </w:numPr>
       </w:pPr>
       <w:r>
@@ -3075,7 +3221,7 @@
         <w:pStyle w:val="Compact"/>
         <w:numPr>
           <w:ilvl w:val="0"/>
-          <w:numId w:val="1029"/>
+          <w:numId w:val="1031"/>
         </w:numPr>
       </w:pPr>
       <w:r>
@@ -3087,7 +3233,7 @@
         <w:pStyle w:val="Compact"/>
         <w:numPr>
           <w:ilvl w:val="0"/>
-          <w:numId w:val="1029"/>
+          <w:numId w:val="1031"/>
         </w:numPr>
       </w:pPr>
       <w:r>
@@ -3099,25 +3245,25 @@
         <w:pStyle w:val="Compact"/>
         <w:numPr>
           <w:ilvl w:val="0"/>
-          <w:numId w:val="1029"/>
+          <w:numId w:val="1031"/>
         </w:numPr>
       </w:pPr>
       <w:r>
         <w:t xml:space="preserve">transformation: none</w:t>
       </w:r>
     </w:p>
-    <w:bookmarkEnd w:id="31"/>
     <w:bookmarkEnd w:id="32"/>
-    <w:bookmarkStart w:id="36" w:name="Xecc222a11ca4cb48136d299968bebac790a8100"/>
+    <w:bookmarkEnd w:id="33"/>
+    <w:bookmarkStart w:id="37" w:name="Xa63a6d8319f2839b92526ca5d073084097ae838"/>
     <w:p>
       <w:pPr>
         <w:pStyle w:val="Heading1"/>
       </w:pPr>
       <w:r>
-        <w:t xml:space="preserve">7. Optional variables for sensitivity / robustness checks</w:t>
-      </w:r>
-    </w:p>
-    <w:bookmarkStart w:id="33" w:name="q_ärzte_bev"/>
+        <w:t xml:space="preserve">8. Optional variables for sensitivity / robustness checks</w:t>
+      </w:r>
+    </w:p>
+    <w:bookmarkStart w:id="34" w:name="q_ärzte_bev"/>
     <w:p>
       <w:pPr>
         <w:pStyle w:val="Heading2"/>
@@ -3134,7 +3280,7 @@
         <w:pStyle w:val="Compact"/>
         <w:numPr>
           <w:ilvl w:val="0"/>
-          <w:numId w:val="1030"/>
+          <w:numId w:val="1032"/>
         </w:numPr>
       </w:pPr>
       <w:r>
@@ -3155,7 +3301,7 @@
         <w:pStyle w:val="Compact"/>
         <w:numPr>
           <w:ilvl w:val="0"/>
-          <w:numId w:val="1030"/>
+          <w:numId w:val="1032"/>
         </w:numPr>
       </w:pPr>
       <w:r>
@@ -3176,7 +3322,7 @@
         <w:pStyle w:val="Compact"/>
         <w:numPr>
           <w:ilvl w:val="0"/>
-          <w:numId w:val="1030"/>
+          <w:numId w:val="1032"/>
         </w:numPr>
       </w:pPr>
       <w:r>
@@ -3188,7 +3334,7 @@
         <w:pStyle w:val="Compact"/>
         <w:numPr>
           <w:ilvl w:val="0"/>
-          <w:numId w:val="1030"/>
+          <w:numId w:val="1032"/>
         </w:numPr>
       </w:pPr>
       <w:r>
@@ -3200,7 +3346,7 @@
         <w:pStyle w:val="Compact"/>
         <w:numPr>
           <w:ilvl w:val="0"/>
-          <w:numId w:val="1030"/>
+          <w:numId w:val="1032"/>
         </w:numPr>
       </w:pPr>
       <w:r>
@@ -3212,15 +3358,15 @@
         <w:pStyle w:val="Compact"/>
         <w:numPr>
           <w:ilvl w:val="0"/>
-          <w:numId w:val="1030"/>
+          <w:numId w:val="1032"/>
         </w:numPr>
       </w:pPr>
       <w:r>
         <w:t xml:space="preserve">transformation: inverted (fewer doctors = higher vulnerability)</w:t>
       </w:r>
     </w:p>
-    <w:bookmarkEnd w:id="33"/>
-    <w:bookmarkStart w:id="34" w:name="m_g02_sup_dist"/>
+    <w:bookmarkEnd w:id="34"/>
+    <w:bookmarkStart w:id="35" w:name="m_g02_sup_dist"/>
     <w:p>
       <w:pPr>
         <w:pStyle w:val="Heading2"/>
@@ -3237,7 +3383,7 @@
         <w:pStyle w:val="Compact"/>
         <w:numPr>
           <w:ilvl w:val="0"/>
-          <w:numId w:val="1031"/>
+          <w:numId w:val="1033"/>
         </w:numPr>
       </w:pPr>
       <w:r>
@@ -3258,7 +3404,7 @@
         <w:pStyle w:val="Compact"/>
         <w:numPr>
           <w:ilvl w:val="0"/>
-          <w:numId w:val="1031"/>
+          <w:numId w:val="1033"/>
         </w:numPr>
       </w:pPr>
       <w:r>
@@ -3279,7 +3425,7 @@
         <w:pStyle w:val="Compact"/>
         <w:numPr>
           <w:ilvl w:val="0"/>
-          <w:numId w:val="1031"/>
+          <w:numId w:val="1033"/>
         </w:numPr>
       </w:pPr>
       <w:r>
@@ -3291,7 +3437,7 @@
         <w:pStyle w:val="Compact"/>
         <w:numPr>
           <w:ilvl w:val="0"/>
-          <w:numId w:val="1031"/>
+          <w:numId w:val="1033"/>
         </w:numPr>
       </w:pPr>
       <w:r>
@@ -3303,7 +3449,7 @@
         <w:pStyle w:val="Compact"/>
         <w:numPr>
           <w:ilvl w:val="0"/>
-          <w:numId w:val="1031"/>
+          <w:numId w:val="1033"/>
         </w:numPr>
       </w:pPr>
       <w:r>
@@ -3315,15 +3461,15 @@
         <w:pStyle w:val="Compact"/>
         <w:numPr>
           <w:ilvl w:val="0"/>
-          <w:numId w:val="1031"/>
+          <w:numId w:val="1033"/>
         </w:numPr>
       </w:pPr>
       <w:r>
         <w:t xml:space="preserve">transformation: none</w:t>
       </w:r>
     </w:p>
-    <w:bookmarkEnd w:id="34"/>
-    <w:bookmarkStart w:id="35" w:name="a_bb_100mbits"/>
+    <w:bookmarkEnd w:id="35"/>
+    <w:bookmarkStart w:id="36" w:name="a_bb_100mbits"/>
     <w:p>
       <w:pPr>
         <w:pStyle w:val="Heading2"/>
@@ -3340,7 +3486,7 @@
         <w:pStyle w:val="Compact"/>
         <w:numPr>
           <w:ilvl w:val="0"/>
-          <w:numId w:val="1032"/>
+          <w:numId w:val="1034"/>
         </w:numPr>
       </w:pPr>
       <w:r>
@@ -3361,7 +3507,7 @@
         <w:pStyle w:val="Compact"/>
         <w:numPr>
           <w:ilvl w:val="0"/>
-          <w:numId w:val="1032"/>
+          <w:numId w:val="1034"/>
         </w:numPr>
       </w:pPr>
       <w:r>
@@ -3382,7 +3528,7 @@
         <w:pStyle w:val="Compact"/>
         <w:numPr>
           <w:ilvl w:val="0"/>
-          <w:numId w:val="1032"/>
+          <w:numId w:val="1034"/>
         </w:numPr>
       </w:pPr>
       <w:r>
@@ -3394,7 +3540,7 @@
         <w:pStyle w:val="Compact"/>
         <w:numPr>
           <w:ilvl w:val="0"/>
-          <w:numId w:val="1032"/>
+          <w:numId w:val="1034"/>
         </w:numPr>
       </w:pPr>
       <w:r>
@@ -3406,7 +3552,7 @@
         <w:pStyle w:val="Compact"/>
         <w:numPr>
           <w:ilvl w:val="0"/>
-          <w:numId w:val="1032"/>
+          <w:numId w:val="1034"/>
         </w:numPr>
       </w:pPr>
       <w:r>
@@ -3418,25 +3564,25 @@
         <w:pStyle w:val="Compact"/>
         <w:numPr>
           <w:ilvl w:val="0"/>
-          <w:numId w:val="1032"/>
+          <w:numId w:val="1034"/>
         </w:numPr>
       </w:pPr>
       <w:r>
         <w:t xml:space="preserve">transformation: if used, invert so that lower broadband coverage indicates higher vulnerability</w:t>
       </w:r>
     </w:p>
-    <w:bookmarkEnd w:id="35"/>
     <w:bookmarkEnd w:id="36"/>
-    <w:bookmarkStart w:id="48" w:name="X74fe1714b37246a22b7f819664ccce8db731851"/>
+    <w:bookmarkEnd w:id="37"/>
+    <w:bookmarkStart w:id="49" w:name="Xe155329741b10e25593c9c056470cbdc5ec45ba"/>
     <w:p>
       <w:pPr>
         <w:pStyle w:val="Heading1"/>
       </w:pPr>
       <w:r>
-        <w:t xml:space="preserve">8. Excluded variables</w:t>
-      </w:r>
-    </w:p>
-    <w:bookmarkStart w:id="37" w:name="q_bev_fl"/>
+        <w:t xml:space="preserve">9. Excluded variables</w:t>
+      </w:r>
+    </w:p>
+    <w:bookmarkStart w:id="38" w:name="q_bev_fl"/>
     <w:p>
       <w:pPr>
         <w:pStyle w:val="Heading2"/>
@@ -3453,7 +3599,7 @@
         <w:pStyle w:val="Compact"/>
         <w:numPr>
           <w:ilvl w:val="0"/>
-          <w:numId w:val="1033"/>
+          <w:numId w:val="1035"/>
         </w:numPr>
       </w:pPr>
       <w:r>
@@ -3474,7 +3620,7 @@
         <w:pStyle w:val="Compact"/>
         <w:numPr>
           <w:ilvl w:val="0"/>
-          <w:numId w:val="1033"/>
+          <w:numId w:val="1035"/>
         </w:numPr>
       </w:pPr>
       <w:r>
@@ -3495,7 +3641,7 @@
         <w:pStyle w:val="Compact"/>
         <w:numPr>
           <w:ilvl w:val="0"/>
-          <w:numId w:val="1033"/>
+          <w:numId w:val="1035"/>
         </w:numPr>
       </w:pPr>
       <w:r>
@@ -3507,7 +3653,7 @@
         <w:pStyle w:val="Compact"/>
         <w:numPr>
           <w:ilvl w:val="0"/>
-          <w:numId w:val="1033"/>
+          <w:numId w:val="1035"/>
         </w:numPr>
       </w:pPr>
       <w:r>
@@ -3519,15 +3665,15 @@
         <w:pStyle w:val="Compact"/>
         <w:numPr>
           <w:ilvl w:val="0"/>
-          <w:numId w:val="1033"/>
+          <w:numId w:val="1035"/>
         </w:numPr>
       </w:pPr>
       <w:r>
         <w:t xml:space="preserve">reason for exclusion: treated as contextual variable rather than vulnerability indicator</w:t>
       </w:r>
     </w:p>
-    <w:bookmarkEnd w:id="37"/>
-    <w:bookmarkStart w:id="38" w:name="q_bevsva_qkm"/>
+    <w:bookmarkEnd w:id="38"/>
+    <w:bookmarkStart w:id="39" w:name="q_bevsva_qkm"/>
     <w:p>
       <w:pPr>
         <w:pStyle w:val="Heading2"/>
@@ -3544,7 +3690,7 @@
         <w:pStyle w:val="Compact"/>
         <w:numPr>
           <w:ilvl w:val="0"/>
-          <w:numId w:val="1034"/>
+          <w:numId w:val="1036"/>
         </w:numPr>
       </w:pPr>
       <w:r>
@@ -3565,7 +3711,7 @@
         <w:pStyle w:val="Compact"/>
         <w:numPr>
           <w:ilvl w:val="0"/>
-          <w:numId w:val="1034"/>
+          <w:numId w:val="1036"/>
         </w:numPr>
       </w:pPr>
       <w:r>
@@ -3586,7 +3732,7 @@
         <w:pStyle w:val="Compact"/>
         <w:numPr>
           <w:ilvl w:val="0"/>
-          <w:numId w:val="1034"/>
+          <w:numId w:val="1036"/>
         </w:numPr>
       </w:pPr>
       <w:r>
@@ -3598,7 +3744,7 @@
         <w:pStyle w:val="Compact"/>
         <w:numPr>
           <w:ilvl w:val="0"/>
-          <w:numId w:val="1034"/>
+          <w:numId w:val="1036"/>
         </w:numPr>
       </w:pPr>
       <w:r>
@@ -3610,15 +3756,15 @@
         <w:pStyle w:val="Compact"/>
         <w:numPr>
           <w:ilvl w:val="0"/>
-          <w:numId w:val="1034"/>
+          <w:numId w:val="1036"/>
         </w:numPr>
       </w:pPr>
       <w:r>
         <w:t xml:space="preserve">reason for exclusion: structural indicator</w:t>
       </w:r>
     </w:p>
-    <w:bookmarkEnd w:id="38"/>
-    <w:bookmarkStart w:id="39" w:name="q_gewst_bev"/>
+    <w:bookmarkEnd w:id="39"/>
+    <w:bookmarkStart w:id="40" w:name="q_gewst_bev"/>
     <w:p>
       <w:pPr>
         <w:pStyle w:val="Heading2"/>
@@ -3635,7 +3781,7 @@
         <w:pStyle w:val="Compact"/>
         <w:numPr>
           <w:ilvl w:val="0"/>
-          <w:numId w:val="1035"/>
+          <w:numId w:val="1037"/>
         </w:numPr>
       </w:pPr>
       <w:r>
@@ -3656,7 +3802,7 @@
         <w:pStyle w:val="Compact"/>
         <w:numPr>
           <w:ilvl w:val="0"/>
-          <w:numId w:val="1035"/>
+          <w:numId w:val="1037"/>
         </w:numPr>
       </w:pPr>
       <w:r>
@@ -3677,7 +3823,7 @@
         <w:pStyle w:val="Compact"/>
         <w:numPr>
           <w:ilvl w:val="0"/>
-          <w:numId w:val="1035"/>
+          <w:numId w:val="1037"/>
         </w:numPr>
       </w:pPr>
       <w:r>
@@ -3689,7 +3835,7 @@
         <w:pStyle w:val="Compact"/>
         <w:numPr>
           <w:ilvl w:val="0"/>
-          <w:numId w:val="1035"/>
+          <w:numId w:val="1037"/>
         </w:numPr>
       </w:pPr>
       <w:r>
@@ -3701,15 +3847,15 @@
         <w:pStyle w:val="Compact"/>
         <w:numPr>
           <w:ilvl w:val="0"/>
-          <w:numId w:val="1035"/>
+          <w:numId w:val="1037"/>
         </w:numPr>
       </w:pPr>
       <w:r>
         <w:t xml:space="preserve">reason for exclusion: not household-level vulnerability</w:t>
       </w:r>
     </w:p>
-    <w:bookmarkEnd w:id="39"/>
-    <w:bookmarkStart w:id="40" w:name="d_steuereinnahme"/>
+    <w:bookmarkEnd w:id="40"/>
+    <w:bookmarkStart w:id="41" w:name="d_steuereinnahme"/>
     <w:p>
       <w:pPr>
         <w:pStyle w:val="Heading2"/>
@@ -3726,7 +3872,7 @@
         <w:pStyle w:val="Compact"/>
         <w:numPr>
           <w:ilvl w:val="0"/>
-          <w:numId w:val="1036"/>
+          <w:numId w:val="1038"/>
         </w:numPr>
       </w:pPr>
       <w:r>
@@ -3747,7 +3893,7 @@
         <w:pStyle w:val="Compact"/>
         <w:numPr>
           <w:ilvl w:val="0"/>
-          <w:numId w:val="1036"/>
+          <w:numId w:val="1038"/>
         </w:numPr>
       </w:pPr>
       <w:r>
@@ -3768,7 +3914,7 @@
         <w:pStyle w:val="Compact"/>
         <w:numPr>
           <w:ilvl w:val="0"/>
-          <w:numId w:val="1036"/>
+          <w:numId w:val="1038"/>
         </w:numPr>
       </w:pPr>
       <w:r>
@@ -3780,7 +3926,7 @@
         <w:pStyle w:val="Compact"/>
         <w:numPr>
           <w:ilvl w:val="0"/>
-          <w:numId w:val="1036"/>
+          <w:numId w:val="1038"/>
         </w:numPr>
       </w:pPr>
       <w:r>
@@ -3792,15 +3938,15 @@
         <w:pStyle w:val="Compact"/>
         <w:numPr>
           <w:ilvl w:val="0"/>
-          <w:numId w:val="1036"/>
+          <w:numId w:val="1038"/>
         </w:numPr>
       </w:pPr>
       <w:r>
         <w:t xml:space="preserve">reason for exclusion: structural indicator</w:t>
       </w:r>
     </w:p>
-    <w:bookmarkEnd w:id="40"/>
-    <w:bookmarkStart w:id="41" w:name="a_hheink_mittel"/>
+    <w:bookmarkEnd w:id="41"/>
+    <w:bookmarkStart w:id="42" w:name="a_hheink_mittel"/>
     <w:p>
       <w:pPr>
         <w:pStyle w:val="Heading2"/>
@@ -3817,7 +3963,7 @@
         <w:pStyle w:val="Compact"/>
         <w:numPr>
           <w:ilvl w:val="0"/>
-          <w:numId w:val="1037"/>
+          <w:numId w:val="1039"/>
         </w:numPr>
       </w:pPr>
       <w:r>
@@ -3838,7 +3984,7 @@
         <w:pStyle w:val="Compact"/>
         <w:numPr>
           <w:ilvl w:val="0"/>
-          <w:numId w:val="1037"/>
+          <w:numId w:val="1039"/>
         </w:numPr>
       </w:pPr>
       <w:r>
@@ -3859,7 +4005,7 @@
         <w:pStyle w:val="Compact"/>
         <w:numPr>
           <w:ilvl w:val="0"/>
-          <w:numId w:val="1037"/>
+          <w:numId w:val="1039"/>
         </w:numPr>
       </w:pPr>
       <w:r>
@@ -3871,7 +4017,7 @@
         <w:pStyle w:val="Compact"/>
         <w:numPr>
           <w:ilvl w:val="0"/>
-          <w:numId w:val="1037"/>
+          <w:numId w:val="1039"/>
         </w:numPr>
       </w:pPr>
       <w:r>
@@ -3883,15 +4029,15 @@
         <w:pStyle w:val="Compact"/>
         <w:numPr>
           <w:ilvl w:val="0"/>
-          <w:numId w:val="1037"/>
+          <w:numId w:val="1039"/>
         </w:numPr>
       </w:pPr>
       <w:r>
         <w:t xml:space="preserve">reason for exclusion: redundancy</w:t>
       </w:r>
     </w:p>
-    <w:bookmarkEnd w:id="41"/>
-    <w:bookmarkStart w:id="42" w:name="a_hheink_hoch"/>
+    <w:bookmarkEnd w:id="42"/>
+    <w:bookmarkStart w:id="43" w:name="a_hheink_hoch"/>
     <w:p>
       <w:pPr>
         <w:pStyle w:val="Heading2"/>
@@ -3908,7 +4054,7 @@
         <w:pStyle w:val="Compact"/>
         <w:numPr>
           <w:ilvl w:val="0"/>
-          <w:numId w:val="1038"/>
+          <w:numId w:val="1040"/>
         </w:numPr>
       </w:pPr>
       <w:r>
@@ -3929,7 +4075,7 @@
         <w:pStyle w:val="Compact"/>
         <w:numPr>
           <w:ilvl w:val="0"/>
-          <w:numId w:val="1038"/>
+          <w:numId w:val="1040"/>
         </w:numPr>
       </w:pPr>
       <w:r>
@@ -3950,7 +4096,7 @@
         <w:pStyle w:val="Compact"/>
         <w:numPr>
           <w:ilvl w:val="0"/>
-          <w:numId w:val="1038"/>
+          <w:numId w:val="1040"/>
         </w:numPr>
       </w:pPr>
       <w:r>
@@ -3962,7 +4108,7 @@
         <w:pStyle w:val="Compact"/>
         <w:numPr>
           <w:ilvl w:val="0"/>
-          <w:numId w:val="1038"/>
+          <w:numId w:val="1040"/>
         </w:numPr>
       </w:pPr>
       <w:r>
@@ -3974,15 +4120,15 @@
         <w:pStyle w:val="Compact"/>
         <w:numPr>
           <w:ilvl w:val="0"/>
-          <w:numId w:val="1038"/>
+          <w:numId w:val="1040"/>
         </w:numPr>
       </w:pPr>
       <w:r>
         <w:t xml:space="preserve">reason for exclusion: redundancy</w:t>
       </w:r>
     </w:p>
-    <w:bookmarkEnd w:id="42"/>
-    <w:bookmarkStart w:id="43" w:name="q_stud"/>
+    <w:bookmarkEnd w:id="43"/>
+    <w:bookmarkStart w:id="44" w:name="q_stud"/>
     <w:p>
       <w:pPr>
         <w:pStyle w:val="Heading2"/>
@@ -3999,7 +4145,7 @@
         <w:pStyle w:val="Compact"/>
         <w:numPr>
           <w:ilvl w:val="0"/>
-          <w:numId w:val="1039"/>
+          <w:numId w:val="1041"/>
         </w:numPr>
       </w:pPr>
       <w:r>
@@ -4020,7 +4166,7 @@
         <w:pStyle w:val="Compact"/>
         <w:numPr>
           <w:ilvl w:val="0"/>
-          <w:numId w:val="1039"/>
+          <w:numId w:val="1041"/>
         </w:numPr>
       </w:pPr>
       <w:r>
@@ -4041,7 +4187,7 @@
         <w:pStyle w:val="Compact"/>
         <w:numPr>
           <w:ilvl w:val="0"/>
-          <w:numId w:val="1039"/>
+          <w:numId w:val="1041"/>
         </w:numPr>
       </w:pPr>
       <w:r>
@@ -4053,7 +4199,7 @@
         <w:pStyle w:val="Compact"/>
         <w:numPr>
           <w:ilvl w:val="0"/>
-          <w:numId w:val="1039"/>
+          <w:numId w:val="1041"/>
         </w:numPr>
       </w:pPr>
       <w:r>
@@ -4065,15 +4211,15 @@
         <w:pStyle w:val="Compact"/>
         <w:numPr>
           <w:ilvl w:val="0"/>
-          <w:numId w:val="1039"/>
+          <w:numId w:val="1041"/>
         </w:numPr>
       </w:pPr>
       <w:r>
         <w:t xml:space="preserve">reason for exclusion: ambiguous indicator</w:t>
       </w:r>
     </w:p>
-    <w:bookmarkEnd w:id="43"/>
-    <w:bookmarkStart w:id="44" w:name="q_stud_1825"/>
+    <w:bookmarkEnd w:id="44"/>
+    <w:bookmarkStart w:id="45" w:name="q_stud_1825"/>
     <w:p>
       <w:pPr>
         <w:pStyle w:val="Heading2"/>
@@ -4090,7 +4236,7 @@
         <w:pStyle w:val="Compact"/>
         <w:numPr>
           <w:ilvl w:val="0"/>
-          <w:numId w:val="1040"/>
+          <w:numId w:val="1042"/>
         </w:numPr>
       </w:pPr>
       <w:r>
@@ -4111,7 +4257,7 @@
         <w:pStyle w:val="Compact"/>
         <w:numPr>
           <w:ilvl w:val="0"/>
-          <w:numId w:val="1040"/>
+          <w:numId w:val="1042"/>
         </w:numPr>
       </w:pPr>
       <w:r>
@@ -4132,7 +4278,7 @@
         <w:pStyle w:val="Compact"/>
         <w:numPr>
           <w:ilvl w:val="0"/>
-          <w:numId w:val="1040"/>
+          <w:numId w:val="1042"/>
         </w:numPr>
       </w:pPr>
       <w:r>
@@ -4144,7 +4290,7 @@
         <w:pStyle w:val="Compact"/>
         <w:numPr>
           <w:ilvl w:val="0"/>
-          <w:numId w:val="1040"/>
+          <w:numId w:val="1042"/>
         </w:numPr>
       </w:pPr>
       <w:r>
@@ -4156,15 +4302,15 @@
         <w:pStyle w:val="Compact"/>
         <w:numPr>
           <w:ilvl w:val="0"/>
-          <w:numId w:val="1040"/>
+          <w:numId w:val="1042"/>
         </w:numPr>
       </w:pPr>
       <w:r>
         <w:t xml:space="preserve">reason for exclusion: ambiguous</w:t>
       </w:r>
     </w:p>
-    <w:bookmarkEnd w:id="44"/>
-    <w:bookmarkStart w:id="45" w:name="q_stud_fh"/>
+    <w:bookmarkEnd w:id="45"/>
+    <w:bookmarkStart w:id="46" w:name="q_stud_fh"/>
     <w:p>
       <w:pPr>
         <w:pStyle w:val="Heading2"/>
@@ -4181,7 +4327,7 @@
         <w:pStyle w:val="Compact"/>
         <w:numPr>
           <w:ilvl w:val="0"/>
-          <w:numId w:val="1041"/>
+          <w:numId w:val="1043"/>
         </w:numPr>
       </w:pPr>
       <w:r>
@@ -4202,7 +4348,7 @@
         <w:pStyle w:val="Compact"/>
         <w:numPr>
           <w:ilvl w:val="0"/>
-          <w:numId w:val="1041"/>
+          <w:numId w:val="1043"/>
         </w:numPr>
       </w:pPr>
       <w:r>
@@ -4223,7 +4369,7 @@
         <w:pStyle w:val="Compact"/>
         <w:numPr>
           <w:ilvl w:val="0"/>
-          <w:numId w:val="1041"/>
+          <w:numId w:val="1043"/>
         </w:numPr>
       </w:pPr>
       <w:r>
@@ -4235,7 +4381,7 @@
         <w:pStyle w:val="Compact"/>
         <w:numPr>
           <w:ilvl w:val="0"/>
-          <w:numId w:val="1041"/>
+          <w:numId w:val="1043"/>
         </w:numPr>
       </w:pPr>
       <w:r>
@@ -4247,15 +4393,15 @@
         <w:pStyle w:val="Compact"/>
         <w:numPr>
           <w:ilvl w:val="0"/>
-          <w:numId w:val="1041"/>
+          <w:numId w:val="1043"/>
         </w:numPr>
       </w:pPr>
       <w:r>
         <w:t xml:space="preserve">reason for exclusion: ambiguous</w:t>
       </w:r>
     </w:p>
-    <w:bookmarkEnd w:id="45"/>
-    <w:bookmarkStart w:id="46" w:name="i_wans"/>
+    <w:bookmarkEnd w:id="46"/>
+    <w:bookmarkStart w:id="47" w:name="i_wans"/>
     <w:p>
       <w:pPr>
         <w:pStyle w:val="Heading2"/>
@@ -4272,7 +4418,7 @@
         <w:pStyle w:val="Compact"/>
         <w:numPr>
           <w:ilvl w:val="0"/>
-          <w:numId w:val="1042"/>
+          <w:numId w:val="1044"/>
         </w:numPr>
       </w:pPr>
       <w:r>
@@ -4293,7 +4439,7 @@
         <w:pStyle w:val="Compact"/>
         <w:numPr>
           <w:ilvl w:val="0"/>
-          <w:numId w:val="1042"/>
+          <w:numId w:val="1044"/>
         </w:numPr>
       </w:pPr>
       <w:r>
@@ -4314,7 +4460,7 @@
         <w:pStyle w:val="Compact"/>
         <w:numPr>
           <w:ilvl w:val="0"/>
-          <w:numId w:val="1042"/>
+          <w:numId w:val="1044"/>
         </w:numPr>
       </w:pPr>
       <w:r>
@@ -4326,7 +4472,7 @@
         <w:pStyle w:val="Compact"/>
         <w:numPr>
           <w:ilvl w:val="0"/>
-          <w:numId w:val="1042"/>
+          <w:numId w:val="1044"/>
         </w:numPr>
       </w:pPr>
       <w:r>
@@ -4338,15 +4484,15 @@
         <w:pStyle w:val="Compact"/>
         <w:numPr>
           <w:ilvl w:val="0"/>
-          <w:numId w:val="1042"/>
+          <w:numId w:val="1044"/>
         </w:numPr>
       </w:pPr>
       <w:r>
         <w:t xml:space="preserve">reason for exclusion: indirect indicator</w:t>
       </w:r>
     </w:p>
-    <w:bookmarkEnd w:id="46"/>
-    <w:bookmarkStart w:id="47" w:name="i_saldo_nat"/>
+    <w:bookmarkEnd w:id="47"/>
+    <w:bookmarkStart w:id="48" w:name="i_saldo_nat"/>
     <w:p>
       <w:pPr>
         <w:pStyle w:val="Heading2"/>
@@ -4363,7 +4509,7 @@
         <w:pStyle w:val="Compact"/>
         <w:numPr>
           <w:ilvl w:val="0"/>
-          <w:numId w:val="1043"/>
+          <w:numId w:val="1045"/>
         </w:numPr>
       </w:pPr>
       <w:r>
@@ -4384,7 +4530,7 @@
         <w:pStyle w:val="Compact"/>
         <w:numPr>
           <w:ilvl w:val="0"/>
-          <w:numId w:val="1043"/>
+          <w:numId w:val="1045"/>
         </w:numPr>
       </w:pPr>
       <w:r>
@@ -4405,7 +4551,7 @@
         <w:pStyle w:val="Compact"/>
         <w:numPr>
           <w:ilvl w:val="0"/>
-          <w:numId w:val="1043"/>
+          <w:numId w:val="1045"/>
         </w:numPr>
       </w:pPr>
       <w:r>
@@ -4417,7 +4563,7 @@
         <w:pStyle w:val="Compact"/>
         <w:numPr>
           <w:ilvl w:val="0"/>
-          <w:numId w:val="1043"/>
+          <w:numId w:val="1045"/>
         </w:numPr>
       </w:pPr>
       <w:r>
@@ -4429,22 +4575,22 @@
         <w:pStyle w:val="Compact"/>
         <w:numPr>
           <w:ilvl w:val="0"/>
-          <w:numId w:val="1043"/>
+          <w:numId w:val="1045"/>
         </w:numPr>
       </w:pPr>
       <w:r>
         <w:t xml:space="preserve">reason for exclusion: indirect indicator</w:t>
       </w:r>
     </w:p>
-    <w:bookmarkEnd w:id="47"/>
     <w:bookmarkEnd w:id="48"/>
-    <w:bookmarkStart w:id="49" w:name="X6a1fba2188c2bd56c5d30e6ebcef05d678e21c5"/>
+    <w:bookmarkEnd w:id="49"/>
+    <w:bookmarkStart w:id="50" w:name="Xa463bddff8736e1336306a817477a8ba6dc5603"/>
     <w:p>
       <w:pPr>
         <w:pStyle w:val="Heading1"/>
       </w:pPr>
       <w:r>
-        <w:t xml:space="preserve">9. Why the first wide PCA was used at the beginning</w:t>
+        <w:t xml:space="preserve">10. Why the first wide PCA was used at the beginning</w:t>
       </w:r>
     </w:p>
     <w:p>
@@ -4468,7 +4614,7 @@
         <w:pStyle w:val="Compact"/>
         <w:numPr>
           <w:ilvl w:val="0"/>
-          <w:numId w:val="1044"/>
+          <w:numId w:val="1046"/>
         </w:numPr>
       </w:pPr>
       <w:r>
@@ -4480,7 +4626,7 @@
         <w:pStyle w:val="Compact"/>
         <w:numPr>
           <w:ilvl w:val="0"/>
-          <w:numId w:val="1044"/>
+          <w:numId w:val="1046"/>
         </w:numPr>
       </w:pPr>
       <w:r>
@@ -4492,7 +4638,7 @@
         <w:pStyle w:val="Compact"/>
         <w:numPr>
           <w:ilvl w:val="0"/>
-          <w:numId w:val="1044"/>
+          <w:numId w:val="1046"/>
         </w:numPr>
       </w:pPr>
       <w:r>
@@ -4512,7 +4658,7 @@
         <w:pStyle w:val="Compact"/>
         <w:numPr>
           <w:ilvl w:val="0"/>
-          <w:numId w:val="1045"/>
+          <w:numId w:val="1047"/>
         </w:numPr>
       </w:pPr>
       <w:r>
@@ -4539,7 +4685,7 @@
         <w:pStyle w:val="Compact"/>
         <w:numPr>
           <w:ilvl w:val="0"/>
-          <w:numId w:val="1045"/>
+          <w:numId w:val="1047"/>
         </w:numPr>
       </w:pPr>
       <w:r>
@@ -4551,7 +4697,7 @@
         <w:pStyle w:val="Compact"/>
         <w:numPr>
           <w:ilvl w:val="0"/>
-          <w:numId w:val="1045"/>
+          <w:numId w:val="1047"/>
         </w:numPr>
       </w:pPr>
       <w:r>
@@ -4563,7 +4709,7 @@
         <w:pStyle w:val="Compact"/>
         <w:numPr>
           <w:ilvl w:val="0"/>
-          <w:numId w:val="1045"/>
+          <w:numId w:val="1047"/>
         </w:numPr>
       </w:pPr>
       <w:r>
@@ -4590,7 +4736,7 @@
         <w:pStyle w:val="Compact"/>
         <w:numPr>
           <w:ilvl w:val="0"/>
-          <w:numId w:val="1045"/>
+          <w:numId w:val="1047"/>
         </w:numPr>
       </w:pPr>
       <w:r>
@@ -4602,7 +4748,7 @@
         <w:pStyle w:val="Compact"/>
         <w:numPr>
           <w:ilvl w:val="0"/>
-          <w:numId w:val="1045"/>
+          <w:numId w:val="1047"/>
         </w:numPr>
       </w:pPr>
       <w:r>
@@ -4618,14 +4764,14 @@
         <w:t xml:space="preserve">ALG II / SGB II</w:t>
       </w:r>
     </w:p>
-    <w:bookmarkEnd w:id="49"/>
-    <w:bookmarkStart w:id="50" w:name="Xb20cf07efba1b594f1a5f7cb9acc268d03ea759"/>
+    <w:bookmarkEnd w:id="50"/>
+    <w:bookmarkStart w:id="51" w:name="X55261c88c7da50650627a177eb193b4da38fded"/>
     <w:p>
       <w:pPr>
         <w:pStyle w:val="Heading1"/>
       </w:pPr>
       <w:r>
-        <w:t xml:space="preserve">10. What I learned from the first wide PCA</w:t>
+        <w:t xml:space="preserve">11. What I learned from the first wide PCA</w:t>
       </w:r>
     </w:p>
     <w:p>
@@ -4649,7 +4795,7 @@
         <w:pStyle w:val="Compact"/>
         <w:numPr>
           <w:ilvl w:val="0"/>
-          <w:numId w:val="1046"/>
+          <w:numId w:val="1048"/>
         </w:numPr>
       </w:pPr>
       <w:r>
@@ -4661,7 +4807,7 @@
         <w:pStyle w:val="Compact"/>
         <w:numPr>
           <w:ilvl w:val="0"/>
-          <w:numId w:val="1046"/>
+          <w:numId w:val="1048"/>
         </w:numPr>
       </w:pPr>
       <w:r>
@@ -4673,7 +4819,7 @@
         <w:pStyle w:val="Compact"/>
         <w:numPr>
           <w:ilvl w:val="0"/>
-          <w:numId w:val="1046"/>
+          <w:numId w:val="1048"/>
         </w:numPr>
       </w:pPr>
       <w:r>
@@ -4693,7 +4839,7 @@
         <w:pStyle w:val="Compact"/>
         <w:numPr>
           <w:ilvl w:val="0"/>
-          <w:numId w:val="1047"/>
+          <w:numId w:val="1049"/>
         </w:numPr>
       </w:pPr>
       <w:r>
@@ -4705,7 +4851,7 @@
         <w:pStyle w:val="Compact"/>
         <w:numPr>
           <w:ilvl w:val="0"/>
-          <w:numId w:val="1047"/>
+          <w:numId w:val="1049"/>
         </w:numPr>
       </w:pPr>
       <w:r>
@@ -4717,21 +4863,21 @@
         <w:pStyle w:val="Compact"/>
         <w:numPr>
           <w:ilvl w:val="0"/>
-          <w:numId w:val="1047"/>
+          <w:numId w:val="1049"/>
         </w:numPr>
       </w:pPr>
       <w:r>
         <w:t xml:space="preserve">the resulting index is harder to defend conceptually in a meeting because the retained components are less transparent substantively</w:t>
       </w:r>
     </w:p>
-    <w:bookmarkEnd w:id="50"/>
-    <w:bookmarkStart w:id="51" w:name="Xbaf7c605bd7caa09c76117c82ced85a12d9b7ad"/>
+    <w:bookmarkEnd w:id="51"/>
+    <w:bookmarkStart w:id="52" w:name="Xc04ec519377293590e8658b145cdf50964d093b"/>
     <w:p>
       <w:pPr>
         <w:pStyle w:val="Heading1"/>
       </w:pPr>
       <w:r>
-        <w:t xml:space="preserve">11. What the redesigned PCA now does</w:t>
+        <w:t xml:space="preserve">12. What the redesigned PCA now does</w:t>
       </w:r>
     </w:p>
     <w:p>
@@ -4755,7 +4901,7 @@
         <w:pStyle w:val="Compact"/>
         <w:numPr>
           <w:ilvl w:val="0"/>
-          <w:numId w:val="1048"/>
+          <w:numId w:val="1050"/>
         </w:numPr>
       </w:pPr>
       <w:r>
@@ -4767,7 +4913,7 @@
         <w:pStyle w:val="Compact"/>
         <w:numPr>
           <w:ilvl w:val="0"/>
-          <w:numId w:val="1048"/>
+          <w:numId w:val="1050"/>
         </w:numPr>
       </w:pPr>
       <w:r>
@@ -4779,7 +4925,7 @@
         <w:pStyle w:val="Compact"/>
         <w:numPr>
           <w:ilvl w:val="0"/>
-          <w:numId w:val="1048"/>
+          <w:numId w:val="1050"/>
         </w:numPr>
       </w:pPr>
       <w:r>
@@ -4791,7 +4937,7 @@
         <w:pStyle w:val="Compact"/>
         <w:numPr>
           <w:ilvl w:val="0"/>
-          <w:numId w:val="1048"/>
+          <w:numId w:val="1050"/>
         </w:numPr>
       </w:pPr>
       <w:r>
@@ -4826,7 +4972,7 @@
         <w:pStyle w:val="Compact"/>
         <w:numPr>
           <w:ilvl w:val="0"/>
-          <w:numId w:val="1049"/>
+          <w:numId w:val="1051"/>
         </w:numPr>
       </w:pPr>
       <w:r>
@@ -4838,7 +4984,7 @@
         <w:pStyle w:val="Compact"/>
         <w:numPr>
           <w:ilvl w:val="0"/>
-          <w:numId w:val="1049"/>
+          <w:numId w:val="1051"/>
         </w:numPr>
       </w:pPr>
       <w:r>
@@ -4850,7 +4996,7 @@
         <w:pStyle w:val="Compact"/>
         <w:numPr>
           <w:ilvl w:val="0"/>
-          <w:numId w:val="1049"/>
+          <w:numId w:val="1051"/>
         </w:numPr>
       </w:pPr>
       <w:r>
@@ -4862,7 +5008,7 @@
         <w:pStyle w:val="Compact"/>
         <w:numPr>
           <w:ilvl w:val="0"/>
-          <w:numId w:val="1049"/>
+          <w:numId w:val="1051"/>
         </w:numPr>
       </w:pPr>
       <w:r>
@@ -4882,7 +5028,7 @@
         <w:pStyle w:val="Compact"/>
         <w:numPr>
           <w:ilvl w:val="0"/>
-          <w:numId w:val="1050"/>
+          <w:numId w:val="1052"/>
         </w:numPr>
       </w:pPr>
       <w:r>
@@ -4894,7 +5040,7 @@
         <w:pStyle w:val="Compact"/>
         <w:numPr>
           <w:ilvl w:val="0"/>
-          <w:numId w:val="1050"/>
+          <w:numId w:val="1052"/>
         </w:numPr>
       </w:pPr>
       <w:r>
@@ -4906,7 +5052,7 @@
         <w:pStyle w:val="Compact"/>
         <w:numPr>
           <w:ilvl w:val="0"/>
-          <w:numId w:val="1050"/>
+          <w:numId w:val="1052"/>
         </w:numPr>
       </w:pPr>
       <w:r>
@@ -4918,7 +5064,7 @@
         <w:pStyle w:val="Compact"/>
         <w:numPr>
           <w:ilvl w:val="0"/>
-          <w:numId w:val="1050"/>
+          <w:numId w:val="1052"/>
         </w:numPr>
       </w:pPr>
       <w:r>
@@ -4930,7 +5076,7 @@
         <w:pStyle w:val="Compact"/>
         <w:numPr>
           <w:ilvl w:val="0"/>
-          <w:numId w:val="1050"/>
+          <w:numId w:val="1052"/>
         </w:numPr>
       </w:pPr>
       <w:r>
@@ -4952,14 +5098,14 @@
         <w:t xml:space="preserve">only as robustness check</w:t>
       </w:r>
     </w:p>
-    <w:bookmarkEnd w:id="51"/>
-    <w:bookmarkStart w:id="52" w:name="X72505518de13cc984e219c8a5a0c54b76531542"/>
+    <w:bookmarkEnd w:id="52"/>
+    <w:bookmarkStart w:id="53" w:name="X261481569d4a824e0ab2d629ad6d49bf7958d1b"/>
     <w:p>
       <w:pPr>
         <w:pStyle w:val="Heading1"/>
       </w:pPr>
       <w:r>
-        <w:t xml:space="preserve">12. What the redesigned PCA says now</w:t>
+        <w:t xml:space="preserve">13. What the redesigned PCA says now</w:t>
       </w:r>
     </w:p>
     <w:p>
@@ -4983,7 +5129,7 @@
         <w:pStyle w:val="Compact"/>
         <w:numPr>
           <w:ilvl w:val="0"/>
-          <w:numId w:val="1051"/>
+          <w:numId w:val="1053"/>
         </w:numPr>
       </w:pPr>
       <w:r>
@@ -5019,7 +5165,7 @@
         <w:pStyle w:val="Compact"/>
         <w:numPr>
           <w:ilvl w:val="0"/>
-          <w:numId w:val="1051"/>
+          <w:numId w:val="1053"/>
         </w:numPr>
       </w:pPr>
       <w:r>
@@ -5055,7 +5201,7 @@
         <w:pStyle w:val="Compact"/>
         <w:numPr>
           <w:ilvl w:val="0"/>
-          <w:numId w:val="1051"/>
+          <w:numId w:val="1053"/>
         </w:numPr>
       </w:pPr>
       <w:r>
@@ -5091,7 +5237,7 @@
         <w:pStyle w:val="Compact"/>
         <w:numPr>
           <w:ilvl w:val="0"/>
-          <w:numId w:val="1051"/>
+          <w:numId w:val="1053"/>
         </w:numPr>
       </w:pPr>
       <w:r>
@@ -5135,7 +5281,7 @@
         <w:pStyle w:val="Compact"/>
         <w:numPr>
           <w:ilvl w:val="0"/>
-          <w:numId w:val="1052"/>
+          <w:numId w:val="1054"/>
         </w:numPr>
       </w:pPr>
       <w:r>
@@ -5168,7 +5314,7 @@
         <w:pStyle w:val="Compact"/>
         <w:numPr>
           <w:ilvl w:val="0"/>
-          <w:numId w:val="1052"/>
+          <w:numId w:val="1054"/>
         </w:numPr>
       </w:pPr>
       <w:r>
@@ -5201,7 +5347,7 @@
         <w:pStyle w:val="Compact"/>
         <w:numPr>
           <w:ilvl w:val="0"/>
-          <w:numId w:val="1052"/>
+          <w:numId w:val="1054"/>
         </w:numPr>
       </w:pPr>
       <w:r>
@@ -5230,7 +5376,7 @@
         <w:pStyle w:val="Compact"/>
         <w:numPr>
           <w:ilvl w:val="0"/>
-          <w:numId w:val="1053"/>
+          <w:numId w:val="1055"/>
         </w:numPr>
       </w:pPr>
       <w:r>
@@ -5242,7 +5388,7 @@
         <w:pStyle w:val="Compact"/>
         <w:numPr>
           <w:ilvl w:val="0"/>
-          <w:numId w:val="1053"/>
+          <w:numId w:val="1055"/>
         </w:numPr>
       </w:pPr>
       <w:r>
@@ -5254,21 +5400,21 @@
         <w:pStyle w:val="Compact"/>
         <w:numPr>
           <w:ilvl w:val="0"/>
-          <w:numId w:val="1053"/>
+          <w:numId w:val="1055"/>
         </w:numPr>
       </w:pPr>
       <w:r>
         <w:t xml:space="preserve">the redesigned index is easier to defend because it is more clearly tied to interpretable vulnerability dimensions</w:t>
       </w:r>
     </w:p>
-    <w:bookmarkEnd w:id="52"/>
-    <w:bookmarkStart w:id="53" w:name="X76b87f75bfaed9a73cc4416f71a6df77b5f5fa7"/>
+    <w:bookmarkEnd w:id="53"/>
+    <w:bookmarkStart w:id="54" w:name="X177d386dceb46a145f0d4a8695d46fe7c35787d"/>
     <w:p>
       <w:pPr>
         <w:pStyle w:val="Heading1"/>
       </w:pPr>
       <w:r>
-        <w:t xml:space="preserve">13. Short meeting message</w:t>
+        <w:t xml:space="preserve">14. Can the INKAR-based vulnerability framework be scaled up to Germany?</w:t>
       </w:r>
     </w:p>
     <w:p>
@@ -5276,6 +5422,212 @@
         <w:pStyle w:val="FirstParagraph"/>
       </w:pPr>
       <w:r>
+        <w:t xml:space="preserve">On the socio-economic side, the short answer is: yes, in principle.</w:t>
+      </w:r>
+    </w:p>
+    <w:p>
+      <w:pPr>
+        <w:pStyle w:val="BodyText"/>
+      </w:pPr>
+      <w:r>
+        <w:t xml:space="preserve">Why:</w:t>
+      </w:r>
+    </w:p>
+    <w:p>
+      <w:pPr>
+        <w:pStyle w:val="Compact"/>
+        <w:numPr>
+          <w:ilvl w:val="0"/>
+          <w:numId w:val="1056"/>
+        </w:numPr>
+      </w:pPr>
+      <w:r>
+        <w:t xml:space="preserve">the INKAR indicators used here are not specific to the Elbe basin</w:t>
+      </w:r>
+    </w:p>
+    <w:p>
+      <w:pPr>
+        <w:pStyle w:val="Compact"/>
+        <w:numPr>
+          <w:ilvl w:val="0"/>
+          <w:numId w:val="1056"/>
+        </w:numPr>
+      </w:pPr>
+      <w:r>
+        <w:t xml:space="preserve">the municipality-level INKAR framework exists at a Germany-wide scale</w:t>
+      </w:r>
+    </w:p>
+    <w:p>
+      <w:pPr>
+        <w:pStyle w:val="Compact"/>
+        <w:numPr>
+          <w:ilvl w:val="0"/>
+          <w:numId w:val="1056"/>
+        </w:numPr>
+      </w:pPr>
+      <w:r>
+        <w:rPr>
+          <w:rStyle w:val="VerbatimChar"/>
+        </w:rPr>
+        <w:t xml:space="preserve">173</w:t>
+      </w:r>
+      <w:r>
+        <w:t xml:space="preserve"> </w:t>
+      </w:r>
+      <w:r>
+        <w:t xml:space="preserve">out of</w:t>
+      </w:r>
+      <w:r>
+        <w:t xml:space="preserve"> </w:t>
+      </w:r>
+      <w:r>
+        <w:rPr>
+          <w:rStyle w:val="VerbatimChar"/>
+        </w:rPr>
+        <w:t xml:space="preserve">176</w:t>
+      </w:r>
+      <w:r>
+        <w:t xml:space="preserve"> </w:t>
+      </w:r>
+      <w:r>
+        <w:t xml:space="preserve">municipality-level indicators are present in all 16 federal states</w:t>
+      </w:r>
+    </w:p>
+    <w:p>
+      <w:pPr>
+        <w:pStyle w:val="Compact"/>
+        <w:numPr>
+          <w:ilvl w:val="0"/>
+          <w:numId w:val="1056"/>
+        </w:numPr>
+      </w:pPr>
+      <w:r>
+        <w:t xml:space="preserve">the main socio-economic logic of deprivation, demographic sensitivity, household structure and accessibility can therefore be transferred beyond the Elbe case</w:t>
+      </w:r>
+    </w:p>
+    <w:p>
+      <w:pPr>
+        <w:pStyle w:val="FirstParagraph"/>
+      </w:pPr>
+      <w:r>
+        <w:t xml:space="preserve">What this means in practice:</w:t>
+      </w:r>
+    </w:p>
+    <w:p>
+      <w:pPr>
+        <w:pStyle w:val="Compact"/>
+        <w:numPr>
+          <w:ilvl w:val="0"/>
+          <w:numId w:val="1057"/>
+        </w:numPr>
+      </w:pPr>
+      <w:r>
+        <w:t xml:space="preserve">a Germany-wide vulnerability index based on INKAR is feasible</w:t>
+      </w:r>
+    </w:p>
+    <w:p>
+      <w:pPr>
+        <w:pStyle w:val="Compact"/>
+        <w:numPr>
+          <w:ilvl w:val="0"/>
+          <w:numId w:val="1057"/>
+        </w:numPr>
+      </w:pPr>
+      <w:r>
+        <w:t xml:space="preserve">the redesigned indicator selection is actually better suited for upscaling than the first wide PCA, because it is conceptually narrower and less dependent on highly local or structurally ambiguous variables</w:t>
+      </w:r>
+    </w:p>
+    <w:p>
+      <w:pPr>
+        <w:pStyle w:val="FirstParagraph"/>
+      </w:pPr>
+      <w:r>
+        <w:t xml:space="preserve">What still limits full project upscaling:</w:t>
+      </w:r>
+    </w:p>
+    <w:p>
+      <w:pPr>
+        <w:pStyle w:val="Compact"/>
+        <w:numPr>
+          <w:ilvl w:val="0"/>
+          <w:numId w:val="1058"/>
+        </w:numPr>
+      </w:pPr>
+      <w:r>
+        <w:t xml:space="preserve">the hazard side would need nationally consistent flood-exposure data</w:t>
+      </w:r>
+    </w:p>
+    <w:p>
+      <w:pPr>
+        <w:pStyle w:val="Compact"/>
+        <w:numPr>
+          <w:ilvl w:val="0"/>
+          <w:numId w:val="1058"/>
+        </w:numPr>
+      </w:pPr>
+      <w:r>
+        <w:t xml:space="preserve">the protection side would need nationally comparable protection information</w:t>
+      </w:r>
+    </w:p>
+    <w:p>
+      <w:pPr>
+        <w:pStyle w:val="Compact"/>
+        <w:numPr>
+          <w:ilvl w:val="0"/>
+          <w:numId w:val="1058"/>
+        </w:numPr>
+      </w:pPr>
+      <w:r>
+        <w:t xml:space="preserve">municipality-level completeness is still weaker than simple state-level indicator presence</w:t>
+      </w:r>
+    </w:p>
+    <w:p>
+      <w:pPr>
+        <w:pStyle w:val="FirstParagraph"/>
+      </w:pPr>
+      <w:r>
+        <w:t xml:space="preserve">So the careful formulation for the meeting is:</w:t>
+      </w:r>
+    </w:p>
+    <w:p>
+      <w:pPr>
+        <w:pStyle w:val="Compact"/>
+        <w:numPr>
+          <w:ilvl w:val="0"/>
+          <w:numId w:val="1059"/>
+        </w:numPr>
+      </w:pPr>
+      <w:r>
+        <w:t xml:space="preserve">the INKAR-based socio-economic vulnerability component is, in principle, scalable to Germany</w:t>
+      </w:r>
+    </w:p>
+    <w:p>
+      <w:pPr>
+        <w:pStyle w:val="Compact"/>
+        <w:numPr>
+          <w:ilvl w:val="0"/>
+          <w:numId w:val="1059"/>
+        </w:numPr>
+      </w:pPr>
+      <w:r>
+        <w:t xml:space="preserve">the full flood-justice framework is only scalable if the hazard and protection data can also be standardised nationally</w:t>
+      </w:r>
+    </w:p>
+    <w:bookmarkEnd w:id="54"/>
+    <w:bookmarkStart w:id="55" w:name="Xec6eff5968f4b5e9be22ad38ba1a20660d87e88"/>
+    <w:p>
+      <w:pPr>
+        <w:pStyle w:val="Heading1"/>
+      </w:pPr>
+      <w:r>
+        <w:t xml:space="preserve">15. Short meeting message</w:t>
+      </w:r>
+    </w:p>
+    <w:p>
+      <w:pPr>
+        <w:pStyle w:val="FirstParagraph"/>
+      </w:pPr>
+      <w:r>
         <w:t xml:space="preserve">A short summary line for the meeting could be:</w:t>
       </w:r>
     </w:p>
@@ -5287,14 +5639,14 @@
         <w:t xml:space="preserve">"The first version used a broad exploratory wide PCA to understand the overall structure of the socio-economic indicator space. The redesigned version keeps PCA, but applies it to a reduced and theory-led indicator set organised into domains. This makes the final vulnerability index more interpretable and more defensible, while still retaining a data-reduction step. On the socio-economic side, the framework is in principle transferable across Germany; the stronger limitation lies in the hazard and protection data, not in the INKAR variables themselves."</w:t>
       </w:r>
     </w:p>
-    <w:bookmarkEnd w:id="53"/>
-    <w:bookmarkStart w:id="54" w:name="X6c177848c17697ca1da9c2c6a68642fb0b86f71"/>
+    <w:bookmarkEnd w:id="55"/>
+    <w:bookmarkStart w:id="56" w:name="Xd7f99e36fc0f82384dad8a31ed6870554eec191"/>
     <w:p>
       <w:pPr>
         <w:pStyle w:val="Heading1"/>
       </w:pPr>
       <w:r>
-        <w:t xml:space="preserve">14. Is anything still missing?</w:t>
+        <w:t xml:space="preserve">16. Is anything still missing?</w:t>
       </w:r>
     </w:p>
     <w:p>
@@ -5320,7 +5672,7 @@
         <w:t xml:space="preserve">caveat, because the official INKAR name and the current project rename do not match.</w:t>
       </w:r>
     </w:p>
-    <w:bookmarkEnd w:id="54"/>
+    <w:bookmarkEnd w:id="56"/>
     <w:sectPr>
       <w:pgSz w:h="15840" w:w="12240"/>
       <w:pgMar w:bottom="1440" w:footer="720" w:gutter="0" w:header="720" w:left="1800" w:right="1800" w:top="1440"/>
@@ -9216,6 +9568,12 @@
     <w:abstractNumId w:val="991"/>
   </w:num>
   <w:num w:numId="1011">
+    <w:abstractNumId w:val="991"/>
+  </w:num>
+  <w:num w:numId="1012">
+    <w:abstractNumId w:val="991"/>
+  </w:num>
+  <w:num w:numId="1013">
     <w:abstractNumId w:val="99411"/>
     <w:lvlOverride w:ilvl="0">
       <w:startOverride w:val="1"/>
@@ -9244,12 +9602,6 @@
     <w:lvlOverride w:ilvl="8">
       <w:startOverride w:val="1"/>
     </w:lvlOverride>
-  </w:num>
-  <w:num w:numId="1012">
-    <w:abstractNumId w:val="991"/>
-  </w:num>
-  <w:num w:numId="1013">
-    <w:abstractNumId w:val="991"/>
   </w:num>
   <w:num w:numId="1014">
     <w:abstractNumId w:val="991"/>
@@ -9369,6 +9721,24 @@
     <w:abstractNumId w:val="991"/>
   </w:num>
   <w:num w:numId="1053">
+    <w:abstractNumId w:val="991"/>
+  </w:num>
+  <w:num w:numId="1054">
+    <w:abstractNumId w:val="991"/>
+  </w:num>
+  <w:num w:numId="1055">
+    <w:abstractNumId w:val="991"/>
+  </w:num>
+  <w:num w:numId="1056">
+    <w:abstractNumId w:val="991"/>
+  </w:num>
+  <w:num w:numId="1057">
+    <w:abstractNumId w:val="991"/>
+  </w:num>
+  <w:num w:numId="1058">
+    <w:abstractNumId w:val="991"/>
+  </w:num>
+  <w:num w:numId="1059">
     <w:abstractNumId w:val="991"/>
   </w:num>
 </w:numbering>

</xml_diff>

<commit_message>
added shortlist for nationwide inkar variables & powerpoint for gfz meeting
</commit_message>
<xml_diff>
--- a/INKAR_vulnerability_index_GFZ_briefing_EN_v2.docx
+++ b/INKAR_vulnerability_index_GFZ_briefing_EN_v2.docx
@@ -3573,16 +3573,1266 @@
     </w:p>
     <w:bookmarkEnd w:id="36"/>
     <w:bookmarkEnd w:id="37"/>
-    <w:bookmarkStart w:id="49" w:name="Xe155329741b10e25593c9c056470cbdc5ec45ba"/>
+    <w:bookmarkStart w:id="51" w:name="X4004d9b7e0c003158a07438a1875430b852c6c9"/>
     <w:p>
       <w:pPr>
         <w:pStyle w:val="Heading1"/>
       </w:pPr>
       <w:r>
-        <w:t xml:space="preserve">9. Excluded variables</w:t>
-      </w:r>
-    </w:p>
-    <w:bookmarkStart w:id="38" w:name="q_bev_fl"/>
+        <w:t xml:space="preserve">9. Proposed nationwide shortlist for a Germany-wide INKAR index</w:t>
+      </w:r>
+    </w:p>
+    <w:p>
+      <w:pPr>
+        <w:pStyle w:val="FirstParagraph"/>
+      </w:pPr>
+      <w:r>
+        <w:t xml:space="preserve">If the socio-economic component is to be scaled up to Germany, the strongest option is not to restrict the index to variables with absolute AGS-level completeness only. That would leave a candidate pool that is too structural and too weak in substantive vulnerability terms.</w:t>
+      </w:r>
+    </w:p>
+    <w:p>
+      <w:pPr>
+        <w:pStyle w:val="BodyText"/>
+      </w:pPr>
+      <w:r>
+        <w:t xml:space="preserve">A better option is a pragmatic nationwide shortlist:</w:t>
+      </w:r>
+    </w:p>
+    <w:p>
+      <w:pPr>
+        <w:pStyle w:val="Compact"/>
+        <w:numPr>
+          <w:ilvl w:val="0"/>
+          <w:numId w:val="1035"/>
+        </w:numPr>
+      </w:pPr>
+      <w:r>
+        <w:t xml:space="preserve">variables that are present in all 16 federal states</w:t>
+      </w:r>
+    </w:p>
+    <w:p>
+      <w:pPr>
+        <w:pStyle w:val="Compact"/>
+        <w:numPr>
+          <w:ilvl w:val="0"/>
+          <w:numId w:val="1035"/>
+        </w:numPr>
+      </w:pPr>
+      <w:r>
+        <w:t xml:space="preserve">variables with very high AGS-level availability</w:t>
+      </w:r>
+    </w:p>
+    <w:p>
+      <w:pPr>
+        <w:pStyle w:val="Compact"/>
+        <w:numPr>
+          <w:ilvl w:val="0"/>
+          <w:numId w:val="1035"/>
+        </w:numPr>
+      </w:pPr>
+      <w:r>
+        <w:t xml:space="preserve">variables that still capture meaningful vulnerability dimensions</w:t>
+      </w:r>
+    </w:p>
+    <w:bookmarkStart w:id="38" w:name="a_algii_sgbii-1"/>
+    <w:p>
+      <w:pPr>
+        <w:pStyle w:val="Heading2"/>
+      </w:pPr>
+      <w:r>
+        <w:rPr>
+          <w:rStyle w:val="VerbatimChar"/>
+        </w:rPr>
+        <w:t xml:space="preserve">a_ALGII_SGBII</w:t>
+      </w:r>
+    </w:p>
+    <w:p>
+      <w:pPr>
+        <w:pStyle w:val="Compact"/>
+        <w:numPr>
+          <w:ilvl w:val="0"/>
+          <w:numId w:val="1036"/>
+        </w:numPr>
+      </w:pPr>
+      <w:r>
+        <w:t xml:space="preserve">official INKAR indicator:</w:t>
+      </w:r>
+      <w:r>
+        <w:t xml:space="preserve"> </w:t>
+      </w:r>
+      <w:r>
+        <w:rPr>
+          <w:rStyle w:val="VerbatimChar"/>
+        </w:rPr>
+        <w:t xml:space="preserve">ALG II-Leistungen an SGBII</w:t>
+      </w:r>
+    </w:p>
+    <w:p>
+      <w:pPr>
+        <w:pStyle w:val="Compact"/>
+        <w:numPr>
+          <w:ilvl w:val="0"/>
+          <w:numId w:val="1036"/>
+        </w:numPr>
+      </w:pPr>
+      <w:r>
+        <w:t xml:space="preserve">project label:</w:t>
+      </w:r>
+      <w:r>
+        <w:t xml:space="preserve"> </w:t>
+      </w:r>
+      <w:r>
+        <w:rPr>
+          <w:rStyle w:val="VerbatimChar"/>
+        </w:rPr>
+        <w:t xml:space="preserve">share_alg2_sgb2</w:t>
+      </w:r>
+    </w:p>
+    <w:p>
+      <w:pPr>
+        <w:pStyle w:val="Compact"/>
+        <w:numPr>
+          <w:ilvl w:val="0"/>
+          <w:numId w:val="1036"/>
+        </w:numPr>
+      </w:pPr>
+      <w:r>
+        <w:t xml:space="preserve">nationwide AGS coverage: about</w:t>
+      </w:r>
+      <w:r>
+        <w:t xml:space="preserve"> </w:t>
+      </w:r>
+      <w:r>
+        <w:rPr>
+          <w:rStyle w:val="VerbatimChar"/>
+        </w:rPr>
+        <w:t xml:space="preserve">96.8%</w:t>
+      </w:r>
+    </w:p>
+    <w:p>
+      <w:pPr>
+        <w:pStyle w:val="Compact"/>
+        <w:numPr>
+          <w:ilvl w:val="0"/>
+          <w:numId w:val="1036"/>
+        </w:numPr>
+      </w:pPr>
+      <w:r>
+        <w:t xml:space="preserve">why it belongs in a nationwide shortlist: strong deprivation marker, available in all 16 federal states, conceptually central for vulnerability</w:t>
+      </w:r>
+    </w:p>
+    <w:bookmarkEnd w:id="38"/>
+    <w:bookmarkStart w:id="39" w:name="a_unterkunft_sgbii-1"/>
+    <w:p>
+      <w:pPr>
+        <w:pStyle w:val="Heading2"/>
+      </w:pPr>
+      <w:r>
+        <w:rPr>
+          <w:rStyle w:val="VerbatimChar"/>
+        </w:rPr>
+        <w:t xml:space="preserve">a_Unterkunft_SGBII</w:t>
+      </w:r>
+    </w:p>
+    <w:p>
+      <w:pPr>
+        <w:pStyle w:val="Compact"/>
+        <w:numPr>
+          <w:ilvl w:val="0"/>
+          <w:numId w:val="1037"/>
+        </w:numPr>
+      </w:pPr>
+      <w:r>
+        <w:t xml:space="preserve">official INKAR indicator:</w:t>
+      </w:r>
+      <w:r>
+        <w:t xml:space="preserve"> </w:t>
+      </w:r>
+      <w:r>
+        <w:rPr>
+          <w:rStyle w:val="VerbatimChar"/>
+        </w:rPr>
+        <w:t xml:space="preserve">Leistungen für Unterkunft an SGBII</w:t>
+      </w:r>
+    </w:p>
+    <w:p>
+      <w:pPr>
+        <w:pStyle w:val="Compact"/>
+        <w:numPr>
+          <w:ilvl w:val="0"/>
+          <w:numId w:val="1037"/>
+        </w:numPr>
+      </w:pPr>
+      <w:r>
+        <w:t xml:space="preserve">project label:</w:t>
+      </w:r>
+      <w:r>
+        <w:t xml:space="preserve"> </w:t>
+      </w:r>
+      <w:r>
+        <w:rPr>
+          <w:rStyle w:val="VerbatimChar"/>
+        </w:rPr>
+        <w:t xml:space="preserve">share_sgb2_with_housing_costs</w:t>
+      </w:r>
+    </w:p>
+    <w:p>
+      <w:pPr>
+        <w:pStyle w:val="Compact"/>
+        <w:numPr>
+          <w:ilvl w:val="0"/>
+          <w:numId w:val="1037"/>
+        </w:numPr>
+      </w:pPr>
+      <w:r>
+        <w:t xml:space="preserve">nationwide AGS coverage: about</w:t>
+      </w:r>
+      <w:r>
+        <w:t xml:space="preserve"> </w:t>
+      </w:r>
+      <w:r>
+        <w:rPr>
+          <w:rStyle w:val="VerbatimChar"/>
+        </w:rPr>
+        <w:t xml:space="preserve">96.8%</w:t>
+      </w:r>
+    </w:p>
+    <w:p>
+      <w:pPr>
+        <w:pStyle w:val="Compact"/>
+        <w:numPr>
+          <w:ilvl w:val="0"/>
+          <w:numId w:val="1037"/>
+        </w:numPr>
+      </w:pPr>
+      <w:r>
+        <w:t xml:space="preserve">why it belongs in a nationwide shortlist: housing-related welfare dependence complements the general transfer-dependence indicator and remains broadly available</w:t>
+      </w:r>
+    </w:p>
+    <w:bookmarkEnd w:id="39"/>
+    <w:bookmarkStart w:id="40" w:name="a_alolang-1"/>
+    <w:p>
+      <w:pPr>
+        <w:pStyle w:val="Heading2"/>
+      </w:pPr>
+      <w:r>
+        <w:rPr>
+          <w:rStyle w:val="VerbatimChar"/>
+        </w:rPr>
+        <w:t xml:space="preserve">a_aloLang</w:t>
+      </w:r>
+    </w:p>
+    <w:p>
+      <w:pPr>
+        <w:pStyle w:val="Compact"/>
+        <w:numPr>
+          <w:ilvl w:val="0"/>
+          <w:numId w:val="1038"/>
+        </w:numPr>
+      </w:pPr>
+      <w:r>
+        <w:t xml:space="preserve">official INKAR indicator:</w:t>
+      </w:r>
+      <w:r>
+        <w:t xml:space="preserve"> </w:t>
+      </w:r>
+      <w:r>
+        <w:rPr>
+          <w:rStyle w:val="VerbatimChar"/>
+        </w:rPr>
+        <w:t xml:space="preserve">Langzeitarbeitslose</w:t>
+      </w:r>
+    </w:p>
+    <w:p>
+      <w:pPr>
+        <w:pStyle w:val="Compact"/>
+        <w:numPr>
+          <w:ilvl w:val="0"/>
+          <w:numId w:val="1038"/>
+        </w:numPr>
+      </w:pPr>
+      <w:r>
+        <w:t xml:space="preserve">project label:</w:t>
+      </w:r>
+      <w:r>
+        <w:t xml:space="preserve"> </w:t>
+      </w:r>
+      <w:r>
+        <w:rPr>
+          <w:rStyle w:val="VerbatimChar"/>
+        </w:rPr>
+        <w:t xml:space="preserve">share_longterm_unemp</w:t>
+      </w:r>
+    </w:p>
+    <w:p>
+      <w:pPr>
+        <w:pStyle w:val="Compact"/>
+        <w:numPr>
+          <w:ilvl w:val="0"/>
+          <w:numId w:val="1038"/>
+        </w:numPr>
+      </w:pPr>
+      <w:r>
+        <w:t xml:space="preserve">nationwide AGS coverage: about</w:t>
+      </w:r>
+      <w:r>
+        <w:t xml:space="preserve"> </w:t>
+      </w:r>
+      <w:r>
+        <w:rPr>
+          <w:rStyle w:val="VerbatimChar"/>
+        </w:rPr>
+        <w:t xml:space="preserve">98.2%</w:t>
+      </w:r>
+    </w:p>
+    <w:p>
+      <w:pPr>
+        <w:pStyle w:val="Compact"/>
+        <w:numPr>
+          <w:ilvl w:val="0"/>
+          <w:numId w:val="1038"/>
+        </w:numPr>
+      </w:pPr>
+      <w:r>
+        <w:t xml:space="preserve">why it belongs in a nationwide shortlist: captures persistent labour-market exclusion and is substantively stronger than purely structural labour-market variables</w:t>
+      </w:r>
+    </w:p>
+    <w:bookmarkEnd w:id="40"/>
+    <w:bookmarkStart w:id="41" w:name="q_alo_u25_einw-1"/>
+    <w:p>
+      <w:pPr>
+        <w:pStyle w:val="Heading2"/>
+      </w:pPr>
+      <w:r>
+        <w:rPr>
+          <w:rStyle w:val="VerbatimChar"/>
+        </w:rPr>
+        <w:t xml:space="preserve">q_alo_u25_einw</w:t>
+      </w:r>
+    </w:p>
+    <w:p>
+      <w:pPr>
+        <w:pStyle w:val="Compact"/>
+        <w:numPr>
+          <w:ilvl w:val="0"/>
+          <w:numId w:val="1039"/>
+        </w:numPr>
+      </w:pPr>
+      <w:r>
+        <w:t xml:space="preserve">official INKAR indicator:</w:t>
+      </w:r>
+      <w:r>
+        <w:t xml:space="preserve"> </w:t>
+      </w:r>
+      <w:r>
+        <w:rPr>
+          <w:rStyle w:val="VerbatimChar"/>
+        </w:rPr>
+        <w:t xml:space="preserve">Jüngere Arbeitslose</w:t>
+      </w:r>
+    </w:p>
+    <w:p>
+      <w:pPr>
+        <w:pStyle w:val="Compact"/>
+        <w:numPr>
+          <w:ilvl w:val="0"/>
+          <w:numId w:val="1039"/>
+        </w:numPr>
+      </w:pPr>
+      <w:r>
+        <w:t xml:space="preserve">project label:</w:t>
+      </w:r>
+      <w:r>
+        <w:t xml:space="preserve"> </w:t>
+      </w:r>
+      <w:r>
+        <w:rPr>
+          <w:rStyle w:val="VerbatimChar"/>
+        </w:rPr>
+        <w:t xml:space="preserve">unemp_u25_per_1000</w:t>
+      </w:r>
+    </w:p>
+    <w:p>
+      <w:pPr>
+        <w:pStyle w:val="Compact"/>
+        <w:numPr>
+          <w:ilvl w:val="0"/>
+          <w:numId w:val="1039"/>
+        </w:numPr>
+      </w:pPr>
+      <w:r>
+        <w:t xml:space="preserve">nationwide AGS coverage: about</w:t>
+      </w:r>
+      <w:r>
+        <w:t xml:space="preserve"> </w:t>
+      </w:r>
+      <w:r>
+        <w:rPr>
+          <w:rStyle w:val="VerbatimChar"/>
+        </w:rPr>
+        <w:t xml:space="preserve">98.2%</w:t>
+      </w:r>
+    </w:p>
+    <w:p>
+      <w:pPr>
+        <w:pStyle w:val="Compact"/>
+        <w:numPr>
+          <w:ilvl w:val="0"/>
+          <w:numId w:val="1039"/>
+        </w:numPr>
+      </w:pPr>
+      <w:r>
+        <w:t xml:space="preserve">why it belongs in a nationwide shortlist: adds a labour-market fragility dimension and remains broadly available nationwide</w:t>
+      </w:r>
+    </w:p>
+    <w:bookmarkEnd w:id="41"/>
+    <w:bookmarkStart w:id="42" w:name="q_kaufkraft-1"/>
+    <w:p>
+      <w:pPr>
+        <w:pStyle w:val="Heading2"/>
+      </w:pPr>
+      <w:r>
+        <w:rPr>
+          <w:rStyle w:val="VerbatimChar"/>
+        </w:rPr>
+        <w:t xml:space="preserve">q_kaufkraft</w:t>
+      </w:r>
+    </w:p>
+    <w:p>
+      <w:pPr>
+        <w:pStyle w:val="Compact"/>
+        <w:numPr>
+          <w:ilvl w:val="0"/>
+          <w:numId w:val="1040"/>
+        </w:numPr>
+      </w:pPr>
+      <w:r>
+        <w:t xml:space="preserve">official INKAR indicator:</w:t>
+      </w:r>
+      <w:r>
+        <w:t xml:space="preserve"> </w:t>
+      </w:r>
+      <w:r>
+        <w:rPr>
+          <w:rStyle w:val="VerbatimChar"/>
+        </w:rPr>
+        <w:t xml:space="preserve">Kaufkraft</w:t>
+      </w:r>
+    </w:p>
+    <w:p>
+      <w:pPr>
+        <w:pStyle w:val="Compact"/>
+        <w:numPr>
+          <w:ilvl w:val="0"/>
+          <w:numId w:val="1040"/>
+        </w:numPr>
+      </w:pPr>
+      <w:r>
+        <w:t xml:space="preserve">project label:</w:t>
+      </w:r>
+      <w:r>
+        <w:t xml:space="preserve"> </w:t>
+      </w:r>
+      <w:r>
+        <w:rPr>
+          <w:rStyle w:val="VerbatimChar"/>
+        </w:rPr>
+        <w:t xml:space="preserve">purchasing_power</w:t>
+      </w:r>
+    </w:p>
+    <w:p>
+      <w:pPr>
+        <w:pStyle w:val="Compact"/>
+        <w:numPr>
+          <w:ilvl w:val="0"/>
+          <w:numId w:val="1040"/>
+        </w:numPr>
+      </w:pPr>
+      <w:r>
+        <w:t xml:space="preserve">nationwide AGS coverage: about</w:t>
+      </w:r>
+      <w:r>
+        <w:t xml:space="preserve"> </w:t>
+      </w:r>
+      <w:r>
+        <w:rPr>
+          <w:rStyle w:val="VerbatimChar"/>
+        </w:rPr>
+        <w:t xml:space="preserve">98.2%</w:t>
+      </w:r>
+    </w:p>
+    <w:p>
+      <w:pPr>
+        <w:pStyle w:val="Compact"/>
+        <w:numPr>
+          <w:ilvl w:val="0"/>
+          <w:numId w:val="1040"/>
+        </w:numPr>
+      </w:pPr>
+      <w:r>
+        <w:t xml:space="preserve">why it belongs in a nationwide shortlist: one of the clearest economic-capacity indicators in INKAR, with excellent nationwide coverage</w:t>
+      </w:r>
+    </w:p>
+    <w:bookmarkEnd w:id="42"/>
+    <w:bookmarkStart w:id="43" w:name="a_hheink_niedrig-1"/>
+    <w:p>
+      <w:pPr>
+        <w:pStyle w:val="Heading2"/>
+      </w:pPr>
+      <w:r>
+        <w:rPr>
+          <w:rStyle w:val="VerbatimChar"/>
+        </w:rPr>
+        <w:t xml:space="preserve">a_hheink_niedrig</w:t>
+      </w:r>
+    </w:p>
+    <w:p>
+      <w:pPr>
+        <w:pStyle w:val="Compact"/>
+        <w:numPr>
+          <w:ilvl w:val="0"/>
+          <w:numId w:val="1041"/>
+        </w:numPr>
+      </w:pPr>
+      <w:r>
+        <w:t xml:space="preserve">official INKAR indicator:</w:t>
+      </w:r>
+      <w:r>
+        <w:t xml:space="preserve"> </w:t>
+      </w:r>
+      <w:r>
+        <w:rPr>
+          <w:rStyle w:val="VerbatimChar"/>
+        </w:rPr>
+        <w:t xml:space="preserve">Haushalte mit niedrigem Einkommen</w:t>
+      </w:r>
+    </w:p>
+    <w:p>
+      <w:pPr>
+        <w:pStyle w:val="Compact"/>
+        <w:numPr>
+          <w:ilvl w:val="0"/>
+          <w:numId w:val="1041"/>
+        </w:numPr>
+      </w:pPr>
+      <w:r>
+        <w:t xml:space="preserve">project label:</w:t>
+      </w:r>
+      <w:r>
+        <w:t xml:space="preserve"> </w:t>
+      </w:r>
+      <w:r>
+        <w:rPr>
+          <w:rStyle w:val="VerbatimChar"/>
+        </w:rPr>
+        <w:t xml:space="preserve">share_hh_income_low</w:t>
+      </w:r>
+    </w:p>
+    <w:p>
+      <w:pPr>
+        <w:pStyle w:val="Compact"/>
+        <w:numPr>
+          <w:ilvl w:val="0"/>
+          <w:numId w:val="1041"/>
+        </w:numPr>
+      </w:pPr>
+      <w:r>
+        <w:t xml:space="preserve">nationwide AGS coverage: about</w:t>
+      </w:r>
+      <w:r>
+        <w:t xml:space="preserve"> </w:t>
+      </w:r>
+      <w:r>
+        <w:rPr>
+          <w:rStyle w:val="VerbatimChar"/>
+        </w:rPr>
+        <w:t xml:space="preserve">98.2%</w:t>
+      </w:r>
+    </w:p>
+    <w:p>
+      <w:pPr>
+        <w:pStyle w:val="Compact"/>
+        <w:numPr>
+          <w:ilvl w:val="0"/>
+          <w:numId w:val="1041"/>
+        </w:numPr>
+      </w:pPr>
+      <w:r>
+        <w:t xml:space="preserve">why it belongs in a nationwide shortlist: directly captures low-income household structure and complements welfare- and labour-market indicators well</w:t>
+      </w:r>
+    </w:p>
+    <w:bookmarkEnd w:id="43"/>
+    <w:bookmarkStart w:id="44" w:name="a_bev65um-1"/>
+    <w:p>
+      <w:pPr>
+        <w:pStyle w:val="Heading2"/>
+      </w:pPr>
+      <w:r>
+        <w:rPr>
+          <w:rStyle w:val="VerbatimChar"/>
+        </w:rPr>
+        <w:t xml:space="preserve">a_bev65um</w:t>
+      </w:r>
+    </w:p>
+    <w:p>
+      <w:pPr>
+        <w:pStyle w:val="Compact"/>
+        <w:numPr>
+          <w:ilvl w:val="0"/>
+          <w:numId w:val="1042"/>
+        </w:numPr>
+      </w:pPr>
+      <w:r>
+        <w:t xml:space="preserve">official INKAR indicator:</w:t>
+      </w:r>
+      <w:r>
+        <w:t xml:space="preserve"> </w:t>
+      </w:r>
+      <w:r>
+        <w:rPr>
+          <w:rStyle w:val="VerbatimChar"/>
+        </w:rPr>
+        <w:t xml:space="preserve">Einwohner 65 Jahre und älter</w:t>
+      </w:r>
+    </w:p>
+    <w:p>
+      <w:pPr>
+        <w:pStyle w:val="Compact"/>
+        <w:numPr>
+          <w:ilvl w:val="0"/>
+          <w:numId w:val="1042"/>
+        </w:numPr>
+      </w:pPr>
+      <w:r>
+        <w:t xml:space="preserve">project label:</w:t>
+      </w:r>
+      <w:r>
+        <w:t xml:space="preserve"> </w:t>
+      </w:r>
+      <w:r>
+        <w:rPr>
+          <w:rStyle w:val="VerbatimChar"/>
+        </w:rPr>
+        <w:t xml:space="preserve">share_age_65plus</w:t>
+      </w:r>
+    </w:p>
+    <w:p>
+      <w:pPr>
+        <w:pStyle w:val="Compact"/>
+        <w:numPr>
+          <w:ilvl w:val="0"/>
+          <w:numId w:val="1042"/>
+        </w:numPr>
+      </w:pPr>
+      <w:r>
+        <w:t xml:space="preserve">nationwide AGS coverage: about</w:t>
+      </w:r>
+      <w:r>
+        <w:t xml:space="preserve"> </w:t>
+      </w:r>
+      <w:r>
+        <w:rPr>
+          <w:rStyle w:val="VerbatimChar"/>
+        </w:rPr>
+        <w:t xml:space="preserve">98.2%</w:t>
+      </w:r>
+    </w:p>
+    <w:p>
+      <w:pPr>
+        <w:pStyle w:val="Compact"/>
+        <w:numPr>
+          <w:ilvl w:val="0"/>
+          <w:numId w:val="1042"/>
+        </w:numPr>
+      </w:pPr>
+      <w:r>
+        <w:t xml:space="preserve">why it belongs in a nationwide shortlist: ageing is a core vulnerability dimension and this indicator has both conceptual relevance and very strong coverage</w:t>
+      </w:r>
+    </w:p>
+    <w:bookmarkEnd w:id="44"/>
+    <w:bookmarkStart w:id="45" w:name="a_bev75um-1"/>
+    <w:p>
+      <w:pPr>
+        <w:pStyle w:val="Heading2"/>
+      </w:pPr>
+      <w:r>
+        <w:rPr>
+          <w:rStyle w:val="VerbatimChar"/>
+        </w:rPr>
+        <w:t xml:space="preserve">a_bev75um</w:t>
+      </w:r>
+    </w:p>
+    <w:p>
+      <w:pPr>
+        <w:pStyle w:val="Compact"/>
+        <w:numPr>
+          <w:ilvl w:val="0"/>
+          <w:numId w:val="1043"/>
+        </w:numPr>
+      </w:pPr>
+      <w:r>
+        <w:t xml:space="preserve">official INKAR indicator:</w:t>
+      </w:r>
+      <w:r>
+        <w:t xml:space="preserve"> </w:t>
+      </w:r>
+      <w:r>
+        <w:rPr>
+          <w:rStyle w:val="VerbatimChar"/>
+        </w:rPr>
+        <w:t xml:space="preserve">Einwohner 75 Jahre und älter</w:t>
+      </w:r>
+    </w:p>
+    <w:p>
+      <w:pPr>
+        <w:pStyle w:val="Compact"/>
+        <w:numPr>
+          <w:ilvl w:val="0"/>
+          <w:numId w:val="1043"/>
+        </w:numPr>
+      </w:pPr>
+      <w:r>
+        <w:t xml:space="preserve">project label:</w:t>
+      </w:r>
+      <w:r>
+        <w:t xml:space="preserve"> </w:t>
+      </w:r>
+      <w:r>
+        <w:rPr>
+          <w:rStyle w:val="VerbatimChar"/>
+        </w:rPr>
+        <w:t xml:space="preserve">share_age_75plus</w:t>
+      </w:r>
+    </w:p>
+    <w:p>
+      <w:pPr>
+        <w:pStyle w:val="Compact"/>
+        <w:numPr>
+          <w:ilvl w:val="0"/>
+          <w:numId w:val="1043"/>
+        </w:numPr>
+      </w:pPr>
+      <w:r>
+        <w:t xml:space="preserve">nationwide AGS coverage: about</w:t>
+      </w:r>
+      <w:r>
+        <w:t xml:space="preserve"> </w:t>
+      </w:r>
+      <w:r>
+        <w:rPr>
+          <w:rStyle w:val="VerbatimChar"/>
+        </w:rPr>
+        <w:t xml:space="preserve">98.2%</w:t>
+      </w:r>
+    </w:p>
+    <w:p>
+      <w:pPr>
+        <w:pStyle w:val="Compact"/>
+        <w:numPr>
+          <w:ilvl w:val="0"/>
+          <w:numId w:val="1043"/>
+        </w:numPr>
+      </w:pPr>
+      <w:r>
+        <w:t xml:space="preserve">why it belongs in a nationwide shortlist: captures a more sensitive high-age population group and remains widely available nationwide</w:t>
+      </w:r>
+    </w:p>
+    <w:bookmarkEnd w:id="45"/>
+    <w:bookmarkStart w:id="46" w:name="q_abhg_alt-1"/>
+    <w:p>
+      <w:pPr>
+        <w:pStyle w:val="Heading2"/>
+      </w:pPr>
+      <w:r>
+        <w:rPr>
+          <w:rStyle w:val="VerbatimChar"/>
+        </w:rPr>
+        <w:t xml:space="preserve">q_abhg_alt</w:t>
+      </w:r>
+    </w:p>
+    <w:p>
+      <w:pPr>
+        <w:pStyle w:val="Compact"/>
+        <w:numPr>
+          <w:ilvl w:val="0"/>
+          <w:numId w:val="1044"/>
+        </w:numPr>
+      </w:pPr>
+      <w:r>
+        <w:t xml:space="preserve">official INKAR indicator:</w:t>
+      </w:r>
+      <w:r>
+        <w:t xml:space="preserve"> </w:t>
+      </w:r>
+      <w:r>
+        <w:rPr>
+          <w:rStyle w:val="VerbatimChar"/>
+        </w:rPr>
+        <w:t xml:space="preserve">Abhängigenquote Alte</w:t>
+      </w:r>
+    </w:p>
+    <w:p>
+      <w:pPr>
+        <w:pStyle w:val="Compact"/>
+        <w:numPr>
+          <w:ilvl w:val="0"/>
+          <w:numId w:val="1044"/>
+        </w:numPr>
+      </w:pPr>
+      <w:r>
+        <w:t xml:space="preserve">project label:</w:t>
+      </w:r>
+      <w:r>
+        <w:t xml:space="preserve"> </w:t>
+      </w:r>
+      <w:r>
+        <w:rPr>
+          <w:rStyle w:val="VerbatimChar"/>
+        </w:rPr>
+        <w:t xml:space="preserve">old_age_dependency</w:t>
+      </w:r>
+    </w:p>
+    <w:p>
+      <w:pPr>
+        <w:pStyle w:val="Compact"/>
+        <w:numPr>
+          <w:ilvl w:val="0"/>
+          <w:numId w:val="1044"/>
+        </w:numPr>
+      </w:pPr>
+      <w:r>
+        <w:t xml:space="preserve">nationwide AGS coverage: about</w:t>
+      </w:r>
+      <w:r>
+        <w:t xml:space="preserve"> </w:t>
+      </w:r>
+      <w:r>
+        <w:rPr>
+          <w:rStyle w:val="VerbatimChar"/>
+        </w:rPr>
+        <w:t xml:space="preserve">98.2%</w:t>
+      </w:r>
+    </w:p>
+    <w:p>
+      <w:pPr>
+        <w:pStyle w:val="Compact"/>
+        <w:numPr>
+          <w:ilvl w:val="0"/>
+          <w:numId w:val="1044"/>
+        </w:numPr>
+      </w:pPr>
+      <w:r>
+        <w:t xml:space="preserve">why it belongs in a nationwide shortlist: adds a structural ageing burden dimension and has strong empirical availability</w:t>
+      </w:r>
+    </w:p>
+    <w:bookmarkEnd w:id="46"/>
+    <w:bookmarkStart w:id="47" w:name="q_hh1-1"/>
+    <w:p>
+      <w:pPr>
+        <w:pStyle w:val="Heading2"/>
+      </w:pPr>
+      <w:r>
+        <w:rPr>
+          <w:rStyle w:val="VerbatimChar"/>
+        </w:rPr>
+        <w:t xml:space="preserve">q_HH1</w:t>
+      </w:r>
+    </w:p>
+    <w:p>
+      <w:pPr>
+        <w:pStyle w:val="Compact"/>
+        <w:numPr>
+          <w:ilvl w:val="0"/>
+          <w:numId w:val="1045"/>
+        </w:numPr>
+      </w:pPr>
+      <w:r>
+        <w:t xml:space="preserve">official INKAR indicator:</w:t>
+      </w:r>
+      <w:r>
+        <w:t xml:space="preserve"> </w:t>
+      </w:r>
+      <w:r>
+        <w:rPr>
+          <w:rStyle w:val="VerbatimChar"/>
+        </w:rPr>
+        <w:t xml:space="preserve">Einpersonenhaushalte</w:t>
+      </w:r>
+    </w:p>
+    <w:p>
+      <w:pPr>
+        <w:pStyle w:val="Compact"/>
+        <w:numPr>
+          <w:ilvl w:val="0"/>
+          <w:numId w:val="1045"/>
+        </w:numPr>
+      </w:pPr>
+      <w:r>
+        <w:t xml:space="preserve">project label:</w:t>
+      </w:r>
+      <w:r>
+        <w:t xml:space="preserve"> </w:t>
+      </w:r>
+      <w:r>
+        <w:rPr>
+          <w:rStyle w:val="VerbatimChar"/>
+        </w:rPr>
+        <w:t xml:space="preserve">share_single_households</w:t>
+      </w:r>
+    </w:p>
+    <w:p>
+      <w:pPr>
+        <w:pStyle w:val="Compact"/>
+        <w:numPr>
+          <w:ilvl w:val="0"/>
+          <w:numId w:val="1045"/>
+        </w:numPr>
+      </w:pPr>
+      <w:r>
+        <w:t xml:space="preserve">nationwide AGS coverage: about</w:t>
+      </w:r>
+      <w:r>
+        <w:t xml:space="preserve"> </w:t>
+      </w:r>
+      <w:r>
+        <w:rPr>
+          <w:rStyle w:val="VerbatimChar"/>
+        </w:rPr>
+        <w:t xml:space="preserve">98.2%</w:t>
+      </w:r>
+    </w:p>
+    <w:p>
+      <w:pPr>
+        <w:pStyle w:val="Compact"/>
+        <w:numPr>
+          <w:ilvl w:val="0"/>
+          <w:numId w:val="1045"/>
+        </w:numPr>
+      </w:pPr>
+      <w:r>
+        <w:t xml:space="preserve">why it belongs in a nationwide shortlist: one of the most interpretable household-structure proxies and more robust than several alternative social-structure variables</w:t>
+      </w:r>
+    </w:p>
+    <w:bookmarkEnd w:id="47"/>
+    <w:bookmarkStart w:id="48" w:name="m_oev20_dist-1"/>
+    <w:p>
+      <w:pPr>
+        <w:pStyle w:val="Heading2"/>
+      </w:pPr>
+      <w:r>
+        <w:rPr>
+          <w:rStyle w:val="VerbatimChar"/>
+        </w:rPr>
+        <w:t xml:space="preserve">m_OEV20_DIST</w:t>
+      </w:r>
+    </w:p>
+    <w:p>
+      <w:pPr>
+        <w:pStyle w:val="Compact"/>
+        <w:numPr>
+          <w:ilvl w:val="0"/>
+          <w:numId w:val="1046"/>
+        </w:numPr>
+      </w:pPr>
+      <w:r>
+        <w:t xml:space="preserve">official INKAR indicator:</w:t>
+      </w:r>
+      <w:r>
+        <w:t xml:space="preserve"> </w:t>
+      </w:r>
+      <w:r>
+        <w:rPr>
+          <w:rStyle w:val="VerbatimChar"/>
+        </w:rPr>
+        <w:t xml:space="preserve">Entfernung zur ÖV Haltestelle</w:t>
+      </w:r>
+    </w:p>
+    <w:p>
+      <w:pPr>
+        <w:pStyle w:val="Compact"/>
+        <w:numPr>
+          <w:ilvl w:val="0"/>
+          <w:numId w:val="1046"/>
+        </w:numPr>
+      </w:pPr>
+      <w:r>
+        <w:t xml:space="preserve">project label:</w:t>
+      </w:r>
+      <w:r>
+        <w:t xml:space="preserve"> </w:t>
+      </w:r>
+      <w:r>
+        <w:rPr>
+          <w:rStyle w:val="VerbatimChar"/>
+        </w:rPr>
+        <w:t xml:space="preserve">dist_public_transport_m</w:t>
+      </w:r>
+    </w:p>
+    <w:p>
+      <w:pPr>
+        <w:pStyle w:val="Compact"/>
+        <w:numPr>
+          <w:ilvl w:val="0"/>
+          <w:numId w:val="1046"/>
+        </w:numPr>
+      </w:pPr>
+      <w:r>
+        <w:t xml:space="preserve">nationwide AGS coverage: about</w:t>
+      </w:r>
+      <w:r>
+        <w:t xml:space="preserve"> </w:t>
+      </w:r>
+      <w:r>
+        <w:rPr>
+          <w:rStyle w:val="VerbatimChar"/>
+        </w:rPr>
+        <w:t xml:space="preserve">98.8%</w:t>
+      </w:r>
+    </w:p>
+    <w:p>
+      <w:pPr>
+        <w:pStyle w:val="Compact"/>
+        <w:numPr>
+          <w:ilvl w:val="0"/>
+          <w:numId w:val="1046"/>
+        </w:numPr>
+      </w:pPr>
+      <w:r>
+        <w:t xml:space="preserve">why it belongs in a nationwide shortlist: gives a practical accessibility dimension with very high availability and clear relevance for mobility and service access</w:t>
+      </w:r>
+    </w:p>
+    <w:bookmarkEnd w:id="48"/>
+    <w:bookmarkStart w:id="49" w:name="m_q07_ha_dist-1"/>
+    <w:p>
+      <w:pPr>
+        <w:pStyle w:val="Heading2"/>
+      </w:pPr>
+      <w:r>
+        <w:rPr>
+          <w:rStyle w:val="VerbatimChar"/>
+        </w:rPr>
+        <w:t xml:space="preserve">m_Q07_HA_DIST</w:t>
+      </w:r>
+    </w:p>
+    <w:p>
+      <w:pPr>
+        <w:pStyle w:val="Compact"/>
+        <w:numPr>
+          <w:ilvl w:val="0"/>
+          <w:numId w:val="1047"/>
+        </w:numPr>
+      </w:pPr>
+      <w:r>
+        <w:t xml:space="preserve">official INKAR indicator:</w:t>
+      </w:r>
+      <w:r>
+        <w:t xml:space="preserve"> </w:t>
+      </w:r>
+      <w:r>
+        <w:rPr>
+          <w:rStyle w:val="VerbatimChar"/>
+        </w:rPr>
+        <w:t xml:space="preserve">Entfernung zum Hausarzt</w:t>
+      </w:r>
+    </w:p>
+    <w:p>
+      <w:pPr>
+        <w:pStyle w:val="Compact"/>
+        <w:numPr>
+          <w:ilvl w:val="0"/>
+          <w:numId w:val="1047"/>
+        </w:numPr>
+      </w:pPr>
+      <w:r>
+        <w:t xml:space="preserve">project label:</w:t>
+      </w:r>
+      <w:r>
+        <w:t xml:space="preserve"> </w:t>
+      </w:r>
+      <w:r>
+        <w:rPr>
+          <w:rStyle w:val="VerbatimChar"/>
+        </w:rPr>
+        <w:t xml:space="preserve">dist_gp_m</w:t>
+      </w:r>
+    </w:p>
+    <w:p>
+      <w:pPr>
+        <w:pStyle w:val="Compact"/>
+        <w:numPr>
+          <w:ilvl w:val="0"/>
+          <w:numId w:val="1047"/>
+        </w:numPr>
+      </w:pPr>
+      <w:r>
+        <w:t xml:space="preserve">nationwide AGS coverage: about</w:t>
+      </w:r>
+      <w:r>
+        <w:t xml:space="preserve"> </w:t>
+      </w:r>
+      <w:r>
+        <w:rPr>
+          <w:rStyle w:val="VerbatimChar"/>
+        </w:rPr>
+        <w:t xml:space="preserve">98.9%</w:t>
+      </w:r>
+    </w:p>
+    <w:p>
+      <w:pPr>
+        <w:pStyle w:val="Compact"/>
+        <w:numPr>
+          <w:ilvl w:val="0"/>
+          <w:numId w:val="1047"/>
+        </w:numPr>
+      </w:pPr>
+      <w:r>
+        <w:t xml:space="preserve">why it belongs in a nationwide shortlist: strong accessibility and health-services proxy with almost complete nationwide municipality coverage</w:t>
+      </w:r>
+    </w:p>
+    <w:bookmarkEnd w:id="49"/>
+    <w:bookmarkStart w:id="50" w:name="m_q01_apo_dist-1"/>
+    <w:p>
+      <w:pPr>
+        <w:pStyle w:val="Heading2"/>
+      </w:pPr>
+      <w:r>
+        <w:rPr>
+          <w:rStyle w:val="VerbatimChar"/>
+        </w:rPr>
+        <w:t xml:space="preserve">m_Q01_APO_DIST</w:t>
+      </w:r>
+    </w:p>
+    <w:p>
+      <w:pPr>
+        <w:pStyle w:val="Compact"/>
+        <w:numPr>
+          <w:ilvl w:val="0"/>
+          <w:numId w:val="1048"/>
+        </w:numPr>
+      </w:pPr>
+      <w:r>
+        <w:t xml:space="preserve">official INKAR indicator:</w:t>
+      </w:r>
+      <w:r>
+        <w:t xml:space="preserve"> </w:t>
+      </w:r>
+      <w:r>
+        <w:rPr>
+          <w:rStyle w:val="VerbatimChar"/>
+        </w:rPr>
+        <w:t xml:space="preserve">Entfernung zur Apotheke</w:t>
+      </w:r>
+    </w:p>
+    <w:p>
+      <w:pPr>
+        <w:pStyle w:val="Compact"/>
+        <w:numPr>
+          <w:ilvl w:val="0"/>
+          <w:numId w:val="1048"/>
+        </w:numPr>
+      </w:pPr>
+      <w:r>
+        <w:t xml:space="preserve">project label:</w:t>
+      </w:r>
+      <w:r>
+        <w:t xml:space="preserve"> </w:t>
+      </w:r>
+      <w:r>
+        <w:rPr>
+          <w:rStyle w:val="VerbatimChar"/>
+        </w:rPr>
+        <w:t xml:space="preserve">dist_pharmacy_m</w:t>
+      </w:r>
+    </w:p>
+    <w:p>
+      <w:pPr>
+        <w:pStyle w:val="Compact"/>
+        <w:numPr>
+          <w:ilvl w:val="0"/>
+          <w:numId w:val="1048"/>
+        </w:numPr>
+      </w:pPr>
+      <w:r>
+        <w:t xml:space="preserve">nationwide AGS coverage: about</w:t>
+      </w:r>
+      <w:r>
+        <w:t xml:space="preserve"> </w:t>
+      </w:r>
+      <w:r>
+        <w:rPr>
+          <w:rStyle w:val="VerbatimChar"/>
+        </w:rPr>
+        <w:t xml:space="preserve">98.9%</w:t>
+      </w:r>
+    </w:p>
+    <w:p>
+      <w:pPr>
+        <w:pStyle w:val="Compact"/>
+        <w:numPr>
+          <w:ilvl w:val="0"/>
+          <w:numId w:val="1048"/>
+        </w:numPr>
+      </w:pPr>
+      <w:r>
+        <w:t xml:space="preserve">why it belongs in a nationwide shortlist: complements GP access and adds a practical health-infrastructure dimension with excellent coverage</w:t>
+      </w:r>
+    </w:p>
+    <w:p>
+      <w:pPr>
+        <w:pStyle w:val="FirstParagraph"/>
+      </w:pPr>
+      <w:r>
+        <w:t xml:space="preserve">Short interpretation:</w:t>
+      </w:r>
+    </w:p>
+    <w:p>
+      <w:pPr>
+        <w:pStyle w:val="Compact"/>
+        <w:numPr>
+          <w:ilvl w:val="0"/>
+          <w:numId w:val="1049"/>
+        </w:numPr>
+      </w:pPr>
+      <w:r>
+        <w:t xml:space="preserve">this shortlist is currently the best compromise between nationwide data availability and substantive vulnerability relevance</w:t>
+      </w:r>
+    </w:p>
+    <w:p>
+      <w:pPr>
+        <w:pStyle w:val="Compact"/>
+        <w:numPr>
+          <w:ilvl w:val="0"/>
+          <w:numId w:val="1049"/>
+        </w:numPr>
+      </w:pPr>
+      <w:r>
+        <w:t xml:space="preserve">it is much stronger conceptually than a shortlist based only on fully complete variables</w:t>
+      </w:r>
+    </w:p>
+    <w:p>
+      <w:pPr>
+        <w:pStyle w:val="Compact"/>
+        <w:numPr>
+          <w:ilvl w:val="0"/>
+          <w:numId w:val="1049"/>
+        </w:numPr>
+      </w:pPr>
+      <w:r>
+        <w:t xml:space="preserve">it is also a better basis for national scaling than the first wide PCA variable pool, because it reduces redundancy and structural overreach</w:t>
+      </w:r>
+    </w:p>
+    <w:bookmarkEnd w:id="50"/>
+    <w:bookmarkEnd w:id="51"/>
+    <w:bookmarkStart w:id="63" w:name="Xd0139b5fe3c0fa8cc431e96acc05c5c0f4ec2b7"/>
+    <w:p>
+      <w:pPr>
+        <w:pStyle w:val="Heading1"/>
+      </w:pPr>
+      <w:r>
+        <w:t xml:space="preserve">10. Excluded variables</w:t>
+      </w:r>
+    </w:p>
+    <w:bookmarkStart w:id="52" w:name="q_bev_fl"/>
     <w:p>
       <w:pPr>
         <w:pStyle w:val="Heading2"/>
@@ -3599,7 +4849,7 @@
         <w:pStyle w:val="Compact"/>
         <w:numPr>
           <w:ilvl w:val="0"/>
-          <w:numId w:val="1035"/>
+          <w:numId w:val="1050"/>
         </w:numPr>
       </w:pPr>
       <w:r>
@@ -3620,7 +4870,7 @@
         <w:pStyle w:val="Compact"/>
         <w:numPr>
           <w:ilvl w:val="0"/>
-          <w:numId w:val="1035"/>
+          <w:numId w:val="1050"/>
         </w:numPr>
       </w:pPr>
       <w:r>
@@ -3641,7 +4891,7 @@
         <w:pStyle w:val="Compact"/>
         <w:numPr>
           <w:ilvl w:val="0"/>
-          <w:numId w:val="1035"/>
+          <w:numId w:val="1050"/>
         </w:numPr>
       </w:pPr>
       <w:r>
@@ -3653,7 +4903,7 @@
         <w:pStyle w:val="Compact"/>
         <w:numPr>
           <w:ilvl w:val="0"/>
-          <w:numId w:val="1035"/>
+          <w:numId w:val="1050"/>
         </w:numPr>
       </w:pPr>
       <w:r>
@@ -3665,15 +4915,15 @@
         <w:pStyle w:val="Compact"/>
         <w:numPr>
           <w:ilvl w:val="0"/>
-          <w:numId w:val="1035"/>
+          <w:numId w:val="1050"/>
         </w:numPr>
       </w:pPr>
       <w:r>
         <w:t xml:space="preserve">reason for exclusion: treated as contextual variable rather than vulnerability indicator</w:t>
       </w:r>
     </w:p>
-    <w:bookmarkEnd w:id="38"/>
-    <w:bookmarkStart w:id="39" w:name="q_bevsva_qkm"/>
+    <w:bookmarkEnd w:id="52"/>
+    <w:bookmarkStart w:id="53" w:name="q_bevsva_qkm"/>
     <w:p>
       <w:pPr>
         <w:pStyle w:val="Heading2"/>
@@ -3690,7 +4940,7 @@
         <w:pStyle w:val="Compact"/>
         <w:numPr>
           <w:ilvl w:val="0"/>
-          <w:numId w:val="1036"/>
+          <w:numId w:val="1051"/>
         </w:numPr>
       </w:pPr>
       <w:r>
@@ -3711,7 +4961,7 @@
         <w:pStyle w:val="Compact"/>
         <w:numPr>
           <w:ilvl w:val="0"/>
-          <w:numId w:val="1036"/>
+          <w:numId w:val="1051"/>
         </w:numPr>
       </w:pPr>
       <w:r>
@@ -3732,7 +4982,7 @@
         <w:pStyle w:val="Compact"/>
         <w:numPr>
           <w:ilvl w:val="0"/>
-          <w:numId w:val="1036"/>
+          <w:numId w:val="1051"/>
         </w:numPr>
       </w:pPr>
       <w:r>
@@ -3744,7 +4994,7 @@
         <w:pStyle w:val="Compact"/>
         <w:numPr>
           <w:ilvl w:val="0"/>
-          <w:numId w:val="1036"/>
+          <w:numId w:val="1051"/>
         </w:numPr>
       </w:pPr>
       <w:r>
@@ -3756,15 +5006,15 @@
         <w:pStyle w:val="Compact"/>
         <w:numPr>
           <w:ilvl w:val="0"/>
-          <w:numId w:val="1036"/>
+          <w:numId w:val="1051"/>
         </w:numPr>
       </w:pPr>
       <w:r>
         <w:t xml:space="preserve">reason for exclusion: structural indicator</w:t>
       </w:r>
     </w:p>
-    <w:bookmarkEnd w:id="39"/>
-    <w:bookmarkStart w:id="40" w:name="q_gewst_bev"/>
+    <w:bookmarkEnd w:id="53"/>
+    <w:bookmarkStart w:id="54" w:name="q_gewst_bev"/>
     <w:p>
       <w:pPr>
         <w:pStyle w:val="Heading2"/>
@@ -3781,7 +5031,7 @@
         <w:pStyle w:val="Compact"/>
         <w:numPr>
           <w:ilvl w:val="0"/>
-          <w:numId w:val="1037"/>
+          <w:numId w:val="1052"/>
         </w:numPr>
       </w:pPr>
       <w:r>
@@ -3802,7 +5052,7 @@
         <w:pStyle w:val="Compact"/>
         <w:numPr>
           <w:ilvl w:val="0"/>
-          <w:numId w:val="1037"/>
+          <w:numId w:val="1052"/>
         </w:numPr>
       </w:pPr>
       <w:r>
@@ -3823,7 +5073,7 @@
         <w:pStyle w:val="Compact"/>
         <w:numPr>
           <w:ilvl w:val="0"/>
-          <w:numId w:val="1037"/>
+          <w:numId w:val="1052"/>
         </w:numPr>
       </w:pPr>
       <w:r>
@@ -3835,7 +5085,7 @@
         <w:pStyle w:val="Compact"/>
         <w:numPr>
           <w:ilvl w:val="0"/>
-          <w:numId w:val="1037"/>
+          <w:numId w:val="1052"/>
         </w:numPr>
       </w:pPr>
       <w:r>
@@ -3847,15 +5097,15 @@
         <w:pStyle w:val="Compact"/>
         <w:numPr>
           <w:ilvl w:val="0"/>
-          <w:numId w:val="1037"/>
+          <w:numId w:val="1052"/>
         </w:numPr>
       </w:pPr>
       <w:r>
         <w:t xml:space="preserve">reason for exclusion: not household-level vulnerability</w:t>
       </w:r>
     </w:p>
-    <w:bookmarkEnd w:id="40"/>
-    <w:bookmarkStart w:id="41" w:name="d_steuereinnahme"/>
+    <w:bookmarkEnd w:id="54"/>
+    <w:bookmarkStart w:id="55" w:name="d_steuereinnahme"/>
     <w:p>
       <w:pPr>
         <w:pStyle w:val="Heading2"/>
@@ -3872,7 +5122,7 @@
         <w:pStyle w:val="Compact"/>
         <w:numPr>
           <w:ilvl w:val="0"/>
-          <w:numId w:val="1038"/>
+          <w:numId w:val="1053"/>
         </w:numPr>
       </w:pPr>
       <w:r>
@@ -3893,7 +5143,7 @@
         <w:pStyle w:val="Compact"/>
         <w:numPr>
           <w:ilvl w:val="0"/>
-          <w:numId w:val="1038"/>
+          <w:numId w:val="1053"/>
         </w:numPr>
       </w:pPr>
       <w:r>
@@ -3914,7 +5164,7 @@
         <w:pStyle w:val="Compact"/>
         <w:numPr>
           <w:ilvl w:val="0"/>
-          <w:numId w:val="1038"/>
+          <w:numId w:val="1053"/>
         </w:numPr>
       </w:pPr>
       <w:r>
@@ -3926,7 +5176,7 @@
         <w:pStyle w:val="Compact"/>
         <w:numPr>
           <w:ilvl w:val="0"/>
-          <w:numId w:val="1038"/>
+          <w:numId w:val="1053"/>
         </w:numPr>
       </w:pPr>
       <w:r>
@@ -3938,15 +5188,15 @@
         <w:pStyle w:val="Compact"/>
         <w:numPr>
           <w:ilvl w:val="0"/>
-          <w:numId w:val="1038"/>
+          <w:numId w:val="1053"/>
         </w:numPr>
       </w:pPr>
       <w:r>
         <w:t xml:space="preserve">reason for exclusion: structural indicator</w:t>
       </w:r>
     </w:p>
-    <w:bookmarkEnd w:id="41"/>
-    <w:bookmarkStart w:id="42" w:name="a_hheink_mittel"/>
+    <w:bookmarkEnd w:id="55"/>
+    <w:bookmarkStart w:id="56" w:name="a_hheink_mittel"/>
     <w:p>
       <w:pPr>
         <w:pStyle w:val="Heading2"/>
@@ -3963,7 +5213,7 @@
         <w:pStyle w:val="Compact"/>
         <w:numPr>
           <w:ilvl w:val="0"/>
-          <w:numId w:val="1039"/>
+          <w:numId w:val="1054"/>
         </w:numPr>
       </w:pPr>
       <w:r>
@@ -3984,7 +5234,7 @@
         <w:pStyle w:val="Compact"/>
         <w:numPr>
           <w:ilvl w:val="0"/>
-          <w:numId w:val="1039"/>
+          <w:numId w:val="1054"/>
         </w:numPr>
       </w:pPr>
       <w:r>
@@ -4005,7 +5255,7 @@
         <w:pStyle w:val="Compact"/>
         <w:numPr>
           <w:ilvl w:val="0"/>
-          <w:numId w:val="1039"/>
+          <w:numId w:val="1054"/>
         </w:numPr>
       </w:pPr>
       <w:r>
@@ -4017,7 +5267,7 @@
         <w:pStyle w:val="Compact"/>
         <w:numPr>
           <w:ilvl w:val="0"/>
-          <w:numId w:val="1039"/>
+          <w:numId w:val="1054"/>
         </w:numPr>
       </w:pPr>
       <w:r>
@@ -4029,15 +5279,15 @@
         <w:pStyle w:val="Compact"/>
         <w:numPr>
           <w:ilvl w:val="0"/>
-          <w:numId w:val="1039"/>
+          <w:numId w:val="1054"/>
         </w:numPr>
       </w:pPr>
       <w:r>
         <w:t xml:space="preserve">reason for exclusion: redundancy</w:t>
       </w:r>
     </w:p>
-    <w:bookmarkEnd w:id="42"/>
-    <w:bookmarkStart w:id="43" w:name="a_hheink_hoch"/>
+    <w:bookmarkEnd w:id="56"/>
+    <w:bookmarkStart w:id="57" w:name="a_hheink_hoch"/>
     <w:p>
       <w:pPr>
         <w:pStyle w:val="Heading2"/>
@@ -4054,7 +5304,7 @@
         <w:pStyle w:val="Compact"/>
         <w:numPr>
           <w:ilvl w:val="0"/>
-          <w:numId w:val="1040"/>
+          <w:numId w:val="1055"/>
         </w:numPr>
       </w:pPr>
       <w:r>
@@ -4075,7 +5325,7 @@
         <w:pStyle w:val="Compact"/>
         <w:numPr>
           <w:ilvl w:val="0"/>
-          <w:numId w:val="1040"/>
+          <w:numId w:val="1055"/>
         </w:numPr>
       </w:pPr>
       <w:r>
@@ -4096,7 +5346,7 @@
         <w:pStyle w:val="Compact"/>
         <w:numPr>
           <w:ilvl w:val="0"/>
-          <w:numId w:val="1040"/>
+          <w:numId w:val="1055"/>
         </w:numPr>
       </w:pPr>
       <w:r>
@@ -4108,7 +5358,7 @@
         <w:pStyle w:val="Compact"/>
         <w:numPr>
           <w:ilvl w:val="0"/>
-          <w:numId w:val="1040"/>
+          <w:numId w:val="1055"/>
         </w:numPr>
       </w:pPr>
       <w:r>
@@ -4120,15 +5370,15 @@
         <w:pStyle w:val="Compact"/>
         <w:numPr>
           <w:ilvl w:val="0"/>
-          <w:numId w:val="1040"/>
+          <w:numId w:val="1055"/>
         </w:numPr>
       </w:pPr>
       <w:r>
         <w:t xml:space="preserve">reason for exclusion: redundancy</w:t>
       </w:r>
     </w:p>
-    <w:bookmarkEnd w:id="43"/>
-    <w:bookmarkStart w:id="44" w:name="q_stud"/>
+    <w:bookmarkEnd w:id="57"/>
+    <w:bookmarkStart w:id="58" w:name="q_stud"/>
     <w:p>
       <w:pPr>
         <w:pStyle w:val="Heading2"/>
@@ -4145,7 +5395,7 @@
         <w:pStyle w:val="Compact"/>
         <w:numPr>
           <w:ilvl w:val="0"/>
-          <w:numId w:val="1041"/>
+          <w:numId w:val="1056"/>
         </w:numPr>
       </w:pPr>
       <w:r>
@@ -4166,7 +5416,7 @@
         <w:pStyle w:val="Compact"/>
         <w:numPr>
           <w:ilvl w:val="0"/>
-          <w:numId w:val="1041"/>
+          <w:numId w:val="1056"/>
         </w:numPr>
       </w:pPr>
       <w:r>
@@ -4187,7 +5437,7 @@
         <w:pStyle w:val="Compact"/>
         <w:numPr>
           <w:ilvl w:val="0"/>
-          <w:numId w:val="1041"/>
+          <w:numId w:val="1056"/>
         </w:numPr>
       </w:pPr>
       <w:r>
@@ -4199,7 +5449,7 @@
         <w:pStyle w:val="Compact"/>
         <w:numPr>
           <w:ilvl w:val="0"/>
-          <w:numId w:val="1041"/>
+          <w:numId w:val="1056"/>
         </w:numPr>
       </w:pPr>
       <w:r>
@@ -4211,15 +5461,15 @@
         <w:pStyle w:val="Compact"/>
         <w:numPr>
           <w:ilvl w:val="0"/>
-          <w:numId w:val="1041"/>
+          <w:numId w:val="1056"/>
         </w:numPr>
       </w:pPr>
       <w:r>
         <w:t xml:space="preserve">reason for exclusion: ambiguous indicator</w:t>
       </w:r>
     </w:p>
-    <w:bookmarkEnd w:id="44"/>
-    <w:bookmarkStart w:id="45" w:name="q_stud_1825"/>
+    <w:bookmarkEnd w:id="58"/>
+    <w:bookmarkStart w:id="59" w:name="q_stud_1825"/>
     <w:p>
       <w:pPr>
         <w:pStyle w:val="Heading2"/>
@@ -4236,7 +5486,7 @@
         <w:pStyle w:val="Compact"/>
         <w:numPr>
           <w:ilvl w:val="0"/>
-          <w:numId w:val="1042"/>
+          <w:numId w:val="1057"/>
         </w:numPr>
       </w:pPr>
       <w:r>
@@ -4257,7 +5507,7 @@
         <w:pStyle w:val="Compact"/>
         <w:numPr>
           <w:ilvl w:val="0"/>
-          <w:numId w:val="1042"/>
+          <w:numId w:val="1057"/>
         </w:numPr>
       </w:pPr>
       <w:r>
@@ -4278,7 +5528,7 @@
         <w:pStyle w:val="Compact"/>
         <w:numPr>
           <w:ilvl w:val="0"/>
-          <w:numId w:val="1042"/>
+          <w:numId w:val="1057"/>
         </w:numPr>
       </w:pPr>
       <w:r>
@@ -4290,7 +5540,7 @@
         <w:pStyle w:val="Compact"/>
         <w:numPr>
           <w:ilvl w:val="0"/>
-          <w:numId w:val="1042"/>
+          <w:numId w:val="1057"/>
         </w:numPr>
       </w:pPr>
       <w:r>
@@ -4302,15 +5552,15 @@
         <w:pStyle w:val="Compact"/>
         <w:numPr>
           <w:ilvl w:val="0"/>
-          <w:numId w:val="1042"/>
+          <w:numId w:val="1057"/>
         </w:numPr>
       </w:pPr>
       <w:r>
         <w:t xml:space="preserve">reason for exclusion: ambiguous</w:t>
       </w:r>
     </w:p>
-    <w:bookmarkEnd w:id="45"/>
-    <w:bookmarkStart w:id="46" w:name="q_stud_fh"/>
+    <w:bookmarkEnd w:id="59"/>
+    <w:bookmarkStart w:id="60" w:name="q_stud_fh"/>
     <w:p>
       <w:pPr>
         <w:pStyle w:val="Heading2"/>
@@ -4327,7 +5577,7 @@
         <w:pStyle w:val="Compact"/>
         <w:numPr>
           <w:ilvl w:val="0"/>
-          <w:numId w:val="1043"/>
+          <w:numId w:val="1058"/>
         </w:numPr>
       </w:pPr>
       <w:r>
@@ -4348,7 +5598,7 @@
         <w:pStyle w:val="Compact"/>
         <w:numPr>
           <w:ilvl w:val="0"/>
-          <w:numId w:val="1043"/>
+          <w:numId w:val="1058"/>
         </w:numPr>
       </w:pPr>
       <w:r>
@@ -4369,7 +5619,7 @@
         <w:pStyle w:val="Compact"/>
         <w:numPr>
           <w:ilvl w:val="0"/>
-          <w:numId w:val="1043"/>
+          <w:numId w:val="1058"/>
         </w:numPr>
       </w:pPr>
       <w:r>
@@ -4381,7 +5631,7 @@
         <w:pStyle w:val="Compact"/>
         <w:numPr>
           <w:ilvl w:val="0"/>
-          <w:numId w:val="1043"/>
+          <w:numId w:val="1058"/>
         </w:numPr>
       </w:pPr>
       <w:r>
@@ -4393,15 +5643,15 @@
         <w:pStyle w:val="Compact"/>
         <w:numPr>
           <w:ilvl w:val="0"/>
-          <w:numId w:val="1043"/>
+          <w:numId w:val="1058"/>
         </w:numPr>
       </w:pPr>
       <w:r>
         <w:t xml:space="preserve">reason for exclusion: ambiguous</w:t>
       </w:r>
     </w:p>
-    <w:bookmarkEnd w:id="46"/>
-    <w:bookmarkStart w:id="47" w:name="i_wans"/>
+    <w:bookmarkEnd w:id="60"/>
+    <w:bookmarkStart w:id="61" w:name="i_wans"/>
     <w:p>
       <w:pPr>
         <w:pStyle w:val="Heading2"/>
@@ -4418,7 +5668,7 @@
         <w:pStyle w:val="Compact"/>
         <w:numPr>
           <w:ilvl w:val="0"/>
-          <w:numId w:val="1044"/>
+          <w:numId w:val="1059"/>
         </w:numPr>
       </w:pPr>
       <w:r>
@@ -4439,7 +5689,7 @@
         <w:pStyle w:val="Compact"/>
         <w:numPr>
           <w:ilvl w:val="0"/>
-          <w:numId w:val="1044"/>
+          <w:numId w:val="1059"/>
         </w:numPr>
       </w:pPr>
       <w:r>
@@ -4460,7 +5710,7 @@
         <w:pStyle w:val="Compact"/>
         <w:numPr>
           <w:ilvl w:val="0"/>
-          <w:numId w:val="1044"/>
+          <w:numId w:val="1059"/>
         </w:numPr>
       </w:pPr>
       <w:r>
@@ -4472,7 +5722,7 @@
         <w:pStyle w:val="Compact"/>
         <w:numPr>
           <w:ilvl w:val="0"/>
-          <w:numId w:val="1044"/>
+          <w:numId w:val="1059"/>
         </w:numPr>
       </w:pPr>
       <w:r>
@@ -4484,15 +5734,15 @@
         <w:pStyle w:val="Compact"/>
         <w:numPr>
           <w:ilvl w:val="0"/>
-          <w:numId w:val="1044"/>
+          <w:numId w:val="1059"/>
         </w:numPr>
       </w:pPr>
       <w:r>
         <w:t xml:space="preserve">reason for exclusion: indirect indicator</w:t>
       </w:r>
     </w:p>
-    <w:bookmarkEnd w:id="47"/>
-    <w:bookmarkStart w:id="48" w:name="i_saldo_nat"/>
+    <w:bookmarkEnd w:id="61"/>
+    <w:bookmarkStart w:id="62" w:name="i_saldo_nat"/>
     <w:p>
       <w:pPr>
         <w:pStyle w:val="Heading2"/>
@@ -4509,7 +5759,7 @@
         <w:pStyle w:val="Compact"/>
         <w:numPr>
           <w:ilvl w:val="0"/>
-          <w:numId w:val="1045"/>
+          <w:numId w:val="1060"/>
         </w:numPr>
       </w:pPr>
       <w:r>
@@ -4530,7 +5780,7 @@
         <w:pStyle w:val="Compact"/>
         <w:numPr>
           <w:ilvl w:val="0"/>
-          <w:numId w:val="1045"/>
+          <w:numId w:val="1060"/>
         </w:numPr>
       </w:pPr>
       <w:r>
@@ -4551,7 +5801,7 @@
         <w:pStyle w:val="Compact"/>
         <w:numPr>
           <w:ilvl w:val="0"/>
-          <w:numId w:val="1045"/>
+          <w:numId w:val="1060"/>
         </w:numPr>
       </w:pPr>
       <w:r>
@@ -4563,7 +5813,7 @@
         <w:pStyle w:val="Compact"/>
         <w:numPr>
           <w:ilvl w:val="0"/>
-          <w:numId w:val="1045"/>
+          <w:numId w:val="1060"/>
         </w:numPr>
       </w:pPr>
       <w:r>
@@ -4575,22 +5825,22 @@
         <w:pStyle w:val="Compact"/>
         <w:numPr>
           <w:ilvl w:val="0"/>
-          <w:numId w:val="1045"/>
+          <w:numId w:val="1060"/>
         </w:numPr>
       </w:pPr>
       <w:r>
         <w:t xml:space="preserve">reason for exclusion: indirect indicator</w:t>
       </w:r>
     </w:p>
-    <w:bookmarkEnd w:id="48"/>
-    <w:bookmarkEnd w:id="49"/>
-    <w:bookmarkStart w:id="50" w:name="Xa463bddff8736e1336306a817477a8ba6dc5603"/>
+    <w:bookmarkEnd w:id="62"/>
+    <w:bookmarkEnd w:id="63"/>
+    <w:bookmarkStart w:id="64" w:name="Xd5625b152520c29dba748fb694d3b70d59bbfbe"/>
     <w:p>
       <w:pPr>
         <w:pStyle w:val="Heading1"/>
       </w:pPr>
       <w:r>
-        <w:t xml:space="preserve">10. Why the first wide PCA was used at the beginning</w:t>
+        <w:t xml:space="preserve">11. Why the first wide PCA was used at the beginning</w:t>
       </w:r>
     </w:p>
     <w:p>
@@ -4614,7 +5864,7 @@
         <w:pStyle w:val="Compact"/>
         <w:numPr>
           <w:ilvl w:val="0"/>
-          <w:numId w:val="1046"/>
+          <w:numId w:val="1061"/>
         </w:numPr>
       </w:pPr>
       <w:r>
@@ -4626,7 +5876,7 @@
         <w:pStyle w:val="Compact"/>
         <w:numPr>
           <w:ilvl w:val="0"/>
-          <w:numId w:val="1046"/>
+          <w:numId w:val="1061"/>
         </w:numPr>
       </w:pPr>
       <w:r>
@@ -4638,7 +5888,7 @@
         <w:pStyle w:val="Compact"/>
         <w:numPr>
           <w:ilvl w:val="0"/>
-          <w:numId w:val="1046"/>
+          <w:numId w:val="1061"/>
         </w:numPr>
       </w:pPr>
       <w:r>
@@ -4658,7 +5908,7 @@
         <w:pStyle w:val="Compact"/>
         <w:numPr>
           <w:ilvl w:val="0"/>
-          <w:numId w:val="1047"/>
+          <w:numId w:val="1062"/>
         </w:numPr>
       </w:pPr>
       <w:r>
@@ -4685,7 +5935,7 @@
         <w:pStyle w:val="Compact"/>
         <w:numPr>
           <w:ilvl w:val="0"/>
-          <w:numId w:val="1047"/>
+          <w:numId w:val="1062"/>
         </w:numPr>
       </w:pPr>
       <w:r>
@@ -4697,7 +5947,7 @@
         <w:pStyle w:val="Compact"/>
         <w:numPr>
           <w:ilvl w:val="0"/>
-          <w:numId w:val="1047"/>
+          <w:numId w:val="1062"/>
         </w:numPr>
       </w:pPr>
       <w:r>
@@ -4709,7 +5959,7 @@
         <w:pStyle w:val="Compact"/>
         <w:numPr>
           <w:ilvl w:val="0"/>
-          <w:numId w:val="1047"/>
+          <w:numId w:val="1062"/>
         </w:numPr>
       </w:pPr>
       <w:r>
@@ -4736,7 +5986,7 @@
         <w:pStyle w:val="Compact"/>
         <w:numPr>
           <w:ilvl w:val="0"/>
-          <w:numId w:val="1047"/>
+          <w:numId w:val="1062"/>
         </w:numPr>
       </w:pPr>
       <w:r>
@@ -4748,7 +5998,7 @@
         <w:pStyle w:val="Compact"/>
         <w:numPr>
           <w:ilvl w:val="0"/>
-          <w:numId w:val="1047"/>
+          <w:numId w:val="1062"/>
         </w:numPr>
       </w:pPr>
       <w:r>
@@ -4764,14 +6014,14 @@
         <w:t xml:space="preserve">ALG II / SGB II</w:t>
       </w:r>
     </w:p>
-    <w:bookmarkEnd w:id="50"/>
-    <w:bookmarkStart w:id="51" w:name="X55261c88c7da50650627a177eb193b4da38fded"/>
+    <w:bookmarkEnd w:id="64"/>
+    <w:bookmarkStart w:id="65" w:name="Xe4eee072cc8764cb627060369d1818e6f8d3b5a"/>
     <w:p>
       <w:pPr>
         <w:pStyle w:val="Heading1"/>
       </w:pPr>
       <w:r>
-        <w:t xml:space="preserve">11. What I learned from the first wide PCA</w:t>
+        <w:t xml:space="preserve">12. What I learned from the first wide PCA</w:t>
       </w:r>
     </w:p>
     <w:p>
@@ -4795,7 +6045,7 @@
         <w:pStyle w:val="Compact"/>
         <w:numPr>
           <w:ilvl w:val="0"/>
-          <w:numId w:val="1048"/>
+          <w:numId w:val="1063"/>
         </w:numPr>
       </w:pPr>
       <w:r>
@@ -4807,7 +6057,7 @@
         <w:pStyle w:val="Compact"/>
         <w:numPr>
           <w:ilvl w:val="0"/>
-          <w:numId w:val="1048"/>
+          <w:numId w:val="1063"/>
         </w:numPr>
       </w:pPr>
       <w:r>
@@ -4819,7 +6069,7 @@
         <w:pStyle w:val="Compact"/>
         <w:numPr>
           <w:ilvl w:val="0"/>
-          <w:numId w:val="1048"/>
+          <w:numId w:val="1063"/>
         </w:numPr>
       </w:pPr>
       <w:r>
@@ -4839,7 +6089,7 @@
         <w:pStyle w:val="Compact"/>
         <w:numPr>
           <w:ilvl w:val="0"/>
-          <w:numId w:val="1049"/>
+          <w:numId w:val="1064"/>
         </w:numPr>
       </w:pPr>
       <w:r>
@@ -4851,7 +6101,7 @@
         <w:pStyle w:val="Compact"/>
         <w:numPr>
           <w:ilvl w:val="0"/>
-          <w:numId w:val="1049"/>
+          <w:numId w:val="1064"/>
         </w:numPr>
       </w:pPr>
       <w:r>
@@ -4863,21 +6113,21 @@
         <w:pStyle w:val="Compact"/>
         <w:numPr>
           <w:ilvl w:val="0"/>
-          <w:numId w:val="1049"/>
+          <w:numId w:val="1064"/>
         </w:numPr>
       </w:pPr>
       <w:r>
         <w:t xml:space="preserve">the resulting index is harder to defend conceptually in a meeting because the retained components are less transparent substantively</w:t>
       </w:r>
     </w:p>
-    <w:bookmarkEnd w:id="51"/>
-    <w:bookmarkStart w:id="52" w:name="Xc04ec519377293590e8658b145cdf50964d093b"/>
+    <w:bookmarkEnd w:id="65"/>
+    <w:bookmarkStart w:id="66" w:name="X1675e6c62d3e3606e4cdc93f9de05c059b6fd86"/>
     <w:p>
       <w:pPr>
         <w:pStyle w:val="Heading1"/>
       </w:pPr>
       <w:r>
-        <w:t xml:space="preserve">12. What the redesigned PCA now does</w:t>
+        <w:t xml:space="preserve">13. What the redesigned PCA now does</w:t>
       </w:r>
     </w:p>
     <w:p>
@@ -4901,7 +6151,7 @@
         <w:pStyle w:val="Compact"/>
         <w:numPr>
           <w:ilvl w:val="0"/>
-          <w:numId w:val="1050"/>
+          <w:numId w:val="1065"/>
         </w:numPr>
       </w:pPr>
       <w:r>
@@ -4913,7 +6163,7 @@
         <w:pStyle w:val="Compact"/>
         <w:numPr>
           <w:ilvl w:val="0"/>
-          <w:numId w:val="1050"/>
+          <w:numId w:val="1065"/>
         </w:numPr>
       </w:pPr>
       <w:r>
@@ -4925,7 +6175,7 @@
         <w:pStyle w:val="Compact"/>
         <w:numPr>
           <w:ilvl w:val="0"/>
-          <w:numId w:val="1050"/>
+          <w:numId w:val="1065"/>
         </w:numPr>
       </w:pPr>
       <w:r>
@@ -4937,7 +6187,7 @@
         <w:pStyle w:val="Compact"/>
         <w:numPr>
           <w:ilvl w:val="0"/>
-          <w:numId w:val="1050"/>
+          <w:numId w:val="1065"/>
         </w:numPr>
       </w:pPr>
       <w:r>
@@ -4972,7 +6222,7 @@
         <w:pStyle w:val="Compact"/>
         <w:numPr>
           <w:ilvl w:val="0"/>
-          <w:numId w:val="1051"/>
+          <w:numId w:val="1066"/>
         </w:numPr>
       </w:pPr>
       <w:r>
@@ -4984,7 +6234,7 @@
         <w:pStyle w:val="Compact"/>
         <w:numPr>
           <w:ilvl w:val="0"/>
-          <w:numId w:val="1051"/>
+          <w:numId w:val="1066"/>
         </w:numPr>
       </w:pPr>
       <w:r>
@@ -4996,7 +6246,7 @@
         <w:pStyle w:val="Compact"/>
         <w:numPr>
           <w:ilvl w:val="0"/>
-          <w:numId w:val="1051"/>
+          <w:numId w:val="1066"/>
         </w:numPr>
       </w:pPr>
       <w:r>
@@ -5008,7 +6258,7 @@
         <w:pStyle w:val="Compact"/>
         <w:numPr>
           <w:ilvl w:val="0"/>
-          <w:numId w:val="1051"/>
+          <w:numId w:val="1066"/>
         </w:numPr>
       </w:pPr>
       <w:r>
@@ -5028,7 +6278,7 @@
         <w:pStyle w:val="Compact"/>
         <w:numPr>
           <w:ilvl w:val="0"/>
-          <w:numId w:val="1052"/>
+          <w:numId w:val="1067"/>
         </w:numPr>
       </w:pPr>
       <w:r>
@@ -5040,7 +6290,7 @@
         <w:pStyle w:val="Compact"/>
         <w:numPr>
           <w:ilvl w:val="0"/>
-          <w:numId w:val="1052"/>
+          <w:numId w:val="1067"/>
         </w:numPr>
       </w:pPr>
       <w:r>
@@ -5052,7 +6302,7 @@
         <w:pStyle w:val="Compact"/>
         <w:numPr>
           <w:ilvl w:val="0"/>
-          <w:numId w:val="1052"/>
+          <w:numId w:val="1067"/>
         </w:numPr>
       </w:pPr>
       <w:r>
@@ -5064,7 +6314,7 @@
         <w:pStyle w:val="Compact"/>
         <w:numPr>
           <w:ilvl w:val="0"/>
-          <w:numId w:val="1052"/>
+          <w:numId w:val="1067"/>
         </w:numPr>
       </w:pPr>
       <w:r>
@@ -5076,7 +6326,7 @@
         <w:pStyle w:val="Compact"/>
         <w:numPr>
           <w:ilvl w:val="0"/>
-          <w:numId w:val="1052"/>
+          <w:numId w:val="1067"/>
         </w:numPr>
       </w:pPr>
       <w:r>
@@ -5098,14 +6348,14 @@
         <w:t xml:space="preserve">only as robustness check</w:t>
       </w:r>
     </w:p>
-    <w:bookmarkEnd w:id="52"/>
-    <w:bookmarkStart w:id="53" w:name="X261481569d4a824e0ab2d629ad6d49bf7958d1b"/>
+    <w:bookmarkEnd w:id="66"/>
+    <w:bookmarkStart w:id="67" w:name="X5959f5c883b6b9fe3f473125b7fa889cafbd176"/>
     <w:p>
       <w:pPr>
         <w:pStyle w:val="Heading1"/>
       </w:pPr>
       <w:r>
-        <w:t xml:space="preserve">13. What the redesigned PCA says now</w:t>
+        <w:t xml:space="preserve">14. What the redesigned PCA says now</w:t>
       </w:r>
     </w:p>
     <w:p>
@@ -5129,7 +6379,7 @@
         <w:pStyle w:val="Compact"/>
         <w:numPr>
           <w:ilvl w:val="0"/>
-          <w:numId w:val="1053"/>
+          <w:numId w:val="1068"/>
         </w:numPr>
       </w:pPr>
       <w:r>
@@ -5165,7 +6415,7 @@
         <w:pStyle w:val="Compact"/>
         <w:numPr>
           <w:ilvl w:val="0"/>
-          <w:numId w:val="1053"/>
+          <w:numId w:val="1068"/>
         </w:numPr>
       </w:pPr>
       <w:r>
@@ -5201,7 +6451,7 @@
         <w:pStyle w:val="Compact"/>
         <w:numPr>
           <w:ilvl w:val="0"/>
-          <w:numId w:val="1053"/>
+          <w:numId w:val="1068"/>
         </w:numPr>
       </w:pPr>
       <w:r>
@@ -5237,7 +6487,7 @@
         <w:pStyle w:val="Compact"/>
         <w:numPr>
           <w:ilvl w:val="0"/>
-          <w:numId w:val="1053"/>
+          <w:numId w:val="1068"/>
         </w:numPr>
       </w:pPr>
       <w:r>
@@ -5281,7 +6531,7 @@
         <w:pStyle w:val="Compact"/>
         <w:numPr>
           <w:ilvl w:val="0"/>
-          <w:numId w:val="1054"/>
+          <w:numId w:val="1069"/>
         </w:numPr>
       </w:pPr>
       <w:r>
@@ -5314,7 +6564,7 @@
         <w:pStyle w:val="Compact"/>
         <w:numPr>
           <w:ilvl w:val="0"/>
-          <w:numId w:val="1054"/>
+          <w:numId w:val="1069"/>
         </w:numPr>
       </w:pPr>
       <w:r>
@@ -5347,7 +6597,7 @@
         <w:pStyle w:val="Compact"/>
         <w:numPr>
           <w:ilvl w:val="0"/>
-          <w:numId w:val="1054"/>
+          <w:numId w:val="1069"/>
         </w:numPr>
       </w:pPr>
       <w:r>
@@ -5376,7 +6626,7 @@
         <w:pStyle w:val="Compact"/>
         <w:numPr>
           <w:ilvl w:val="0"/>
-          <w:numId w:val="1055"/>
+          <w:numId w:val="1070"/>
         </w:numPr>
       </w:pPr>
       <w:r>
@@ -5388,7 +6638,7 @@
         <w:pStyle w:val="Compact"/>
         <w:numPr>
           <w:ilvl w:val="0"/>
-          <w:numId w:val="1055"/>
+          <w:numId w:val="1070"/>
         </w:numPr>
       </w:pPr>
       <w:r>
@@ -5400,21 +6650,21 @@
         <w:pStyle w:val="Compact"/>
         <w:numPr>
           <w:ilvl w:val="0"/>
-          <w:numId w:val="1055"/>
+          <w:numId w:val="1070"/>
         </w:numPr>
       </w:pPr>
       <w:r>
         <w:t xml:space="preserve">the redesigned index is easier to defend because it is more clearly tied to interpretable vulnerability dimensions</w:t>
       </w:r>
     </w:p>
-    <w:bookmarkEnd w:id="53"/>
-    <w:bookmarkStart w:id="54" w:name="X177d386dceb46a145f0d4a8695d46fe7c35787d"/>
+    <w:bookmarkEnd w:id="67"/>
+    <w:bookmarkStart w:id="68" w:name="X4d85f2d107b652308c21c6f19c4f348849f7d3b"/>
     <w:p>
       <w:pPr>
         <w:pStyle w:val="Heading1"/>
       </w:pPr>
       <w:r>
-        <w:t xml:space="preserve">14. Can the INKAR-based vulnerability framework be scaled up to Germany?</w:t>
+        <w:t xml:space="preserve">15. Can the INKAR-based vulnerability framework be scaled up to Germany?</w:t>
       </w:r>
     </w:p>
     <w:p>
@@ -5438,7 +6688,7 @@
         <w:pStyle w:val="Compact"/>
         <w:numPr>
           <w:ilvl w:val="0"/>
-          <w:numId w:val="1056"/>
+          <w:numId w:val="1071"/>
         </w:numPr>
       </w:pPr>
       <w:r>
@@ -5450,7 +6700,7 @@
         <w:pStyle w:val="Compact"/>
         <w:numPr>
           <w:ilvl w:val="0"/>
-          <w:numId w:val="1056"/>
+          <w:numId w:val="1071"/>
         </w:numPr>
       </w:pPr>
       <w:r>
@@ -5462,7 +6712,7 @@
         <w:pStyle w:val="Compact"/>
         <w:numPr>
           <w:ilvl w:val="0"/>
-          <w:numId w:val="1056"/>
+          <w:numId w:val="1071"/>
         </w:numPr>
       </w:pPr>
       <w:r>
@@ -5498,11 +6748,11 @@
         <w:pStyle w:val="Compact"/>
         <w:numPr>
           <w:ilvl w:val="0"/>
-          <w:numId w:val="1056"/>
-        </w:numPr>
-      </w:pPr>
-      <w:r>
-        <w:t xml:space="preserve">the main socio-economic logic of deprivation, demographic sensitivity, household structure and accessibility can therefore be transferred beyond the Elbe case</w:t>
+          <w:numId w:val="1071"/>
+        </w:numPr>
+      </w:pPr>
+      <w:r>
+        <w:t xml:space="preserve">the proposed nationwide shortlist retains variables that are both substantively meaningful and empirically available at very high AGS-level coverage</w:t>
       </w:r>
     </w:p>
     <w:p>
@@ -5518,7 +6768,7 @@
         <w:pStyle w:val="Compact"/>
         <w:numPr>
           <w:ilvl w:val="0"/>
-          <w:numId w:val="1057"/>
+          <w:numId w:val="1072"/>
         </w:numPr>
       </w:pPr>
       <w:r>
@@ -5530,7 +6780,7 @@
         <w:pStyle w:val="Compact"/>
         <w:numPr>
           <w:ilvl w:val="0"/>
-          <w:numId w:val="1057"/>
+          <w:numId w:val="1072"/>
         </w:numPr>
       </w:pPr>
       <w:r>
@@ -5550,7 +6800,7 @@
         <w:pStyle w:val="Compact"/>
         <w:numPr>
           <w:ilvl w:val="0"/>
-          <w:numId w:val="1058"/>
+          <w:numId w:val="1073"/>
         </w:numPr>
       </w:pPr>
       <w:r>
@@ -5562,7 +6812,7 @@
         <w:pStyle w:val="Compact"/>
         <w:numPr>
           <w:ilvl w:val="0"/>
-          <w:numId w:val="1058"/>
+          <w:numId w:val="1073"/>
         </w:numPr>
       </w:pPr>
       <w:r>
@@ -5574,7 +6824,7 @@
         <w:pStyle w:val="Compact"/>
         <w:numPr>
           <w:ilvl w:val="0"/>
-          <w:numId w:val="1058"/>
+          <w:numId w:val="1073"/>
         </w:numPr>
       </w:pPr>
       <w:r>
@@ -5594,7 +6844,7 @@
         <w:pStyle w:val="Compact"/>
         <w:numPr>
           <w:ilvl w:val="0"/>
-          <w:numId w:val="1059"/>
+          <w:numId w:val="1074"/>
         </w:numPr>
       </w:pPr>
       <w:r>
@@ -5606,21 +6856,21 @@
         <w:pStyle w:val="Compact"/>
         <w:numPr>
           <w:ilvl w:val="0"/>
-          <w:numId w:val="1059"/>
+          <w:numId w:val="1074"/>
         </w:numPr>
       </w:pPr>
       <w:r>
         <w:t xml:space="preserve">the full flood-justice framework is only scalable if the hazard and protection data can also be standardised nationally</w:t>
       </w:r>
     </w:p>
-    <w:bookmarkEnd w:id="54"/>
-    <w:bookmarkStart w:id="55" w:name="Xec6eff5968f4b5e9be22ad38ba1a20660d87e88"/>
+    <w:bookmarkEnd w:id="68"/>
+    <w:bookmarkStart w:id="69" w:name="Xd3a68a12e968350cafb87b32a44e13bc8c3a005"/>
     <w:p>
       <w:pPr>
         <w:pStyle w:val="Heading1"/>
       </w:pPr>
       <w:r>
-        <w:t xml:space="preserve">15. Short meeting message</w:t>
+        <w:t xml:space="preserve">16. Short meeting message</w:t>
       </w:r>
     </w:p>
     <w:p>
@@ -5639,14 +6889,14 @@
         <w:t xml:space="preserve">"The first version used a broad exploratory wide PCA to understand the overall structure of the socio-economic indicator space. The redesigned version keeps PCA, but applies it to a reduced and theory-led indicator set organised into domains. This makes the final vulnerability index more interpretable and more defensible, while still retaining a data-reduction step. On the socio-economic side, the framework is in principle transferable across Germany; the stronger limitation lies in the hazard and protection data, not in the INKAR variables themselves."</w:t>
       </w:r>
     </w:p>
-    <w:bookmarkEnd w:id="55"/>
-    <w:bookmarkStart w:id="56" w:name="Xd7f99e36fc0f82384dad8a31ed6870554eec191"/>
+    <w:bookmarkEnd w:id="69"/>
+    <w:bookmarkStart w:id="70" w:name="X1a53919c847c9ec0a5b2974a46c7a5f2f5e842a"/>
     <w:p>
       <w:pPr>
         <w:pStyle w:val="Heading1"/>
       </w:pPr>
       <w:r>
-        <w:t xml:space="preserve">16. Is anything still missing?</w:t>
+        <w:t xml:space="preserve">17. Is anything still missing?</w:t>
       </w:r>
     </w:p>
     <w:p>
@@ -5672,7 +6922,7 @@
         <w:t xml:space="preserve">caveat, because the official INKAR name and the current project rename do not match.</w:t>
       </w:r>
     </w:p>
-    <w:bookmarkEnd w:id="56"/>
+    <w:bookmarkEnd w:id="70"/>
     <w:sectPr>
       <w:pgSz w:h="15840" w:w="12240"/>
       <w:pgMar w:bottom="1440" w:footer="720" w:gutter="0" w:header="720" w:left="1800" w:right="1800" w:top="1440"/>
@@ -9739,6 +10989,51 @@
     <w:abstractNumId w:val="991"/>
   </w:num>
   <w:num w:numId="1059">
+    <w:abstractNumId w:val="991"/>
+  </w:num>
+  <w:num w:numId="1060">
+    <w:abstractNumId w:val="991"/>
+  </w:num>
+  <w:num w:numId="1061">
+    <w:abstractNumId w:val="991"/>
+  </w:num>
+  <w:num w:numId="1062">
+    <w:abstractNumId w:val="991"/>
+  </w:num>
+  <w:num w:numId="1063">
+    <w:abstractNumId w:val="991"/>
+  </w:num>
+  <w:num w:numId="1064">
+    <w:abstractNumId w:val="991"/>
+  </w:num>
+  <w:num w:numId="1065">
+    <w:abstractNumId w:val="991"/>
+  </w:num>
+  <w:num w:numId="1066">
+    <w:abstractNumId w:val="991"/>
+  </w:num>
+  <w:num w:numId="1067">
+    <w:abstractNumId w:val="991"/>
+  </w:num>
+  <w:num w:numId="1068">
+    <w:abstractNumId w:val="991"/>
+  </w:num>
+  <w:num w:numId="1069">
+    <w:abstractNumId w:val="991"/>
+  </w:num>
+  <w:num w:numId="1070">
+    <w:abstractNumId w:val="991"/>
+  </w:num>
+  <w:num w:numId="1071">
+    <w:abstractNumId w:val="991"/>
+  </w:num>
+  <w:num w:numId="1072">
+    <w:abstractNumId w:val="991"/>
+  </w:num>
+  <w:num w:numId="1073">
+    <w:abstractNumId w:val="991"/>
+  </w:num>
+  <w:num w:numId="1074">
     <w:abstractNumId w:val="991"/>
   </w:num>
 </w:numbering>

</xml_diff>